<commit_message>
Ajout du .gitignore, adaptation du readme, petites correction du word, ajout login - mot de passe au script
</commit_message>
<xml_diff>
--- a/Pré-dossier Smartcity.docx
+++ b/Pré-dossier Smartcity.docx
@@ -1602,6 +1602,27 @@
         <w:rPr>
           <w:lang w:val="fr-BE"/>
         </w:rPr>
+      </w:pPr>
+    </w:p>
+    <w:p>
+      <w:pPr>
+        <w:rPr>
+          <w:lang w:val="fr-BE"/>
+        </w:rPr>
+      </w:pPr>
+    </w:p>
+    <w:p>
+      <w:pPr>
+        <w:rPr>
+          <w:lang w:val="fr-BE"/>
+        </w:rPr>
+      </w:pPr>
+    </w:p>
+    <w:p>
+      <w:pPr>
+        <w:rPr>
+          <w:lang w:val="fr-BE"/>
+        </w:rPr>
         <w:sectPr>
           <w:footerReference w:type="default" r:id="rId10"/>
           <w:pgSz w:w="12240" w:h="15840"/>
@@ -1616,7 +1637,13 @@
     <w:sdt>
       <w:sdtPr>
         <w:rPr>
-          <w:lang w:val="fr-FR"/>
+          <w:rFonts w:asciiTheme="minorHAnsi" w:eastAsiaTheme="minorEastAsia" w:hAnsiTheme="minorHAnsi" w:cstheme="minorBidi"/>
+          <w:color w:val="auto"/>
+          <w:kern w:val="2"/>
+          <w:sz w:val="22"/>
+          <w:szCs w:val="22"/>
+          <w:lang w:val="fr-FR" w:eastAsia="zh-CN"/>
+          <w14:ligatures w14:val="standardContextual"/>
         </w:rPr>
         <w:id w:val="-149597703"/>
         <w:docPartObj>
@@ -1626,15 +1653,8 @@
       </w:sdtPr>
       <w:sdtEndPr>
         <w:rPr>
-          <w:rFonts w:asciiTheme="minorHAnsi" w:eastAsiaTheme="minorEastAsia" w:hAnsiTheme="minorHAnsi" w:cstheme="minorBidi"/>
           <w:b/>
           <w:bCs/>
-          <w:color w:val="auto"/>
-          <w:kern w:val="2"/>
-          <w:sz w:val="22"/>
-          <w:szCs w:val="22"/>
-          <w:lang w:eastAsia="zh-CN"/>
-          <w14:ligatures w14:val="standardContextual"/>
         </w:rPr>
       </w:sdtEndPr>
       <w:sdtContent>
@@ -2440,7 +2460,43 @@
         <w:rPr>
           <w:lang w:val="fr-BE"/>
         </w:rPr>
-        <w:t xml:space="preserve"> de transport partagé différent : nous avons donc décid</w:t>
+        <w:t xml:space="preserve"> de transport</w:t>
+      </w:r>
+      <w:r>
+        <w:rPr>
+          <w:lang w:val="fr-BE"/>
+        </w:rPr>
+        <w:t>s</w:t>
+      </w:r>
+      <w:r>
+        <w:rPr>
+          <w:lang w:val="fr-BE"/>
+        </w:rPr>
+        <w:t xml:space="preserve"> partagé</w:t>
+      </w:r>
+      <w:r>
+        <w:rPr>
+          <w:lang w:val="fr-BE"/>
+        </w:rPr>
+        <w:t>s</w:t>
+      </w:r>
+      <w:r>
+        <w:rPr>
+          <w:lang w:val="fr-BE"/>
+        </w:rPr>
+        <w:t xml:space="preserve"> différent</w:t>
+      </w:r>
+      <w:r>
+        <w:rPr>
+          <w:lang w:val="fr-BE"/>
+        </w:rPr>
+        <w:t>s</w:t>
+      </w:r>
+      <w:r>
+        <w:rPr>
+          <w:lang w:val="fr-BE"/>
+        </w:rPr>
+        <w:t> : nous avons donc décid</w:t>
       </w:r>
       <w:r>
         <w:rPr>
@@ -2452,7 +2508,19 @@
         <w:rPr>
           <w:lang w:val="fr-BE"/>
         </w:rPr>
-        <w:t xml:space="preserve"> de créer cette société fictive qui possède cet atout, et de faire leur application mobile.</w:t>
+        <w:t xml:space="preserve"> de créer cette société fictive qui possède cet atout, et de </w:t>
+      </w:r>
+      <w:r>
+        <w:rPr>
+          <w:lang w:val="fr-BE"/>
+        </w:rPr>
+        <w:t>créer</w:t>
+      </w:r>
+      <w:r>
+        <w:rPr>
+          <w:lang w:val="fr-BE"/>
+        </w:rPr>
+        <w:t xml:space="preserve"> leur application mobile.</w:t>
       </w:r>
     </w:p>
     <w:p>
@@ -2461,6 +2529,7 @@
           <w:lang w:val="fr-BE"/>
         </w:rPr>
       </w:pPr>
+      <w:commentRangeStart w:id="1"/>
       <w:r>
         <w:rPr>
           <w:lang w:val="fr-BE"/>
@@ -2502,6 +2571,13 @@
           <w:lang w:val="fr-BE"/>
         </w:rPr>
         <w:t xml:space="preserve"> 12 des ODD), permettant également à cette mobilité de s’étendre dans diverses villes ne l’ayant pas encore acquise (en lien avec le point 11 des ODD).</w:t>
+      </w:r>
+      <w:commentRangeEnd w:id="1"/>
+      <w:r>
+        <w:rPr>
+          <w:rStyle w:val="Marquedecommentaire"/>
+        </w:rPr>
+        <w:commentReference w:id="1"/>
       </w:r>
     </w:p>
     <w:p>
@@ -2522,14 +2598,14 @@
           <w:lang w:val="fr-BE"/>
         </w:rPr>
       </w:pPr>
-      <w:bookmarkStart w:id="1" w:name="_Toc180420836"/>
+      <w:bookmarkStart w:id="2" w:name="_Toc180420836"/>
       <w:r>
         <w:rPr>
           <w:lang w:val="fr-BE"/>
         </w:rPr>
         <w:t>Projet</w:t>
       </w:r>
-      <w:bookmarkEnd w:id="1"/>
+      <w:bookmarkEnd w:id="2"/>
     </w:p>
     <w:p>
       <w:pPr>
@@ -2561,7 +2637,51 @@
         <w:rPr>
           <w:lang w:val="fr-BE"/>
         </w:rPr>
-        <w:t>Pour ce faire, l’onglet principal de l’application sera une carte répertoriant tous les véhicules disponibles de la société se trouvant sur celle-ci, à leurs emplacements précis. De plus, l’utilisateur aura la possibilité de filtrer les véhicules affichés en fonction de leurs catégories (voiture, trottinette, …) mais également en fonction de leur distance par rapport à celle de l’utilisateur.</w:t>
+        <w:t xml:space="preserve">Pour ce faire, l’onglet principal de l’application sera une carte répertoriant tous les véhicules disponibles de la société se trouvant sur celle-ci, à </w:t>
+      </w:r>
+      <w:commentRangeStart w:id="3"/>
+      <w:r>
+        <w:rPr>
+          <w:lang w:val="fr-BE"/>
+        </w:rPr>
+        <w:t>leur emplacement précis</w:t>
+      </w:r>
+      <w:commentRangeEnd w:id="3"/>
+      <w:r>
+        <w:rPr>
+          <w:rStyle w:val="Marquedecommentaire"/>
+        </w:rPr>
+        <w:commentReference w:id="3"/>
+      </w:r>
+      <w:r>
+        <w:rPr>
+          <w:lang w:val="fr-BE"/>
+        </w:rPr>
+        <w:t>. De plus, l’utilisateur aura la possibilité de filtrer les véhicules affichés en fonction de leurs catégories (voiture, trottinette,</w:t>
+      </w:r>
+      <w:r>
+        <w:rPr>
+          <w:lang w:val="fr-BE"/>
+        </w:rPr>
+        <w:t xml:space="preserve"> </w:t>
+      </w:r>
+      <w:r>
+        <w:rPr>
+          <w:lang w:val="fr-BE"/>
+        </w:rPr>
+        <w:t>…) mais également en fonction de leur distance</w:t>
+      </w:r>
+      <w:r>
+        <w:rPr>
+          <w:lang w:val="fr-BE"/>
+        </w:rPr>
+        <w:t>,</w:t>
+      </w:r>
+      <w:r>
+        <w:rPr>
+          <w:lang w:val="fr-BE"/>
+        </w:rPr>
+        <w:t xml:space="preserve"> par rapport à celle de l’utilisateur.</w:t>
       </w:r>
     </w:p>
     <w:p>
@@ -2574,7 +2694,19 @@
         <w:rPr>
           <w:lang w:val="fr-BE"/>
         </w:rPr>
-        <w:t>En sélectionnant un véhicule via un clic sur celui-ci, une interface regroupant plusieurs informations sur ce véhicule appara</w:t>
+        <w:t>En sélectionnant un véhicule</w:t>
+      </w:r>
+      <w:r>
+        <w:rPr>
+          <w:lang w:val="fr-BE"/>
+        </w:rPr>
+        <w:t>,</w:t>
+      </w:r>
+      <w:r>
+        <w:rPr>
+          <w:lang w:val="fr-BE"/>
+        </w:rPr>
+        <w:t xml:space="preserve"> via un clic sur celui-ci, une interface regroupant plusieurs informations sur ce véhicule appara</w:t>
       </w:r>
       <w:r>
         <w:rPr>
@@ -2690,7 +2822,7 @@
           <w:lang w:val="fr-BE"/>
         </w:rPr>
       </w:pPr>
-      <w:bookmarkStart w:id="2" w:name="_Toc180420837"/>
+      <w:bookmarkStart w:id="4" w:name="_Toc180420837"/>
       <w:r>
         <w:rPr>
           <w:lang w:val="fr-BE"/>
@@ -2698,7 +2830,7 @@
         <w:lastRenderedPageBreak/>
         <w:t>Fonctionnalités</w:t>
       </w:r>
-      <w:bookmarkEnd w:id="2"/>
+      <w:bookmarkEnd w:id="4"/>
     </w:p>
     <w:p>
       <w:pPr>
@@ -2711,17 +2843,29 @@
           <w:lang w:val="fr-BE"/>
         </w:rPr>
       </w:pPr>
-      <w:bookmarkStart w:id="3" w:name="_Toc180420838"/>
+      <w:bookmarkStart w:id="5" w:name="_Toc180420838"/>
+      <w:commentRangeStart w:id="6"/>
       <w:r>
         <w:rPr>
           <w:lang w:val="fr-BE"/>
         </w:rPr>
         <w:t>Base</w:t>
       </w:r>
-      <w:bookmarkEnd w:id="3"/>
+      <w:bookmarkEnd w:id="5"/>
+      <w:commentRangeEnd w:id="6"/>
+      <w:r>
+        <w:rPr>
+          <w:rStyle w:val="Marquedecommentaire"/>
+          <w:rFonts w:asciiTheme="minorHAnsi" w:eastAsiaTheme="minorEastAsia" w:hAnsiTheme="minorHAnsi" w:cstheme="minorBidi"/>
+          <w:color w:val="auto"/>
+        </w:rPr>
+        <w:commentReference w:id="6"/>
+      </w:r>
     </w:p>
     <w:p>
       <w:pPr>
+        <w:pStyle w:val="Paragraphedeliste"/>
+        <w:ind w:left="0"/>
         <w:rPr>
           <w:lang w:val="fr-BE"/>
         </w:rPr>
@@ -2738,11 +2882,12 @@
           <w:lang w:val="fr-BE"/>
         </w:rPr>
       </w:pPr>
-      <w:r>
-        <w:rPr>
-          <w:lang w:val="fr-BE"/>
-        </w:rPr>
-        <w:t>Trier la recherche par moyen de transport</w:t>
+      <w:bookmarkStart w:id="7" w:name="_Hlk180426041"/>
+      <w:r>
+        <w:rPr>
+          <w:lang w:val="fr-BE"/>
+        </w:rPr>
+        <w:t>Système de login – mot de passe</w:t>
       </w:r>
     </w:p>
     <w:p>
@@ -2760,9 +2905,10 @@
         <w:rPr>
           <w:lang w:val="fr-BE"/>
         </w:rPr>
-        <w:t>Utiliser la localisation de l’appareil pour filtrer les moyens de transport par distance</w:t>
+        <w:t>Trier la recherche par moyen de transport</w:t>
       </w:r>
     </w:p>
+    <w:bookmarkEnd w:id="7"/>
     <w:p>
       <w:pPr>
         <w:pStyle w:val="Paragraphedeliste"/>
@@ -2778,7 +2924,7 @@
         <w:rPr>
           <w:lang w:val="fr-BE"/>
         </w:rPr>
-        <w:t>Rendre disponible/indisponible un moyen de transport manuellement</w:t>
+        <w:t>Utiliser la localisation de l’appareil pour filtrer les moyens de transport par distance</w:t>
       </w:r>
     </w:p>
     <w:p>
@@ -2796,7 +2942,25 @@
         <w:rPr>
           <w:lang w:val="fr-BE"/>
         </w:rPr>
-        <w:t>Mode clair/sombre</w:t>
+        <w:t xml:space="preserve">Rendre disponible/indisponible un moyen de transport </w:t>
+      </w:r>
+      <w:r>
+        <w:rPr>
+          <w:lang w:val="fr-BE"/>
+        </w:rPr>
+        <w:t>"</w:t>
+      </w:r>
+      <w:r>
+        <w:rPr>
+          <w:lang w:val="fr-BE"/>
+        </w:rPr>
+        <w:t>manuellement</w:t>
+      </w:r>
+      <w:r>
+        <w:rPr>
+          <w:lang w:val="fr-BE"/>
+        </w:rPr>
+        <w:t>"</w:t>
       </w:r>
     </w:p>
     <w:p>
@@ -2814,7 +2978,67 @@
         <w:rPr>
           <w:lang w:val="fr-BE"/>
         </w:rPr>
-        <w:t>Choisir un ou plusieurs abonnements parmi ceux répertoriés.</w:t>
+        <w:t>Mode clair/sombre</w:t>
+      </w:r>
+    </w:p>
+    <w:p>
+      <w:pPr>
+        <w:pStyle w:val="Paragraphedeliste"/>
+        <w:numPr>
+          <w:ilvl w:val="0"/>
+          <w:numId w:val="27"/>
+        </w:numPr>
+        <w:rPr>
+          <w:lang w:val="fr-BE"/>
+        </w:rPr>
+      </w:pPr>
+      <w:r>
+        <w:rPr>
+          <w:lang w:val="fr-BE"/>
+        </w:rPr>
+        <w:t>Choisir un ou plusieurs abonnements parmi ceux répertoriés</w:t>
+      </w:r>
+    </w:p>
+    <w:p>
+      <w:pPr>
+        <w:pStyle w:val="Paragraphedeliste"/>
+        <w:numPr>
+          <w:ilvl w:val="0"/>
+          <w:numId w:val="27"/>
+        </w:numPr>
+        <w:rPr>
+          <w:lang w:val="fr-BE"/>
+        </w:rPr>
+      </w:pPr>
+      <w:r>
+        <w:rPr>
+          <w:lang w:val="fr-BE"/>
+        </w:rPr>
+        <w:t xml:space="preserve">Une fonctionnalité de parrainage, permettant </w:t>
+      </w:r>
+      <w:r>
+        <w:rPr>
+          <w:lang w:val="fr-BE"/>
+        </w:rPr>
+        <w:t xml:space="preserve">aux </w:t>
+      </w:r>
+      <w:r>
+        <w:rPr>
+          <w:lang w:val="fr-BE"/>
+        </w:rPr>
+        <w:t xml:space="preserve">deux parties de récupérer un petit montant sur </w:t>
+      </w:r>
+      <w:r>
+        <w:rPr>
+          <w:lang w:val="fr-BE"/>
+        </w:rPr>
+        <w:t>leur</w:t>
+      </w:r>
+      <w:r>
+        <w:rPr>
+          <w:lang w:val="fr-BE"/>
+        </w:rPr>
+        <w:t xml:space="preserve"> compte</w:t>
       </w:r>
     </w:p>
     <w:p>
@@ -2835,14 +3059,14 @@
           <w:lang w:val="fr-BE"/>
         </w:rPr>
       </w:pPr>
-      <w:bookmarkStart w:id="4" w:name="_Toc180420839"/>
+      <w:bookmarkStart w:id="8" w:name="_Toc180420839"/>
       <w:r>
         <w:rPr>
           <w:lang w:val="fr-BE"/>
         </w:rPr>
         <w:t>Avancée</w:t>
       </w:r>
-      <w:bookmarkEnd w:id="4"/>
+      <w:bookmarkEnd w:id="8"/>
     </w:p>
     <w:p>
       <w:pPr>
@@ -2908,6 +3132,20 @@
     </w:p>
     <w:p>
       <w:pPr>
+        <w:jc w:val="left"/>
+        <w:rPr>
+          <w:lang w:val="fr-BE"/>
+        </w:rPr>
+      </w:pPr>
+      <w:r>
+        <w:rPr>
+          <w:lang w:val="fr-BE"/>
+        </w:rPr>
+        <w:br w:type="page"/>
+      </w:r>
+    </w:p>
+    <w:p>
+      <w:pPr>
         <w:pStyle w:val="Titre1"/>
         <w:numPr>
           <w:ilvl w:val="0"/>
@@ -2917,14 +3155,15 @@
           <w:lang w:val="fr-BE"/>
         </w:rPr>
       </w:pPr>
-      <w:bookmarkStart w:id="5" w:name="_Toc180420840"/>
-      <w:r>
-        <w:rPr>
-          <w:lang w:val="fr-BE"/>
-        </w:rPr>
+      <w:bookmarkStart w:id="9" w:name="_Toc180420840"/>
+      <w:r>
+        <w:rPr>
+          <w:lang w:val="fr-BE"/>
+        </w:rPr>
+        <w:lastRenderedPageBreak/>
         <w:t>Schéma de base de données</w:t>
       </w:r>
-      <w:bookmarkEnd w:id="5"/>
+      <w:bookmarkEnd w:id="9"/>
     </w:p>
     <w:p>
       <w:pPr>
@@ -2935,17 +3174,58 @@
     </w:p>
     <w:p>
       <w:pPr>
-        <w:rPr>
-          <w:lang w:val="fr-BE"/>
-        </w:rPr>
-      </w:pPr>
+        <w:jc w:val="center"/>
+        <w:rPr>
+          <w:rStyle w:val="Accentuationlgre"/>
+          <w:lang w:val="fr-BE"/>
+        </w:rPr>
+      </w:pPr>
+      <w:r>
+        <w:rPr>
+          <w:rStyle w:val="Accentuationlgre"/>
+          <w:lang w:val="fr-BE"/>
+        </w:rPr>
+        <w:t>&lt; Je le mettrai quand il sera complétement fini pour éviter de le changer 576357 fois dans le doc &gt;</w:t>
+      </w:r>
     </w:p>
     <w:p>
       <w:pPr>
-        <w:rPr>
-          <w:lang w:val="fr-BE"/>
-        </w:rPr>
-      </w:pPr>
+        <w:jc w:val="center"/>
+        <w:rPr>
+          <w:rStyle w:val="Accentuationlgre"/>
+          <w:lang w:val="fr-BE"/>
+        </w:rPr>
+      </w:pPr>
+      <w:r>
+        <w:rPr>
+          <w:rStyle w:val="Accentuationlgre"/>
+          <w:lang w:val="fr-BE"/>
+        </w:rPr>
+        <w:t>&lt; Mais il est dans les annexes &gt;</w:t>
+      </w:r>
+    </w:p>
+    <w:p>
+      <w:pPr>
+        <w:jc w:val="center"/>
+        <w:rPr>
+          <w:rStyle w:val="Accentuationlgre"/>
+          <w:lang w:val="fr-BE"/>
+        </w:rPr>
+      </w:pPr>
+      <w:r>
+        <w:rPr>
+          <w:rStyle w:val="Accentuationlgre"/>
+          <w:lang w:val="fr-BE"/>
+        </w:rPr>
+        <w:t>Figure 1 – Schéma de Base de donnée</w:t>
+      </w:r>
+      <w:r>
+        <w:rPr>
+          <w:rStyle w:val="Accentuationlgre"/>
+          <w:lang w:val="fr-BE"/>
+        </w:rPr>
+        <w:t>s</w:t>
+      </w:r>
     </w:p>
     <w:p>
       <w:pPr>
@@ -2958,7 +3238,7 @@
           <w:lang w:val="fr-BE"/>
         </w:rPr>
       </w:pPr>
-      <w:bookmarkStart w:id="6" w:name="_Toc180420841"/>
+      <w:bookmarkStart w:id="10" w:name="_Toc180420841"/>
       <w:proofErr w:type="spellStart"/>
       <w:r>
         <w:rPr>
@@ -2973,7 +3253,7 @@
         </w:rPr>
         <w:t xml:space="preserve"> du back office</w:t>
       </w:r>
-      <w:bookmarkEnd w:id="6"/>
+      <w:bookmarkEnd w:id="10"/>
     </w:p>
     <w:p>
       <w:pPr>
@@ -3007,14 +3287,14 @@
           <w:lang w:val="fr-BE"/>
         </w:rPr>
       </w:pPr>
-      <w:bookmarkStart w:id="7" w:name="_Toc180420842"/>
+      <w:bookmarkStart w:id="11" w:name="_Toc180420842"/>
       <w:r>
         <w:rPr>
           <w:lang w:val="fr-BE"/>
         </w:rPr>
         <w:t>Maquettes</w:t>
       </w:r>
-      <w:bookmarkEnd w:id="7"/>
+      <w:bookmarkEnd w:id="11"/>
     </w:p>
     <w:p>
       <w:pPr>
@@ -3031,6 +3311,98 @@
     </w:sectPr>
   </w:body>
 </w:document>
+</file>
+
+<file path=word/comments.xml><?xml version="1.0" encoding="utf-8"?>
+<w:comments xmlns:wpc="http://schemas.microsoft.com/office/word/2010/wordprocessingCanvas" xmlns:cx="http://schemas.microsoft.com/office/drawing/2014/chartex" xmlns:cx1="http://schemas.microsoft.com/office/drawing/2015/9/8/chartex" xmlns:cx2="http://schemas.microsoft.com/office/drawing/2015/10/21/chartex" xmlns:cx3="http://schemas.microsoft.com/office/drawing/2016/5/9/chartex" xmlns:cx4="http://schemas.microsoft.com/office/drawing/2016/5/10/chartex" xmlns:cx5="http://schemas.microsoft.com/office/drawing/2016/5/11/chartex" xmlns:cx6="http://schemas.microsoft.com/office/drawing/2016/5/12/chartex" xmlns:cx7="http://schemas.microsoft.com/office/drawing/2016/5/13/chartex" xmlns:cx8="http://schemas.microsoft.com/office/drawing/2016/5/14/chartex" xmlns:mc="http://schemas.openxmlformats.org/markup-compatibility/2006" xmlns:aink="http://schemas.microsoft.com/office/drawing/2016/ink" xmlns:am3d="http://schemas.microsoft.com/office/drawing/2017/model3d" xmlns:o="urn:schemas-microsoft-com:office:office" xmlns:oel="http://schemas.microsoft.com/office/2019/extlst" xmlns:r="http://schemas.openxmlformats.org/officeDocument/2006/relationships" xmlns:m="http://schemas.openxmlformats.org/officeDocument/2006/math" xmlns:v="urn:schemas-microsoft-com:vml" xmlns:wp14="http://schemas.microsoft.com/office/word/2010/wordprocessingDrawing" xmlns:wp="http://schemas.openxmlformats.org/drawingml/2006/wordprocessingDrawing" xmlns:w10="urn:schemas-microsoft-com:office:word" xmlns:w="http://schemas.openxmlformats.org/wordprocessingml/2006/main" xmlns:w14="http://schemas.microsoft.com/office/word/2010/wordml" xmlns:w15="http://schemas.microsoft.com/office/word/2012/wordml" xmlns:w16cex="http://schemas.microsoft.com/office/word/2018/wordml/cex" xmlns:w16cid="http://schemas.microsoft.com/office/word/2016/wordml/cid" xmlns:w16="http://schemas.microsoft.com/office/word/2018/wordml" xmlns:w16du="http://schemas.microsoft.com/office/word/2023/wordml/word16du" xmlns:w16sdtdh="http://schemas.microsoft.com/office/word/2020/wordml/sdtdatahash" xmlns:w16se="http://schemas.microsoft.com/office/word/2015/wordml/symex" xmlns:wpg="http://schemas.microsoft.com/office/word/2010/wordprocessingGroup" xmlns:wpi="http://schemas.microsoft.com/office/word/2010/wordprocessingInk" xmlns:wne="http://schemas.microsoft.com/office/word/2006/wordml" xmlns:wps="http://schemas.microsoft.com/office/word/2010/wordprocessingShape" mc:Ignorable="w14 w15 w16se w16cid w16 w16cex w16sdtdh w16du wp14">
+  <w:comment w:id="1" w:author="Samray Hugo" w:date="2024-10-21T17:44:00Z" w:initials="HS">
+    <w:p>
+      <w:pPr>
+        <w:jc w:val="left"/>
+      </w:pPr>
+      <w:r>
+        <w:rPr>
+          <w:rStyle w:val="Marquedecommentaire"/>
+        </w:rPr>
+        <w:annotationRef/>
+      </w:r>
+      <w:r>
+        <w:rPr>
+          <w:color w:val="000000"/>
+          <w:sz w:val="20"/>
+          <w:szCs w:val="20"/>
+        </w:rPr>
+        <w:t>Phrases un peu lourdes je trouve nan ? fin à la place du prof si je devais lire plusieurs dossiers comme ça j’aurais le cerveau en compote mdr</w:t>
+      </w:r>
+    </w:p>
+  </w:comment>
+  <w:comment w:id="3" w:author="Samray Hugo" w:date="2024-10-21T17:45:00Z" w:initials="HS">
+    <w:p>
+      <w:pPr>
+        <w:jc w:val="left"/>
+      </w:pPr>
+      <w:r>
+        <w:rPr>
+          <w:rStyle w:val="Marquedecommentaire"/>
+        </w:rPr>
+        <w:annotationRef/>
+      </w:r>
+      <w:r>
+        <w:rPr>
+          <w:color w:val="000000"/>
+          <w:sz w:val="20"/>
+          <w:szCs w:val="20"/>
+        </w:rPr>
+        <w:t>y’a pas de S vu que chacun à un seul emplacement à la fois :)</w:t>
+      </w:r>
+    </w:p>
+  </w:comment>
+  <w:comment w:id="6" w:author="Samray Hugo" w:date="2024-10-21T17:50:00Z" w:initials="HS">
+    <w:p>
+      <w:pPr>
+        <w:jc w:val="left"/>
+      </w:pPr>
+      <w:r>
+        <w:rPr>
+          <w:rStyle w:val="Marquedecommentaire"/>
+        </w:rPr>
+        <w:annotationRef/>
+      </w:r>
+      <w:r>
+        <w:rPr>
+          <w:color w:val="000000"/>
+          <w:sz w:val="20"/>
+          <w:szCs w:val="20"/>
+        </w:rPr>
+        <w:t>À 'Base' et 'Avancée' je sais pas s’il faut un S, je dirais que oui, vu qu’il y a plusieurs fonctionnalités pour chaque type.</w:t>
+      </w:r>
+    </w:p>
+  </w:comment>
+</w:comments>
+</file>
+
+<file path=word/commentsExtended.xml><?xml version="1.0" encoding="utf-8"?>
+<w15:commentsEx xmlns:wpc="http://schemas.microsoft.com/office/word/2010/wordprocessingCanvas" xmlns:cx="http://schemas.microsoft.com/office/drawing/2014/chartex" xmlns:cx1="http://schemas.microsoft.com/office/drawing/2015/9/8/chartex" xmlns:cx2="http://schemas.microsoft.com/office/drawing/2015/10/21/chartex" xmlns:cx3="http://schemas.microsoft.com/office/drawing/2016/5/9/chartex" xmlns:cx4="http://schemas.microsoft.com/office/drawing/2016/5/10/chartex" xmlns:cx5="http://schemas.microsoft.com/office/drawing/2016/5/11/chartex" xmlns:cx6="http://schemas.microsoft.com/office/drawing/2016/5/12/chartex" xmlns:cx7="http://schemas.microsoft.com/office/drawing/2016/5/13/chartex" xmlns:cx8="http://schemas.microsoft.com/office/drawing/2016/5/14/chartex" xmlns:mc="http://schemas.openxmlformats.org/markup-compatibility/2006" xmlns:aink="http://schemas.microsoft.com/office/drawing/2016/ink" xmlns:am3d="http://schemas.microsoft.com/office/drawing/2017/model3d" xmlns:o="urn:schemas-microsoft-com:office:office" xmlns:oel="http://schemas.microsoft.com/office/2019/extlst" xmlns:r="http://schemas.openxmlformats.org/officeDocument/2006/relationships" xmlns:m="http://schemas.openxmlformats.org/officeDocument/2006/math" xmlns:v="urn:schemas-microsoft-com:vml" xmlns:wp14="http://schemas.microsoft.com/office/word/2010/wordprocessingDrawing" xmlns:wp="http://schemas.openxmlformats.org/drawingml/2006/wordprocessingDrawing" xmlns:w10="urn:schemas-microsoft-com:office:word" xmlns:w="http://schemas.openxmlformats.org/wordprocessingml/2006/main" xmlns:w14="http://schemas.microsoft.com/office/word/2010/wordml" xmlns:w15="http://schemas.microsoft.com/office/word/2012/wordml" xmlns:w16cex="http://schemas.microsoft.com/office/word/2018/wordml/cex" xmlns:w16cid="http://schemas.microsoft.com/office/word/2016/wordml/cid" xmlns:w16="http://schemas.microsoft.com/office/word/2018/wordml" xmlns:w16du="http://schemas.microsoft.com/office/word/2023/wordml/word16du" xmlns:w16sdtdh="http://schemas.microsoft.com/office/word/2020/wordml/sdtdatahash" xmlns:w16se="http://schemas.microsoft.com/office/word/2015/wordml/symex" xmlns:wpg="http://schemas.microsoft.com/office/word/2010/wordprocessingGroup" xmlns:wpi="http://schemas.microsoft.com/office/word/2010/wordprocessingInk" xmlns:wne="http://schemas.microsoft.com/office/word/2006/wordml" xmlns:wps="http://schemas.microsoft.com/office/word/2010/wordprocessingShape" mc:Ignorable="w14 w15 w16se w16cid w16 w16cex w16sdtdh w16du wp14">
+  <w15:commentEx w15:paraId="5D66B09B" w15:done="0"/>
+  <w15:commentEx w15:paraId="25EF83A9" w15:done="0"/>
+  <w15:commentEx w15:paraId="4D499B8A" w15:done="0"/>
+</w15:commentsEx>
+</file>
+
+<file path=word/commentsExtensible.xml><?xml version="1.0" encoding="utf-8"?>
+<w16cex:commentsExtensible xmlns:wpc="http://schemas.microsoft.com/office/word/2010/wordprocessingCanvas" xmlns:cx="http://schemas.microsoft.com/office/drawing/2014/chartex" xmlns:cx1="http://schemas.microsoft.com/office/drawing/2015/9/8/chartex" xmlns:cx2="http://schemas.microsoft.com/office/drawing/2015/10/21/chartex" xmlns:cx3="http://schemas.microsoft.com/office/drawing/2016/5/9/chartex" xmlns:cx4="http://schemas.microsoft.com/office/drawing/2016/5/10/chartex" xmlns:cx5="http://schemas.microsoft.com/office/drawing/2016/5/11/chartex" xmlns:cx6="http://schemas.microsoft.com/office/drawing/2016/5/12/chartex" xmlns:cx7="http://schemas.microsoft.com/office/drawing/2016/5/13/chartex" xmlns:cx8="http://schemas.microsoft.com/office/drawing/2016/5/14/chartex" xmlns:cr="http://schemas.microsoft.com/office/comments/2020/reactions" xmlns:mc="http://schemas.openxmlformats.org/markup-compatibility/2006" xmlns:aink="http://schemas.microsoft.com/office/drawing/2016/ink" xmlns:am3d="http://schemas.microsoft.com/office/drawing/2017/model3d" xmlns:o="urn:schemas-microsoft-com:office:office" xmlns:oel="http://schemas.microsoft.com/office/2019/extlst" xmlns:r="http://schemas.openxmlformats.org/officeDocument/2006/relationships" xmlns:m="http://schemas.openxmlformats.org/officeDocument/2006/math" xmlns:v="urn:schemas-microsoft-com:vml" xmlns:wp14="http://schemas.microsoft.com/office/word/2010/wordprocessingDrawing" xmlns:wp="http://schemas.openxmlformats.org/drawingml/2006/wordprocessingDrawing" xmlns:w10="urn:schemas-microsoft-com:office:word" xmlns:w="http://schemas.openxmlformats.org/wordprocessingml/2006/main" xmlns:w14="http://schemas.microsoft.com/office/word/2010/wordml" xmlns:w15="http://schemas.microsoft.com/office/word/2012/wordml" xmlns:w16cex="http://schemas.microsoft.com/office/word/2018/wordml/cex" xmlns:w16cid="http://schemas.microsoft.com/office/word/2016/wordml/cid" xmlns:w16="http://schemas.microsoft.com/office/word/2018/wordml" xmlns:w16du="http://schemas.microsoft.com/office/word/2023/wordml/word16du" xmlns:w16sdtdh="http://schemas.microsoft.com/office/word/2020/wordml/sdtdatahash" xmlns:w16se="http://schemas.microsoft.com/office/word/2015/wordml/symex" xmlns:wpg="http://schemas.microsoft.com/office/word/2010/wordprocessingGroup" xmlns:wpi="http://schemas.microsoft.com/office/word/2010/wordprocessingInk" xmlns:wne="http://schemas.microsoft.com/office/word/2006/wordml" xmlns:wps="http://schemas.microsoft.com/office/word/2010/wordprocessingShape" mc:Ignorable="w14 w15 w16se w16cid w16 w16cex w16sdtdh cr w16du wp14">
+  <w16cex:commentExtensible w16cex:durableId="041D4AAB" w16cex:dateUtc="2024-10-21T15:44:00Z"/>
+  <w16cex:commentExtensible w16cex:durableId="683825D4" w16cex:dateUtc="2024-10-21T15:45:00Z"/>
+  <w16cex:commentExtensible w16cex:durableId="01BCB339" w16cex:dateUtc="2024-10-21T15:50:00Z"/>
+</w16cex:commentsExtensible>
+</file>
+
+<file path=word/commentsIds.xml><?xml version="1.0" encoding="utf-8"?>
+<w16cid:commentsIds xmlns:wpc="http://schemas.microsoft.com/office/word/2010/wordprocessingCanvas" xmlns:cx="http://schemas.microsoft.com/office/drawing/2014/chartex" xmlns:cx1="http://schemas.microsoft.com/office/drawing/2015/9/8/chartex" xmlns:cx2="http://schemas.microsoft.com/office/drawing/2015/10/21/chartex" xmlns:cx3="http://schemas.microsoft.com/office/drawing/2016/5/9/chartex" xmlns:cx4="http://schemas.microsoft.com/office/drawing/2016/5/10/chartex" xmlns:cx5="http://schemas.microsoft.com/office/drawing/2016/5/11/chartex" xmlns:cx6="http://schemas.microsoft.com/office/drawing/2016/5/12/chartex" xmlns:cx7="http://schemas.microsoft.com/office/drawing/2016/5/13/chartex" xmlns:cx8="http://schemas.microsoft.com/office/drawing/2016/5/14/chartex" xmlns:mc="http://schemas.openxmlformats.org/markup-compatibility/2006" xmlns:aink="http://schemas.microsoft.com/office/drawing/2016/ink" xmlns:am3d="http://schemas.microsoft.com/office/drawing/2017/model3d" xmlns:o="urn:schemas-microsoft-com:office:office" xmlns:oel="http://schemas.microsoft.com/office/2019/extlst" xmlns:r="http://schemas.openxmlformats.org/officeDocument/2006/relationships" xmlns:m="http://schemas.openxmlformats.org/officeDocument/2006/math" xmlns:v="urn:schemas-microsoft-com:vml" xmlns:wp14="http://schemas.microsoft.com/office/word/2010/wordprocessingDrawing" xmlns:wp="http://schemas.openxmlformats.org/drawingml/2006/wordprocessingDrawing" xmlns:w10="urn:schemas-microsoft-com:office:word" xmlns:w="http://schemas.openxmlformats.org/wordprocessingml/2006/main" xmlns:w14="http://schemas.microsoft.com/office/word/2010/wordml" xmlns:w15="http://schemas.microsoft.com/office/word/2012/wordml" xmlns:w16cex="http://schemas.microsoft.com/office/word/2018/wordml/cex" xmlns:w16cid="http://schemas.microsoft.com/office/word/2016/wordml/cid" xmlns:w16="http://schemas.microsoft.com/office/word/2018/wordml" xmlns:w16du="http://schemas.microsoft.com/office/word/2023/wordml/word16du" xmlns:w16sdtdh="http://schemas.microsoft.com/office/word/2020/wordml/sdtdatahash" xmlns:w16se="http://schemas.microsoft.com/office/word/2015/wordml/symex" xmlns:wpg="http://schemas.microsoft.com/office/word/2010/wordprocessingGroup" xmlns:wpi="http://schemas.microsoft.com/office/word/2010/wordprocessingInk" xmlns:wne="http://schemas.microsoft.com/office/word/2006/wordml" xmlns:wps="http://schemas.microsoft.com/office/word/2010/wordprocessingShape" mc:Ignorable="w14 w15 w16se w16cid w16 w16cex w16sdtdh w16du wp14">
+  <w16cid:commentId w16cid:paraId="5D66B09B" w16cid:durableId="041D4AAB"/>
+  <w16cid:commentId w16cid:paraId="25EF83A9" w16cid:durableId="683825D4"/>
+  <w16cid:commentId w16cid:paraId="4D499B8A" w16cid:durableId="01BCB339"/>
+</w16cid:commentsIds>
 </file>
 
 <file path=word/endnotes.xml><?xml version="1.0" encoding="utf-8"?>
@@ -5306,6 +5678,119 @@
     </w:lvl>
   </w:abstractNum>
   <w:abstractNum w:abstractNumId="16" w15:restartNumberingAfterBreak="0">
+    <w:nsid w:val="34C9352D"/>
+    <w:multiLevelType w:val="hybridMultilevel"/>
+    <w:tmpl w:val="29BA33C6"/>
+    <w:lvl w:ilvl="0" w:tplc="12DCE358">
+      <w:start w:val="1"/>
+      <w:numFmt w:val="bullet"/>
+      <w:lvlText w:val="-"/>
+      <w:lvlJc w:val="left"/>
+      <w:pPr>
+        <w:ind w:left="720" w:hanging="360"/>
+      </w:pPr>
+      <w:rPr>
+        <w:rFonts w:ascii="Calibri" w:eastAsiaTheme="minorEastAsia" w:hAnsi="Calibri" w:cs="Calibri" w:hint="default"/>
+      </w:rPr>
+    </w:lvl>
+    <w:lvl w:ilvl="1" w:tplc="040C0003" w:tentative="1">
+      <w:start w:val="1"/>
+      <w:numFmt w:val="bullet"/>
+      <w:lvlText w:val="o"/>
+      <w:lvlJc w:val="left"/>
+      <w:pPr>
+        <w:ind w:left="1440" w:hanging="360"/>
+      </w:pPr>
+      <w:rPr>
+        <w:rFonts w:ascii="Courier New" w:hAnsi="Courier New" w:cs="Courier New" w:hint="default"/>
+      </w:rPr>
+    </w:lvl>
+    <w:lvl w:ilvl="2" w:tplc="040C0005" w:tentative="1">
+      <w:start w:val="1"/>
+      <w:numFmt w:val="bullet"/>
+      <w:lvlText w:val=""/>
+      <w:lvlJc w:val="left"/>
+      <w:pPr>
+        <w:ind w:left="2160" w:hanging="360"/>
+      </w:pPr>
+      <w:rPr>
+        <w:rFonts w:ascii="Wingdings" w:hAnsi="Wingdings" w:hint="default"/>
+      </w:rPr>
+    </w:lvl>
+    <w:lvl w:ilvl="3" w:tplc="040C0001" w:tentative="1">
+      <w:start w:val="1"/>
+      <w:numFmt w:val="bullet"/>
+      <w:lvlText w:val=""/>
+      <w:lvlJc w:val="left"/>
+      <w:pPr>
+        <w:ind w:left="2880" w:hanging="360"/>
+      </w:pPr>
+      <w:rPr>
+        <w:rFonts w:ascii="Symbol" w:hAnsi="Symbol" w:hint="default"/>
+      </w:rPr>
+    </w:lvl>
+    <w:lvl w:ilvl="4" w:tplc="040C0003" w:tentative="1">
+      <w:start w:val="1"/>
+      <w:numFmt w:val="bullet"/>
+      <w:lvlText w:val="o"/>
+      <w:lvlJc w:val="left"/>
+      <w:pPr>
+        <w:ind w:left="3600" w:hanging="360"/>
+      </w:pPr>
+      <w:rPr>
+        <w:rFonts w:ascii="Courier New" w:hAnsi="Courier New" w:cs="Courier New" w:hint="default"/>
+      </w:rPr>
+    </w:lvl>
+    <w:lvl w:ilvl="5" w:tplc="040C0005" w:tentative="1">
+      <w:start w:val="1"/>
+      <w:numFmt w:val="bullet"/>
+      <w:lvlText w:val=""/>
+      <w:lvlJc w:val="left"/>
+      <w:pPr>
+        <w:ind w:left="4320" w:hanging="360"/>
+      </w:pPr>
+      <w:rPr>
+        <w:rFonts w:ascii="Wingdings" w:hAnsi="Wingdings" w:hint="default"/>
+      </w:rPr>
+    </w:lvl>
+    <w:lvl w:ilvl="6" w:tplc="040C0001" w:tentative="1">
+      <w:start w:val="1"/>
+      <w:numFmt w:val="bullet"/>
+      <w:lvlText w:val=""/>
+      <w:lvlJc w:val="left"/>
+      <w:pPr>
+        <w:ind w:left="5040" w:hanging="360"/>
+      </w:pPr>
+      <w:rPr>
+        <w:rFonts w:ascii="Symbol" w:hAnsi="Symbol" w:hint="default"/>
+      </w:rPr>
+    </w:lvl>
+    <w:lvl w:ilvl="7" w:tplc="040C0003" w:tentative="1">
+      <w:start w:val="1"/>
+      <w:numFmt w:val="bullet"/>
+      <w:lvlText w:val="o"/>
+      <w:lvlJc w:val="left"/>
+      <w:pPr>
+        <w:ind w:left="5760" w:hanging="360"/>
+      </w:pPr>
+      <w:rPr>
+        <w:rFonts w:ascii="Courier New" w:hAnsi="Courier New" w:cs="Courier New" w:hint="default"/>
+      </w:rPr>
+    </w:lvl>
+    <w:lvl w:ilvl="8" w:tplc="040C0005" w:tentative="1">
+      <w:start w:val="1"/>
+      <w:numFmt w:val="bullet"/>
+      <w:lvlText w:val=""/>
+      <w:lvlJc w:val="left"/>
+      <w:pPr>
+        <w:ind w:left="6480" w:hanging="360"/>
+      </w:pPr>
+      <w:rPr>
+        <w:rFonts w:ascii="Wingdings" w:hAnsi="Wingdings" w:hint="default"/>
+      </w:rPr>
+    </w:lvl>
+  </w:abstractNum>
+  <w:abstractNum w:abstractNumId="17" w15:restartNumberingAfterBreak="0">
     <w:nsid w:val="36B32050"/>
     <w:multiLevelType w:val="multilevel"/>
     <w:tmpl w:val="B60ECDF0"/>
@@ -5418,7 +5903,7 @@
       </w:pPr>
     </w:lvl>
   </w:abstractNum>
-  <w:abstractNum w:abstractNumId="17" w15:restartNumberingAfterBreak="0">
+  <w:abstractNum w:abstractNumId="18" w15:restartNumberingAfterBreak="0">
     <w:nsid w:val="3C88794E"/>
     <w:multiLevelType w:val="multilevel"/>
     <w:tmpl w:val="CE90F9E4"/>
@@ -5567,7 +6052,7 @@
       </w:rPr>
     </w:lvl>
   </w:abstractNum>
-  <w:abstractNum w:abstractNumId="18" w15:restartNumberingAfterBreak="0">
+  <w:abstractNum w:abstractNumId="19" w15:restartNumberingAfterBreak="0">
     <w:nsid w:val="444975B0"/>
     <w:multiLevelType w:val="multilevel"/>
     <w:tmpl w:val="2000001F"/>
@@ -5653,7 +6138,7 @@
       </w:pPr>
     </w:lvl>
   </w:abstractNum>
-  <w:abstractNum w:abstractNumId="19" w15:restartNumberingAfterBreak="0">
+  <w:abstractNum w:abstractNumId="20" w15:restartNumberingAfterBreak="0">
     <w:nsid w:val="44FD5E46"/>
     <w:multiLevelType w:val="hybridMultilevel"/>
     <w:tmpl w:val="F93031C6"/>
@@ -5766,7 +6251,120 @@
       </w:pPr>
     </w:lvl>
   </w:abstractNum>
-  <w:abstractNum w:abstractNumId="20" w15:restartNumberingAfterBreak="0">
+  <w:abstractNum w:abstractNumId="21" w15:restartNumberingAfterBreak="0">
+    <w:nsid w:val="46846F70"/>
+    <w:multiLevelType w:val="hybridMultilevel"/>
+    <w:tmpl w:val="0A98C2CE"/>
+    <w:lvl w:ilvl="0" w:tplc="831EA20A">
+      <w:start w:val="1"/>
+      <w:numFmt w:val="bullet"/>
+      <w:lvlText w:val="-"/>
+      <w:lvlJc w:val="left"/>
+      <w:pPr>
+        <w:ind w:left="720" w:hanging="360"/>
+      </w:pPr>
+      <w:rPr>
+        <w:rFonts w:ascii="Calibri" w:eastAsiaTheme="minorEastAsia" w:hAnsi="Calibri" w:cs="Calibri" w:hint="default"/>
+      </w:rPr>
+    </w:lvl>
+    <w:lvl w:ilvl="1" w:tplc="040C0003" w:tentative="1">
+      <w:start w:val="1"/>
+      <w:numFmt w:val="bullet"/>
+      <w:lvlText w:val="o"/>
+      <w:lvlJc w:val="left"/>
+      <w:pPr>
+        <w:ind w:left="1440" w:hanging="360"/>
+      </w:pPr>
+      <w:rPr>
+        <w:rFonts w:ascii="Courier New" w:hAnsi="Courier New" w:cs="Courier New" w:hint="default"/>
+      </w:rPr>
+    </w:lvl>
+    <w:lvl w:ilvl="2" w:tplc="040C0005" w:tentative="1">
+      <w:start w:val="1"/>
+      <w:numFmt w:val="bullet"/>
+      <w:lvlText w:val=""/>
+      <w:lvlJc w:val="left"/>
+      <w:pPr>
+        <w:ind w:left="2160" w:hanging="360"/>
+      </w:pPr>
+      <w:rPr>
+        <w:rFonts w:ascii="Wingdings" w:hAnsi="Wingdings" w:hint="default"/>
+      </w:rPr>
+    </w:lvl>
+    <w:lvl w:ilvl="3" w:tplc="040C0001" w:tentative="1">
+      <w:start w:val="1"/>
+      <w:numFmt w:val="bullet"/>
+      <w:lvlText w:val=""/>
+      <w:lvlJc w:val="left"/>
+      <w:pPr>
+        <w:ind w:left="2880" w:hanging="360"/>
+      </w:pPr>
+      <w:rPr>
+        <w:rFonts w:ascii="Symbol" w:hAnsi="Symbol" w:hint="default"/>
+      </w:rPr>
+    </w:lvl>
+    <w:lvl w:ilvl="4" w:tplc="040C0003" w:tentative="1">
+      <w:start w:val="1"/>
+      <w:numFmt w:val="bullet"/>
+      <w:lvlText w:val="o"/>
+      <w:lvlJc w:val="left"/>
+      <w:pPr>
+        <w:ind w:left="3600" w:hanging="360"/>
+      </w:pPr>
+      <w:rPr>
+        <w:rFonts w:ascii="Courier New" w:hAnsi="Courier New" w:cs="Courier New" w:hint="default"/>
+      </w:rPr>
+    </w:lvl>
+    <w:lvl w:ilvl="5" w:tplc="040C0005" w:tentative="1">
+      <w:start w:val="1"/>
+      <w:numFmt w:val="bullet"/>
+      <w:lvlText w:val=""/>
+      <w:lvlJc w:val="left"/>
+      <w:pPr>
+        <w:ind w:left="4320" w:hanging="360"/>
+      </w:pPr>
+      <w:rPr>
+        <w:rFonts w:ascii="Wingdings" w:hAnsi="Wingdings" w:hint="default"/>
+      </w:rPr>
+    </w:lvl>
+    <w:lvl w:ilvl="6" w:tplc="040C0001" w:tentative="1">
+      <w:start w:val="1"/>
+      <w:numFmt w:val="bullet"/>
+      <w:lvlText w:val=""/>
+      <w:lvlJc w:val="left"/>
+      <w:pPr>
+        <w:ind w:left="5040" w:hanging="360"/>
+      </w:pPr>
+      <w:rPr>
+        <w:rFonts w:ascii="Symbol" w:hAnsi="Symbol" w:hint="default"/>
+      </w:rPr>
+    </w:lvl>
+    <w:lvl w:ilvl="7" w:tplc="040C0003" w:tentative="1">
+      <w:start w:val="1"/>
+      <w:numFmt w:val="bullet"/>
+      <w:lvlText w:val="o"/>
+      <w:lvlJc w:val="left"/>
+      <w:pPr>
+        <w:ind w:left="5760" w:hanging="360"/>
+      </w:pPr>
+      <w:rPr>
+        <w:rFonts w:ascii="Courier New" w:hAnsi="Courier New" w:cs="Courier New" w:hint="default"/>
+      </w:rPr>
+    </w:lvl>
+    <w:lvl w:ilvl="8" w:tplc="040C0005" w:tentative="1">
+      <w:start w:val="1"/>
+      <w:numFmt w:val="bullet"/>
+      <w:lvlText w:val=""/>
+      <w:lvlJc w:val="left"/>
+      <w:pPr>
+        <w:ind w:left="6480" w:hanging="360"/>
+      </w:pPr>
+      <w:rPr>
+        <w:rFonts w:ascii="Wingdings" w:hAnsi="Wingdings" w:hint="default"/>
+      </w:rPr>
+    </w:lvl>
+  </w:abstractNum>
+  <w:abstractNum w:abstractNumId="22" w15:restartNumberingAfterBreak="0">
     <w:nsid w:val="5F7D7EA9"/>
     <w:multiLevelType w:val="multilevel"/>
     <w:tmpl w:val="C70E0112"/>
@@ -5915,7 +6513,7 @@
       </w:rPr>
     </w:lvl>
   </w:abstractNum>
-  <w:abstractNum w:abstractNumId="21" w15:restartNumberingAfterBreak="0">
+  <w:abstractNum w:abstractNumId="23" w15:restartNumberingAfterBreak="0">
     <w:nsid w:val="635034F9"/>
     <w:multiLevelType w:val="multilevel"/>
     <w:tmpl w:val="EFEAA87C"/>
@@ -6062,7 +6660,7 @@
       </w:rPr>
     </w:lvl>
   </w:abstractNum>
-  <w:abstractNum w:abstractNumId="22" w15:restartNumberingAfterBreak="0">
+  <w:abstractNum w:abstractNumId="24" w15:restartNumberingAfterBreak="0">
     <w:nsid w:val="657911AF"/>
     <w:multiLevelType w:val="multilevel"/>
     <w:tmpl w:val="343E7774"/>
@@ -6211,7 +6809,7 @@
       </w:rPr>
     </w:lvl>
   </w:abstractNum>
-  <w:abstractNum w:abstractNumId="23" w15:restartNumberingAfterBreak="0">
+  <w:abstractNum w:abstractNumId="25" w15:restartNumberingAfterBreak="0">
     <w:nsid w:val="6A0168F1"/>
     <w:multiLevelType w:val="multilevel"/>
     <w:tmpl w:val="7CA0684A"/>
@@ -6324,7 +6922,7 @@
       </w:pPr>
     </w:lvl>
   </w:abstractNum>
-  <w:abstractNum w:abstractNumId="24" w15:restartNumberingAfterBreak="0">
+  <w:abstractNum w:abstractNumId="26" w15:restartNumberingAfterBreak="0">
     <w:nsid w:val="6C2D3800"/>
     <w:multiLevelType w:val="multilevel"/>
     <w:tmpl w:val="435A61EE"/>
@@ -6473,7 +7071,7 @@
       </w:rPr>
     </w:lvl>
   </w:abstractNum>
-  <w:abstractNum w:abstractNumId="25" w15:restartNumberingAfterBreak="0">
+  <w:abstractNum w:abstractNumId="27" w15:restartNumberingAfterBreak="0">
     <w:nsid w:val="6DC270C8"/>
     <w:multiLevelType w:val="multilevel"/>
     <w:tmpl w:val="E58A643A"/>
@@ -6586,7 +7184,7 @@
       </w:pPr>
     </w:lvl>
   </w:abstractNum>
-  <w:abstractNum w:abstractNumId="26" w15:restartNumberingAfterBreak="0">
+  <w:abstractNum w:abstractNumId="28" w15:restartNumberingAfterBreak="0">
     <w:nsid w:val="75730164"/>
     <w:multiLevelType w:val="hybridMultilevel"/>
     <w:tmpl w:val="5290D038"/>
@@ -6676,7 +7274,7 @@
     </w:lvl>
   </w:abstractNum>
   <w:num w:numId="1" w16cid:durableId="1000622703">
-    <w:abstractNumId w:val="18"/>
+    <w:abstractNumId w:val="19"/>
   </w:num>
   <w:num w:numId="2" w16cid:durableId="533882659">
     <w:abstractNumId w:val="14"/>
@@ -6688,19 +7286,19 @@
     <w:abstractNumId w:val="9"/>
   </w:num>
   <w:num w:numId="5" w16cid:durableId="721517001">
-    <w:abstractNumId w:val="23"/>
+    <w:abstractNumId w:val="25"/>
   </w:num>
   <w:num w:numId="6" w16cid:durableId="1229268758">
-    <w:abstractNumId w:val="20"/>
+    <w:abstractNumId w:val="22"/>
   </w:num>
   <w:num w:numId="7" w16cid:durableId="847214140">
-    <w:abstractNumId w:val="17"/>
+    <w:abstractNumId w:val="18"/>
   </w:num>
   <w:num w:numId="8" w16cid:durableId="440807579">
     <w:abstractNumId w:val="13"/>
   </w:num>
   <w:num w:numId="9" w16cid:durableId="988098587">
-    <w:abstractNumId w:val="24"/>
+    <w:abstractNumId w:val="26"/>
   </w:num>
   <w:num w:numId="10" w16cid:durableId="1415199925">
     <w:abstractNumId w:val="12"/>
@@ -6709,10 +7307,10 @@
     <w:abstractNumId w:val="11"/>
   </w:num>
   <w:num w:numId="12" w16cid:durableId="846795401">
-    <w:abstractNumId w:val="25"/>
+    <w:abstractNumId w:val="27"/>
   </w:num>
   <w:num w:numId="13" w16cid:durableId="475726944">
-    <w:abstractNumId w:val="16"/>
+    <w:abstractNumId w:val="17"/>
     <w:lvlOverride w:ilvl="0">
       <w:lvl w:ilvl="0">
         <w:numFmt w:val="lowerLetter"/>
@@ -6722,7 +7320,7 @@
     </w:lvlOverride>
   </w:num>
   <w:num w:numId="14" w16cid:durableId="491796890">
-    <w:abstractNumId w:val="22"/>
+    <w:abstractNumId w:val="24"/>
   </w:num>
   <w:num w:numId="15" w16cid:durableId="1574778501">
     <w:abstractNumId w:val="3"/>
@@ -6750,16 +7348,16 @@
     <w:abstractNumId w:val="7"/>
   </w:num>
   <w:num w:numId="21" w16cid:durableId="1719820126">
-    <w:abstractNumId w:val="19"/>
+    <w:abstractNumId w:val="20"/>
   </w:num>
   <w:num w:numId="22" w16cid:durableId="138037007">
-    <w:abstractNumId w:val="21"/>
+    <w:abstractNumId w:val="23"/>
   </w:num>
   <w:num w:numId="23" w16cid:durableId="2011172000">
     <w:abstractNumId w:val="10"/>
   </w:num>
   <w:num w:numId="24" w16cid:durableId="524026452">
-    <w:abstractNumId w:val="26"/>
+    <w:abstractNumId w:val="28"/>
   </w:num>
   <w:num w:numId="25" w16cid:durableId="1299801078">
     <w:abstractNumId w:val="6"/>
@@ -6770,8 +7368,22 @@
   <w:num w:numId="27" w16cid:durableId="1086001946">
     <w:abstractNumId w:val="2"/>
   </w:num>
+  <w:num w:numId="28" w16cid:durableId="1572160451">
+    <w:abstractNumId w:val="21"/>
+  </w:num>
+  <w:num w:numId="29" w16cid:durableId="1207983673">
+    <w:abstractNumId w:val="16"/>
+  </w:num>
   <w:numIdMacAtCleanup w:val="25"/>
 </w:numbering>
+</file>
+
+<file path=word/people.xml><?xml version="1.0" encoding="utf-8"?>
+<w15:people xmlns:wpc="http://schemas.microsoft.com/office/word/2010/wordprocessingCanvas" xmlns:cx="http://schemas.microsoft.com/office/drawing/2014/chartex" xmlns:cx1="http://schemas.microsoft.com/office/drawing/2015/9/8/chartex" xmlns:cx2="http://schemas.microsoft.com/office/drawing/2015/10/21/chartex" xmlns:cx3="http://schemas.microsoft.com/office/drawing/2016/5/9/chartex" xmlns:cx4="http://schemas.microsoft.com/office/drawing/2016/5/10/chartex" xmlns:cx5="http://schemas.microsoft.com/office/drawing/2016/5/11/chartex" xmlns:cx6="http://schemas.microsoft.com/office/drawing/2016/5/12/chartex" xmlns:cx7="http://schemas.microsoft.com/office/drawing/2016/5/13/chartex" xmlns:cx8="http://schemas.microsoft.com/office/drawing/2016/5/14/chartex" xmlns:mc="http://schemas.openxmlformats.org/markup-compatibility/2006" xmlns:aink="http://schemas.microsoft.com/office/drawing/2016/ink" xmlns:am3d="http://schemas.microsoft.com/office/drawing/2017/model3d" xmlns:o="urn:schemas-microsoft-com:office:office" xmlns:oel="http://schemas.microsoft.com/office/2019/extlst" xmlns:r="http://schemas.openxmlformats.org/officeDocument/2006/relationships" xmlns:m="http://schemas.openxmlformats.org/officeDocument/2006/math" xmlns:v="urn:schemas-microsoft-com:vml" xmlns:wp14="http://schemas.microsoft.com/office/word/2010/wordprocessingDrawing" xmlns:wp="http://schemas.openxmlformats.org/drawingml/2006/wordprocessingDrawing" xmlns:w10="urn:schemas-microsoft-com:office:word" xmlns:w="http://schemas.openxmlformats.org/wordprocessingml/2006/main" xmlns:w14="http://schemas.microsoft.com/office/word/2010/wordml" xmlns:w15="http://schemas.microsoft.com/office/word/2012/wordml" xmlns:w16cex="http://schemas.microsoft.com/office/word/2018/wordml/cex" xmlns:w16cid="http://schemas.microsoft.com/office/word/2016/wordml/cid" xmlns:w16="http://schemas.microsoft.com/office/word/2018/wordml" xmlns:w16du="http://schemas.microsoft.com/office/word/2023/wordml/word16du" xmlns:w16sdtdh="http://schemas.microsoft.com/office/word/2020/wordml/sdtdatahash" xmlns:w16se="http://schemas.microsoft.com/office/word/2015/wordml/symex" xmlns:wpg="http://schemas.microsoft.com/office/word/2010/wordprocessingGroup" xmlns:wpi="http://schemas.microsoft.com/office/word/2010/wordprocessingInk" xmlns:wne="http://schemas.microsoft.com/office/word/2006/wordml" xmlns:wps="http://schemas.microsoft.com/office/word/2010/wordprocessingShape" mc:Ignorable="w14 w15 w16se w16cid w16 w16cex w16sdtdh w16du wp14">
+  <w15:person w15:author="Samray Hugo">
+    <w15:presenceInfo w15:providerId="AD" w15:userId="S::etu51688@henallux.be::b47e93c9-c983-4adf-ae7e-c8ecd8d5a915"/>
+  </w15:person>
+</w15:people>
 </file>
 
 <file path=word/styles.xml><?xml version="1.0" encoding="utf-8"?>
@@ -7174,6 +7786,10 @@
   <w:style w:type="paragraph" w:default="1" w:styleId="Normal">
     <w:name w:val="Normal"/>
     <w:qFormat/>
+    <w:rsid w:val="002738A6"/>
+    <w:pPr>
+      <w:jc w:val="both"/>
+    </w:pPr>
   </w:style>
   <w:style w:type="paragraph" w:styleId="Titre1">
     <w:name w:val="heading 1"/>
@@ -7607,6 +8223,86 @@
     <w:basedOn w:val="Policepardfaut"/>
     <w:rsid w:val="001E5138"/>
   </w:style>
+  <w:style w:type="character" w:styleId="Accentuationlgre">
+    <w:name w:val="Subtle Emphasis"/>
+    <w:basedOn w:val="Policepardfaut"/>
+    <w:uiPriority w:val="19"/>
+    <w:qFormat/>
+    <w:rsid w:val="002738A6"/>
+    <w:rPr>
+      <w:i/>
+      <w:iCs/>
+      <w:color w:val="404040" w:themeColor="text1" w:themeTint="BF"/>
+    </w:rPr>
+  </w:style>
+  <w:style w:type="character" w:styleId="Marquedecommentaire">
+    <w:name w:val="annotation reference"/>
+    <w:basedOn w:val="Policepardfaut"/>
+    <w:uiPriority w:val="99"/>
+    <w:semiHidden/>
+    <w:unhideWhenUsed/>
+    <w:rsid w:val="00D422B3"/>
+    <w:rPr>
+      <w:sz w:val="16"/>
+      <w:szCs w:val="16"/>
+    </w:rPr>
+  </w:style>
+  <w:style w:type="paragraph" w:styleId="Commentaire">
+    <w:name w:val="annotation text"/>
+    <w:basedOn w:val="Normal"/>
+    <w:link w:val="CommentaireCar"/>
+    <w:uiPriority w:val="99"/>
+    <w:semiHidden/>
+    <w:unhideWhenUsed/>
+    <w:rsid w:val="00D422B3"/>
+    <w:pPr>
+      <w:spacing w:line="240" w:lineRule="auto"/>
+    </w:pPr>
+    <w:rPr>
+      <w:sz w:val="20"/>
+      <w:szCs w:val="20"/>
+    </w:rPr>
+  </w:style>
+  <w:style w:type="character" w:customStyle="1" w:styleId="CommentaireCar">
+    <w:name w:val="Commentaire Car"/>
+    <w:basedOn w:val="Policepardfaut"/>
+    <w:link w:val="Commentaire"/>
+    <w:uiPriority w:val="99"/>
+    <w:semiHidden/>
+    <w:rsid w:val="00D422B3"/>
+    <w:rPr>
+      <w:sz w:val="20"/>
+      <w:szCs w:val="20"/>
+    </w:rPr>
+  </w:style>
+  <w:style w:type="paragraph" w:styleId="Objetducommentaire">
+    <w:name w:val="annotation subject"/>
+    <w:basedOn w:val="Commentaire"/>
+    <w:next w:val="Commentaire"/>
+    <w:link w:val="ObjetducommentaireCar"/>
+    <w:uiPriority w:val="99"/>
+    <w:semiHidden/>
+    <w:unhideWhenUsed/>
+    <w:rsid w:val="00D422B3"/>
+    <w:rPr>
+      <w:b/>
+      <w:bCs/>
+    </w:rPr>
+  </w:style>
+  <w:style w:type="character" w:customStyle="1" w:styleId="ObjetducommentaireCar">
+    <w:name w:val="Objet du commentaire Car"/>
+    <w:basedOn w:val="CommentaireCar"/>
+    <w:link w:val="Objetducommentaire"/>
+    <w:uiPriority w:val="99"/>
+    <w:semiHidden/>
+    <w:rsid w:val="00D422B3"/>
+    <w:rPr>
+      <w:b/>
+      <w:bCs/>
+      <w:sz w:val="20"/>
+      <w:szCs w:val="20"/>
+    </w:rPr>
+  </w:style>
 </w:styles>
 </file>
 

</xml_diff>

<commit_message>
Ajout du schéma dans le pré-dossier
</commit_message>
<xml_diff>
--- a/Pré-dossier Smartcity.docx
+++ b/Pré-dossier Smartcity.docx
@@ -2637,27 +2637,7 @@
         <w:rPr>
           <w:lang w:val="fr-BE"/>
         </w:rPr>
-        <w:t xml:space="preserve">Pour ce faire, l’onglet principal de l’application sera une carte répertoriant tous les véhicules disponibles de la société se trouvant sur celle-ci, à </w:t>
-      </w:r>
-      <w:commentRangeStart w:id="3"/>
-      <w:r>
-        <w:rPr>
-          <w:lang w:val="fr-BE"/>
-        </w:rPr>
-        <w:t>leur emplacement précis</w:t>
-      </w:r>
-      <w:commentRangeEnd w:id="3"/>
-      <w:r>
-        <w:rPr>
-          <w:rStyle w:val="Marquedecommentaire"/>
-        </w:rPr>
-        <w:commentReference w:id="3"/>
-      </w:r>
-      <w:r>
-        <w:rPr>
-          <w:lang w:val="fr-BE"/>
-        </w:rPr>
-        <w:t>. De plus, l’utilisateur aura la possibilité de filtrer les véhicules affichés en fonction de leurs catégories (voiture, trottinette,</w:t>
+        <w:t>Pour ce faire, l’onglet principal de l’application sera une carte répertoriant tous les véhicules disponibles de la société se trouvant sur celle-ci, à leur emplacement précis. De plus, l’utilisateur aura la possibilité de filtrer les véhicules affichés en fonction de leurs catégories (voiture, trottinette,</w:t>
       </w:r>
       <w:r>
         <w:rPr>
@@ -2822,7 +2802,7 @@
           <w:lang w:val="fr-BE"/>
         </w:rPr>
       </w:pPr>
-      <w:bookmarkStart w:id="4" w:name="_Toc180420837"/>
+      <w:bookmarkStart w:id="3" w:name="_Toc180420837"/>
       <w:r>
         <w:rPr>
           <w:lang w:val="fr-BE"/>
@@ -2830,7 +2810,7 @@
         <w:lastRenderedPageBreak/>
         <w:t>Fonctionnalités</w:t>
       </w:r>
-      <w:bookmarkEnd w:id="4"/>
+      <w:bookmarkEnd w:id="3"/>
     </w:p>
     <w:p>
       <w:pPr>
@@ -2843,23 +2823,19 @@
           <w:lang w:val="fr-BE"/>
         </w:rPr>
       </w:pPr>
-      <w:bookmarkStart w:id="5" w:name="_Toc180420838"/>
-      <w:commentRangeStart w:id="6"/>
+      <w:bookmarkStart w:id="4" w:name="_Toc180420838"/>
       <w:r>
         <w:rPr>
           <w:lang w:val="fr-BE"/>
         </w:rPr>
         <w:t>Base</w:t>
       </w:r>
-      <w:bookmarkEnd w:id="5"/>
-      <w:commentRangeEnd w:id="6"/>
-      <w:r>
-        <w:rPr>
-          <w:rStyle w:val="Marquedecommentaire"/>
-          <w:rFonts w:asciiTheme="minorHAnsi" w:eastAsiaTheme="minorEastAsia" w:hAnsiTheme="minorHAnsi" w:cstheme="minorBidi"/>
-          <w:color w:val="auto"/>
-        </w:rPr>
-        <w:commentReference w:id="6"/>
+      <w:bookmarkEnd w:id="4"/>
+      <w:r>
+        <w:rPr>
+          <w:lang w:val="fr-BE"/>
+        </w:rPr>
+        <w:t>s</w:t>
       </w:r>
     </w:p>
     <w:p>
@@ -2882,7 +2858,7 @@
           <w:lang w:val="fr-BE"/>
         </w:rPr>
       </w:pPr>
-      <w:bookmarkStart w:id="7" w:name="_Hlk180426041"/>
+      <w:bookmarkStart w:id="5" w:name="_Hlk180426041"/>
       <w:r>
         <w:rPr>
           <w:lang w:val="fr-BE"/>
@@ -2908,7 +2884,7 @@
         <w:t>Trier la recherche par moyen de transport</w:t>
       </w:r>
     </w:p>
-    <w:bookmarkEnd w:id="7"/>
+    <w:bookmarkEnd w:id="5"/>
     <w:p>
       <w:pPr>
         <w:pStyle w:val="Paragraphedeliste"/>
@@ -3059,14 +3035,20 @@
           <w:lang w:val="fr-BE"/>
         </w:rPr>
       </w:pPr>
-      <w:bookmarkStart w:id="8" w:name="_Toc180420839"/>
+      <w:bookmarkStart w:id="6" w:name="_Toc180420839"/>
       <w:r>
         <w:rPr>
           <w:lang w:val="fr-BE"/>
         </w:rPr>
         <w:t>Avancée</w:t>
       </w:r>
-      <w:bookmarkEnd w:id="8"/>
+      <w:bookmarkEnd w:id="6"/>
+      <w:r>
+        <w:rPr>
+          <w:lang w:val="fr-BE"/>
+        </w:rPr>
+        <w:t>s</w:t>
+      </w:r>
     </w:p>
     <w:p>
       <w:pPr>
@@ -3155,54 +3137,76 @@
           <w:lang w:val="fr-BE"/>
         </w:rPr>
       </w:pPr>
-      <w:bookmarkStart w:id="9" w:name="_Toc180420840"/>
-      <w:r>
-        <w:rPr>
+      <w:bookmarkStart w:id="7" w:name="_Toc180420840"/>
+      <w:r>
+        <w:rPr>
+          <w:noProof/>
           <w:lang w:val="fr-BE"/>
         </w:rPr>
         <w:lastRenderedPageBreak/>
+        <w:drawing>
+          <wp:anchor distT="0" distB="0" distL="114300" distR="114300" simplePos="0" relativeHeight="251661312" behindDoc="0" locked="0" layoutInCell="1" allowOverlap="1" wp14:anchorId="4F07FE9B" wp14:editId="2B11C45F">
+            <wp:simplePos x="0" y="0"/>
+            <wp:positionH relativeFrom="margin">
+              <wp:align>center</wp:align>
+            </wp:positionH>
+            <wp:positionV relativeFrom="paragraph">
+              <wp:posOffset>435610</wp:posOffset>
+            </wp:positionV>
+            <wp:extent cx="4965065" cy="7575550"/>
+            <wp:effectExtent l="0" t="0" r="635" b="6350"/>
+            <wp:wrapTopAndBottom/>
+            <wp:docPr id="215465675" name="Image 5" descr="Une image contenant texte, capture d’écran, diagramme, conception&#10;&#10;Description générée automatiquement"/>
+            <wp:cNvGraphicFramePr>
+              <a:graphicFrameLocks xmlns:a="http://schemas.openxmlformats.org/drawingml/2006/main" noChangeAspect="1"/>
+            </wp:cNvGraphicFramePr>
+            <a:graphic xmlns:a="http://schemas.openxmlformats.org/drawingml/2006/main">
+              <a:graphicData uri="http://schemas.openxmlformats.org/drawingml/2006/picture">
+                <pic:pic xmlns:pic="http://schemas.openxmlformats.org/drawingml/2006/picture">
+                  <pic:nvPicPr>
+                    <pic:cNvPr id="215465675" name="Image 5" descr="Une image contenant texte, capture d’écran, diagramme, conception&#10;&#10;Description générée automatiquement"/>
+                    <pic:cNvPicPr/>
+                  </pic:nvPicPr>
+                  <pic:blipFill>
+                    <a:blip r:embed="rId15" cstate="print">
+                      <a:extLst>
+                        <a:ext uri="{28A0092B-C50C-407E-A947-70E740481C1C}">
+                          <a14:useLocalDpi xmlns:a14="http://schemas.microsoft.com/office/drawing/2010/main" val="0"/>
+                        </a:ext>
+                      </a:extLst>
+                    </a:blip>
+                    <a:stretch>
+                      <a:fillRect/>
+                    </a:stretch>
+                  </pic:blipFill>
+                  <pic:spPr>
+                    <a:xfrm>
+                      <a:off x="0" y="0"/>
+                      <a:ext cx="4965065" cy="7575550"/>
+                    </a:xfrm>
+                    <a:prstGeom prst="rect">
+                      <a:avLst/>
+                    </a:prstGeom>
+                  </pic:spPr>
+                </pic:pic>
+              </a:graphicData>
+            </a:graphic>
+            <wp14:sizeRelH relativeFrom="page">
+              <wp14:pctWidth>0</wp14:pctWidth>
+            </wp14:sizeRelH>
+            <wp14:sizeRelV relativeFrom="page">
+              <wp14:pctHeight>0</wp14:pctHeight>
+            </wp14:sizeRelV>
+          </wp:anchor>
+        </w:drawing>
+      </w:r>
+      <w:r>
+        <w:rPr>
+          <w:lang w:val="fr-BE"/>
+        </w:rPr>
         <w:t>Schéma de base de données</w:t>
       </w:r>
-      <w:bookmarkEnd w:id="9"/>
-    </w:p>
-    <w:p>
-      <w:pPr>
-        <w:rPr>
-          <w:lang w:val="fr-BE"/>
-        </w:rPr>
-      </w:pPr>
-    </w:p>
-    <w:p>
-      <w:pPr>
-        <w:jc w:val="center"/>
-        <w:rPr>
-          <w:rStyle w:val="Accentuationlgre"/>
-          <w:lang w:val="fr-BE"/>
-        </w:rPr>
-      </w:pPr>
-      <w:r>
-        <w:rPr>
-          <w:rStyle w:val="Accentuationlgre"/>
-          <w:lang w:val="fr-BE"/>
-        </w:rPr>
-        <w:t>&lt; Je le mettrai quand il sera complétement fini pour éviter de le changer 576357 fois dans le doc &gt;</w:t>
-      </w:r>
-    </w:p>
-    <w:p>
-      <w:pPr>
-        <w:jc w:val="center"/>
-        <w:rPr>
-          <w:rStyle w:val="Accentuationlgre"/>
-          <w:lang w:val="fr-BE"/>
-        </w:rPr>
-      </w:pPr>
-      <w:r>
-        <w:rPr>
-          <w:rStyle w:val="Accentuationlgre"/>
-          <w:lang w:val="fr-BE"/>
-        </w:rPr>
-        <w:t>&lt; Mais il est dans les annexes &gt;</w:t>
-      </w:r>
+      <w:bookmarkEnd w:id="7"/>
     </w:p>
     <w:p>
       <w:pPr>
@@ -3238,12 +3242,13 @@
           <w:lang w:val="fr-BE"/>
         </w:rPr>
       </w:pPr>
-      <w:bookmarkStart w:id="10" w:name="_Toc180420841"/>
+      <w:bookmarkStart w:id="8" w:name="_Toc180420841"/>
       <w:proofErr w:type="spellStart"/>
       <w:r>
         <w:rPr>
           <w:lang w:val="fr-BE"/>
         </w:rPr>
+        <w:lastRenderedPageBreak/>
         <w:t>Mockups</w:t>
       </w:r>
       <w:proofErr w:type="spellEnd"/>
@@ -3253,7 +3258,7 @@
         </w:rPr>
         <w:t xml:space="preserve"> du back office</w:t>
       </w:r>
-      <w:bookmarkEnd w:id="10"/>
+      <w:bookmarkEnd w:id="8"/>
     </w:p>
     <w:p>
       <w:pPr>
@@ -3287,14 +3292,14 @@
           <w:lang w:val="fr-BE"/>
         </w:rPr>
       </w:pPr>
-      <w:bookmarkStart w:id="11" w:name="_Toc180420842"/>
+      <w:bookmarkStart w:id="9" w:name="_Toc180420842"/>
       <w:r>
         <w:rPr>
           <w:lang w:val="fr-BE"/>
         </w:rPr>
         <w:t>Maquettes</w:t>
       </w:r>
-      <w:bookmarkEnd w:id="11"/>
+      <w:bookmarkEnd w:id="9"/>
     </w:p>
     <w:p>
       <w:pPr>
@@ -3336,72 +3341,24 @@
       </w:r>
     </w:p>
   </w:comment>
-  <w:comment w:id="3" w:author="Samray Hugo" w:date="2024-10-21T17:45:00Z" w:initials="HS">
-    <w:p>
-      <w:pPr>
-        <w:jc w:val="left"/>
-      </w:pPr>
-      <w:r>
-        <w:rPr>
-          <w:rStyle w:val="Marquedecommentaire"/>
-        </w:rPr>
-        <w:annotationRef/>
-      </w:r>
-      <w:r>
-        <w:rPr>
-          <w:color w:val="000000"/>
-          <w:sz w:val="20"/>
-          <w:szCs w:val="20"/>
-        </w:rPr>
-        <w:t>y’a pas de S vu que chacun à un seul emplacement à la fois :)</w:t>
-      </w:r>
-    </w:p>
-  </w:comment>
-  <w:comment w:id="6" w:author="Samray Hugo" w:date="2024-10-21T17:50:00Z" w:initials="HS">
-    <w:p>
-      <w:pPr>
-        <w:jc w:val="left"/>
-      </w:pPr>
-      <w:r>
-        <w:rPr>
-          <w:rStyle w:val="Marquedecommentaire"/>
-        </w:rPr>
-        <w:annotationRef/>
-      </w:r>
-      <w:r>
-        <w:rPr>
-          <w:color w:val="000000"/>
-          <w:sz w:val="20"/>
-          <w:szCs w:val="20"/>
-        </w:rPr>
-        <w:t>À 'Base' et 'Avancée' je sais pas s’il faut un S, je dirais que oui, vu qu’il y a plusieurs fonctionnalités pour chaque type.</w:t>
-      </w:r>
-    </w:p>
-  </w:comment>
 </w:comments>
 </file>
 
 <file path=word/commentsExtended.xml><?xml version="1.0" encoding="utf-8"?>
 <w15:commentsEx xmlns:wpc="http://schemas.microsoft.com/office/word/2010/wordprocessingCanvas" xmlns:cx="http://schemas.microsoft.com/office/drawing/2014/chartex" xmlns:cx1="http://schemas.microsoft.com/office/drawing/2015/9/8/chartex" xmlns:cx2="http://schemas.microsoft.com/office/drawing/2015/10/21/chartex" xmlns:cx3="http://schemas.microsoft.com/office/drawing/2016/5/9/chartex" xmlns:cx4="http://schemas.microsoft.com/office/drawing/2016/5/10/chartex" xmlns:cx5="http://schemas.microsoft.com/office/drawing/2016/5/11/chartex" xmlns:cx6="http://schemas.microsoft.com/office/drawing/2016/5/12/chartex" xmlns:cx7="http://schemas.microsoft.com/office/drawing/2016/5/13/chartex" xmlns:cx8="http://schemas.microsoft.com/office/drawing/2016/5/14/chartex" xmlns:mc="http://schemas.openxmlformats.org/markup-compatibility/2006" xmlns:aink="http://schemas.microsoft.com/office/drawing/2016/ink" xmlns:am3d="http://schemas.microsoft.com/office/drawing/2017/model3d" xmlns:o="urn:schemas-microsoft-com:office:office" xmlns:oel="http://schemas.microsoft.com/office/2019/extlst" xmlns:r="http://schemas.openxmlformats.org/officeDocument/2006/relationships" xmlns:m="http://schemas.openxmlformats.org/officeDocument/2006/math" xmlns:v="urn:schemas-microsoft-com:vml" xmlns:wp14="http://schemas.microsoft.com/office/word/2010/wordprocessingDrawing" xmlns:wp="http://schemas.openxmlformats.org/drawingml/2006/wordprocessingDrawing" xmlns:w10="urn:schemas-microsoft-com:office:word" xmlns:w="http://schemas.openxmlformats.org/wordprocessingml/2006/main" xmlns:w14="http://schemas.microsoft.com/office/word/2010/wordml" xmlns:w15="http://schemas.microsoft.com/office/word/2012/wordml" xmlns:w16cex="http://schemas.microsoft.com/office/word/2018/wordml/cex" xmlns:w16cid="http://schemas.microsoft.com/office/word/2016/wordml/cid" xmlns:w16="http://schemas.microsoft.com/office/word/2018/wordml" xmlns:w16du="http://schemas.microsoft.com/office/word/2023/wordml/word16du" xmlns:w16sdtdh="http://schemas.microsoft.com/office/word/2020/wordml/sdtdatahash" xmlns:w16se="http://schemas.microsoft.com/office/word/2015/wordml/symex" xmlns:wpg="http://schemas.microsoft.com/office/word/2010/wordprocessingGroup" xmlns:wpi="http://schemas.microsoft.com/office/word/2010/wordprocessingInk" xmlns:wne="http://schemas.microsoft.com/office/word/2006/wordml" xmlns:wps="http://schemas.microsoft.com/office/word/2010/wordprocessingShape" mc:Ignorable="w14 w15 w16se w16cid w16 w16cex w16sdtdh w16du wp14">
   <w15:commentEx w15:paraId="5D66B09B" w15:done="0"/>
-  <w15:commentEx w15:paraId="25EF83A9" w15:done="0"/>
-  <w15:commentEx w15:paraId="4D499B8A" w15:done="0"/>
 </w15:commentsEx>
 </file>
 
 <file path=word/commentsExtensible.xml><?xml version="1.0" encoding="utf-8"?>
 <w16cex:commentsExtensible xmlns:wpc="http://schemas.microsoft.com/office/word/2010/wordprocessingCanvas" xmlns:cx="http://schemas.microsoft.com/office/drawing/2014/chartex" xmlns:cx1="http://schemas.microsoft.com/office/drawing/2015/9/8/chartex" xmlns:cx2="http://schemas.microsoft.com/office/drawing/2015/10/21/chartex" xmlns:cx3="http://schemas.microsoft.com/office/drawing/2016/5/9/chartex" xmlns:cx4="http://schemas.microsoft.com/office/drawing/2016/5/10/chartex" xmlns:cx5="http://schemas.microsoft.com/office/drawing/2016/5/11/chartex" xmlns:cx6="http://schemas.microsoft.com/office/drawing/2016/5/12/chartex" xmlns:cx7="http://schemas.microsoft.com/office/drawing/2016/5/13/chartex" xmlns:cx8="http://schemas.microsoft.com/office/drawing/2016/5/14/chartex" xmlns:cr="http://schemas.microsoft.com/office/comments/2020/reactions" xmlns:mc="http://schemas.openxmlformats.org/markup-compatibility/2006" xmlns:aink="http://schemas.microsoft.com/office/drawing/2016/ink" xmlns:am3d="http://schemas.microsoft.com/office/drawing/2017/model3d" xmlns:o="urn:schemas-microsoft-com:office:office" xmlns:oel="http://schemas.microsoft.com/office/2019/extlst" xmlns:r="http://schemas.openxmlformats.org/officeDocument/2006/relationships" xmlns:m="http://schemas.openxmlformats.org/officeDocument/2006/math" xmlns:v="urn:schemas-microsoft-com:vml" xmlns:wp14="http://schemas.microsoft.com/office/word/2010/wordprocessingDrawing" xmlns:wp="http://schemas.openxmlformats.org/drawingml/2006/wordprocessingDrawing" xmlns:w10="urn:schemas-microsoft-com:office:word" xmlns:w="http://schemas.openxmlformats.org/wordprocessingml/2006/main" xmlns:w14="http://schemas.microsoft.com/office/word/2010/wordml" xmlns:w15="http://schemas.microsoft.com/office/word/2012/wordml" xmlns:w16cex="http://schemas.microsoft.com/office/word/2018/wordml/cex" xmlns:w16cid="http://schemas.microsoft.com/office/word/2016/wordml/cid" xmlns:w16="http://schemas.microsoft.com/office/word/2018/wordml" xmlns:w16du="http://schemas.microsoft.com/office/word/2023/wordml/word16du" xmlns:w16sdtdh="http://schemas.microsoft.com/office/word/2020/wordml/sdtdatahash" xmlns:w16se="http://schemas.microsoft.com/office/word/2015/wordml/symex" xmlns:wpg="http://schemas.microsoft.com/office/word/2010/wordprocessingGroup" xmlns:wpi="http://schemas.microsoft.com/office/word/2010/wordprocessingInk" xmlns:wne="http://schemas.microsoft.com/office/word/2006/wordml" xmlns:wps="http://schemas.microsoft.com/office/word/2010/wordprocessingShape" mc:Ignorable="w14 w15 w16se w16cid w16 w16cex w16sdtdh cr w16du wp14">
   <w16cex:commentExtensible w16cex:durableId="041D4AAB" w16cex:dateUtc="2024-10-21T15:44:00Z"/>
-  <w16cex:commentExtensible w16cex:durableId="683825D4" w16cex:dateUtc="2024-10-21T15:45:00Z"/>
-  <w16cex:commentExtensible w16cex:durableId="01BCB339" w16cex:dateUtc="2024-10-21T15:50:00Z"/>
 </w16cex:commentsExtensible>
 </file>
 
 <file path=word/commentsIds.xml><?xml version="1.0" encoding="utf-8"?>
 <w16cid:commentsIds xmlns:wpc="http://schemas.microsoft.com/office/word/2010/wordprocessingCanvas" xmlns:cx="http://schemas.microsoft.com/office/drawing/2014/chartex" xmlns:cx1="http://schemas.microsoft.com/office/drawing/2015/9/8/chartex" xmlns:cx2="http://schemas.microsoft.com/office/drawing/2015/10/21/chartex" xmlns:cx3="http://schemas.microsoft.com/office/drawing/2016/5/9/chartex" xmlns:cx4="http://schemas.microsoft.com/office/drawing/2016/5/10/chartex" xmlns:cx5="http://schemas.microsoft.com/office/drawing/2016/5/11/chartex" xmlns:cx6="http://schemas.microsoft.com/office/drawing/2016/5/12/chartex" xmlns:cx7="http://schemas.microsoft.com/office/drawing/2016/5/13/chartex" xmlns:cx8="http://schemas.microsoft.com/office/drawing/2016/5/14/chartex" xmlns:mc="http://schemas.openxmlformats.org/markup-compatibility/2006" xmlns:aink="http://schemas.microsoft.com/office/drawing/2016/ink" xmlns:am3d="http://schemas.microsoft.com/office/drawing/2017/model3d" xmlns:o="urn:schemas-microsoft-com:office:office" xmlns:oel="http://schemas.microsoft.com/office/2019/extlst" xmlns:r="http://schemas.openxmlformats.org/officeDocument/2006/relationships" xmlns:m="http://schemas.openxmlformats.org/officeDocument/2006/math" xmlns:v="urn:schemas-microsoft-com:vml" xmlns:wp14="http://schemas.microsoft.com/office/word/2010/wordprocessingDrawing" xmlns:wp="http://schemas.openxmlformats.org/drawingml/2006/wordprocessingDrawing" xmlns:w10="urn:schemas-microsoft-com:office:word" xmlns:w="http://schemas.openxmlformats.org/wordprocessingml/2006/main" xmlns:w14="http://schemas.microsoft.com/office/word/2010/wordml" xmlns:w15="http://schemas.microsoft.com/office/word/2012/wordml" xmlns:w16cex="http://schemas.microsoft.com/office/word/2018/wordml/cex" xmlns:w16cid="http://schemas.microsoft.com/office/word/2016/wordml/cid" xmlns:w16="http://schemas.microsoft.com/office/word/2018/wordml" xmlns:w16du="http://schemas.microsoft.com/office/word/2023/wordml/word16du" xmlns:w16sdtdh="http://schemas.microsoft.com/office/word/2020/wordml/sdtdatahash" xmlns:w16se="http://schemas.microsoft.com/office/word/2015/wordml/symex" xmlns:wpg="http://schemas.microsoft.com/office/word/2010/wordprocessingGroup" xmlns:wpi="http://schemas.microsoft.com/office/word/2010/wordprocessingInk" xmlns:wne="http://schemas.microsoft.com/office/word/2006/wordml" xmlns:wps="http://schemas.microsoft.com/office/word/2010/wordprocessingShape" mc:Ignorable="w14 w15 w16se w16cid w16 w16cex w16sdtdh w16du wp14">
   <w16cid:commentId w16cid:paraId="5D66B09B" w16cid:durableId="041D4AAB"/>
-  <w16cid:commentId w16cid:paraId="25EF83A9" w16cid:durableId="683825D4"/>
-  <w16cid:commentId w16cid:paraId="4D499B8A" w16cid:durableId="01BCB339"/>
 </w16cid:commentsIds>
 </file>
 

</xml_diff>

<commit_message>
Modification du word et annexes : ajout et modifications des maquettes et de la base de données
</commit_message>
<xml_diff>
--- a/Pré-dossier Smartcity.docx
+++ b/Pré-dossier Smartcity.docx
@@ -1634,18 +1634,10 @@
         </w:sectPr>
       </w:pPr>
     </w:p>
+    <w:bookmarkStart w:id="0" w:name="_Toc180616448" w:displacedByCustomXml="next"/>
     <w:sdt>
       <w:sdtPr>
-        <w:rPr>
-          <w:rFonts w:asciiTheme="minorHAnsi" w:eastAsiaTheme="minorEastAsia" w:hAnsiTheme="minorHAnsi" w:cstheme="minorBidi"/>
-          <w:color w:val="auto"/>
-          <w:kern w:val="2"/>
-          <w:sz w:val="22"/>
-          <w:szCs w:val="22"/>
-          <w:lang w:val="fr-FR" w:eastAsia="zh-CN"/>
-          <w14:ligatures w14:val="standardContextual"/>
-        </w:rPr>
-        <w:id w:val="-149597703"/>
+        <w:id w:val="-1079595342"/>
         <w:docPartObj>
           <w:docPartGallery w:val="Table of Contents"/>
           <w:docPartUnique/>
@@ -1653,69 +1645,83 @@
       </w:sdtPr>
       <w:sdtEndPr>
         <w:rPr>
+          <w:rFonts w:asciiTheme="minorHAnsi" w:eastAsiaTheme="minorEastAsia" w:hAnsiTheme="minorHAnsi" w:cstheme="minorBidi"/>
           <w:b/>
           <w:bCs/>
+          <w:noProof/>
+          <w:color w:val="auto"/>
+          <w:sz w:val="22"/>
+          <w:szCs w:val="22"/>
+          <w:lang w:val="en-US"/>
         </w:rPr>
       </w:sdtEndPr>
       <w:sdtContent>
         <w:p>
           <w:pPr>
-            <w:pStyle w:val="En-ttedetabledesmatires"/>
+            <w:pStyle w:val="Titre1"/>
+            <w:numPr>
+              <w:ilvl w:val="0"/>
+              <w:numId w:val="0"/>
+            </w:numPr>
+            <w:ind w:left="360" w:hanging="360"/>
           </w:pPr>
           <w:r>
-            <w:rPr>
-              <w:lang w:val="fr-FR"/>
-            </w:rPr>
             <w:t>Table des matières</w:t>
           </w:r>
+          <w:bookmarkEnd w:id="0"/>
         </w:p>
         <w:p>
           <w:pPr>
             <w:pStyle w:val="TM1"/>
+            <w:tabs>
+              <w:tab w:val="right" w:leader="dot" w:pos="9350"/>
+            </w:tabs>
             <w:rPr>
+              <w:rFonts w:cstheme="minorBidi"/>
+              <w:b w:val="0"/>
+              <w:bCs w:val="0"/>
+              <w:caps w:val="0"/>
               <w:noProof/>
               <w:sz w:val="24"/>
               <w:szCs w:val="24"/>
-              <w:lang w:val="fr-BE" w:eastAsia="fr-BE"/>
+              <w:lang w:val="fr-BE" w:eastAsia="fr-FR"/>
             </w:rPr>
           </w:pPr>
           <w:r>
+            <w:rPr>
+              <w:b w:val="0"/>
+              <w:bCs w:val="0"/>
+            </w:rPr>
             <w:fldChar w:fldCharType="begin"/>
           </w:r>
           <w:r>
-            <w:instrText xml:space="preserve"> TOC \o "1-3" \h \z \u </w:instrText>
+            <w:rPr>
+              <w:b w:val="0"/>
+              <w:bCs w:val="0"/>
+            </w:rPr>
+            <w:instrText>TOC \o "1-3" \h \z \u</w:instrText>
           </w:r>
           <w:r>
+            <w:rPr>
+              <w:b w:val="0"/>
+              <w:bCs w:val="0"/>
+            </w:rPr>
             <w:fldChar w:fldCharType="separate"/>
           </w:r>
-          <w:hyperlink w:anchor="_Toc180420835" w:history="1">
+          <w:hyperlink w:anchor="_Toc180616448" w:history="1">
             <w:r>
               <w:rPr>
                 <w:rStyle w:val="Lienhypertexte"/>
+                <w:b w:val="0"/>
+                <w:bCs w:val="0"/>
                 <w:noProof/>
-                <w:lang w:val="fr-BE"/>
-              </w:rPr>
-              <w:t>1.</w:t>
-            </w:r>
-            <w:r>
-              <w:rPr>
-                <w:noProof/>
-                <w:sz w:val="24"/>
-                <w:szCs w:val="24"/>
-                <w:lang w:val="fr-BE" w:eastAsia="fr-BE"/>
-              </w:rPr>
-              <w:tab/>
-            </w:r>
-            <w:r>
-              <w:rPr>
-                <w:rStyle w:val="Lienhypertexte"/>
-                <w:noProof/>
-                <w:lang w:val="fr-BE"/>
-              </w:rPr>
-              <w:t>Introduction</w:t>
-            </w:r>
-            <w:r>
-              <w:rPr>
+              </w:rPr>
+              <w:t>Table des matières</w:t>
+            </w:r>
+            <w:r>
+              <w:rPr>
+                <w:b w:val="0"/>
+                <w:bCs w:val="0"/>
                 <w:noProof/>
                 <w:webHidden/>
               </w:rPr>
@@ -1723,6 +1729,8 @@
             </w:r>
             <w:r>
               <w:rPr>
+                <w:b w:val="0"/>
+                <w:bCs w:val="0"/>
                 <w:noProof/>
                 <w:webHidden/>
               </w:rPr>
@@ -1730,19 +1738,25 @@
             </w:r>
             <w:r>
               <w:rPr>
+                <w:b w:val="0"/>
+                <w:bCs w:val="0"/>
                 <w:noProof/>
                 <w:webHidden/>
               </w:rPr>
-              <w:instrText xml:space="preserve"> PAGEREF _Toc180420835 \h </w:instrText>
-            </w:r>
-            <w:r>
-              <w:rPr>
+              <w:instrText xml:space="preserve"> PAGEREF _Toc180616448 \h </w:instrText>
+            </w:r>
+            <w:r>
+              <w:rPr>
+                <w:b w:val="0"/>
+                <w:bCs w:val="0"/>
                 <w:noProof/>
                 <w:webHidden/>
               </w:rPr>
             </w:r>
             <w:r>
               <w:rPr>
+                <w:b w:val="0"/>
+                <w:bCs w:val="0"/>
                 <w:noProof/>
                 <w:webHidden/>
               </w:rPr>
@@ -1750,13 +1764,17 @@
             </w:r>
             <w:r>
               <w:rPr>
+                <w:b w:val="0"/>
+                <w:bCs w:val="0"/>
                 <w:noProof/>
                 <w:webHidden/>
               </w:rPr>
-              <w:t>2</w:t>
-            </w:r>
-            <w:r>
-              <w:rPr>
+              <w:t>1</w:t>
+            </w:r>
+            <w:r>
+              <w:rPr>
+                <w:b w:val="0"/>
+                <w:bCs w:val="0"/>
                 <w:noProof/>
                 <w:webHidden/>
               </w:rPr>
@@ -1767,41 +1785,57 @@
         <w:p>
           <w:pPr>
             <w:pStyle w:val="TM1"/>
+            <w:tabs>
+              <w:tab w:val="left" w:pos="440"/>
+              <w:tab w:val="right" w:leader="dot" w:pos="9350"/>
+            </w:tabs>
             <w:rPr>
+              <w:rFonts w:cstheme="minorBidi"/>
+              <w:b w:val="0"/>
+              <w:bCs w:val="0"/>
+              <w:caps w:val="0"/>
               <w:noProof/>
               <w:sz w:val="24"/>
               <w:szCs w:val="24"/>
-              <w:lang w:val="fr-BE" w:eastAsia="fr-BE"/>
+              <w:lang w:val="fr-BE" w:eastAsia="fr-FR"/>
             </w:rPr>
           </w:pPr>
-          <w:hyperlink w:anchor="_Toc180420836" w:history="1">
+          <w:hyperlink w:anchor="_Toc180616449" w:history="1">
             <w:r>
               <w:rPr>
                 <w:rStyle w:val="Lienhypertexte"/>
+                <w:b w:val="0"/>
+                <w:bCs w:val="0"/>
                 <w:noProof/>
-                <w:lang w:val="fr-BE"/>
-              </w:rPr>
-              <w:t>2.</w:t>
-            </w:r>
-            <w:r>
-              <w:rPr>
+              </w:rPr>
+              <w:t>1.</w:t>
+            </w:r>
+            <w:r>
+              <w:rPr>
+                <w:rFonts w:cstheme="minorBidi"/>
+                <w:b w:val="0"/>
+                <w:bCs w:val="0"/>
+                <w:caps w:val="0"/>
                 <w:noProof/>
                 <w:sz w:val="24"/>
                 <w:szCs w:val="24"/>
-                <w:lang w:val="fr-BE" w:eastAsia="fr-BE"/>
+                <w:lang w:val="fr-BE" w:eastAsia="fr-FR"/>
               </w:rPr>
               <w:tab/>
             </w:r>
             <w:r>
               <w:rPr>
                 <w:rStyle w:val="Lienhypertexte"/>
+                <w:b w:val="0"/>
+                <w:bCs w:val="0"/>
                 <w:noProof/>
-                <w:lang w:val="fr-BE"/>
-              </w:rPr>
-              <w:t>Projet</w:t>
-            </w:r>
-            <w:r>
-              <w:rPr>
+              </w:rPr>
+              <w:t>Introduction</w:t>
+            </w:r>
+            <w:r>
+              <w:rPr>
+                <w:b w:val="0"/>
+                <w:bCs w:val="0"/>
                 <w:noProof/>
                 <w:webHidden/>
               </w:rPr>
@@ -1809,6 +1843,8 @@
             </w:r>
             <w:r>
               <w:rPr>
+                <w:b w:val="0"/>
+                <w:bCs w:val="0"/>
                 <w:noProof/>
                 <w:webHidden/>
               </w:rPr>
@@ -1816,19 +1852,25 @@
             </w:r>
             <w:r>
               <w:rPr>
+                <w:b w:val="0"/>
+                <w:bCs w:val="0"/>
                 <w:noProof/>
                 <w:webHidden/>
               </w:rPr>
-              <w:instrText xml:space="preserve"> PAGEREF _Toc180420836 \h </w:instrText>
-            </w:r>
-            <w:r>
-              <w:rPr>
+              <w:instrText xml:space="preserve"> PAGEREF _Toc180616449 \h </w:instrText>
+            </w:r>
+            <w:r>
+              <w:rPr>
+                <w:b w:val="0"/>
+                <w:bCs w:val="0"/>
                 <w:noProof/>
                 <w:webHidden/>
               </w:rPr>
             </w:r>
             <w:r>
               <w:rPr>
+                <w:b w:val="0"/>
+                <w:bCs w:val="0"/>
                 <w:noProof/>
                 <w:webHidden/>
               </w:rPr>
@@ -1836,6 +1878,8 @@
             </w:r>
             <w:r>
               <w:rPr>
+                <w:b w:val="0"/>
+                <w:bCs w:val="0"/>
                 <w:noProof/>
                 <w:webHidden/>
               </w:rPr>
@@ -1843,6 +1887,8 @@
             </w:r>
             <w:r>
               <w:rPr>
+                <w:b w:val="0"/>
+                <w:bCs w:val="0"/>
                 <w:noProof/>
                 <w:webHidden/>
               </w:rPr>
@@ -1853,41 +1899,57 @@
         <w:p>
           <w:pPr>
             <w:pStyle w:val="TM1"/>
+            <w:tabs>
+              <w:tab w:val="left" w:pos="440"/>
+              <w:tab w:val="right" w:leader="dot" w:pos="9350"/>
+            </w:tabs>
             <w:rPr>
+              <w:rFonts w:cstheme="minorBidi"/>
+              <w:b w:val="0"/>
+              <w:bCs w:val="0"/>
+              <w:caps w:val="0"/>
               <w:noProof/>
               <w:sz w:val="24"/>
               <w:szCs w:val="24"/>
-              <w:lang w:val="fr-BE" w:eastAsia="fr-BE"/>
+              <w:lang w:val="fr-BE" w:eastAsia="fr-FR"/>
             </w:rPr>
           </w:pPr>
-          <w:hyperlink w:anchor="_Toc180420837" w:history="1">
+          <w:hyperlink w:anchor="_Toc180616450" w:history="1">
             <w:r>
               <w:rPr>
                 <w:rStyle w:val="Lienhypertexte"/>
+                <w:b w:val="0"/>
+                <w:bCs w:val="0"/>
                 <w:noProof/>
-                <w:lang w:val="fr-BE"/>
-              </w:rPr>
-              <w:t>3.</w:t>
-            </w:r>
-            <w:r>
-              <w:rPr>
+              </w:rPr>
+              <w:t>2.</w:t>
+            </w:r>
+            <w:r>
+              <w:rPr>
+                <w:rFonts w:cstheme="minorBidi"/>
+                <w:b w:val="0"/>
+                <w:bCs w:val="0"/>
+                <w:caps w:val="0"/>
                 <w:noProof/>
                 <w:sz w:val="24"/>
                 <w:szCs w:val="24"/>
-                <w:lang w:val="fr-BE" w:eastAsia="fr-BE"/>
+                <w:lang w:val="fr-BE" w:eastAsia="fr-FR"/>
               </w:rPr>
               <w:tab/>
             </w:r>
             <w:r>
               <w:rPr>
                 <w:rStyle w:val="Lienhypertexte"/>
+                <w:b w:val="0"/>
+                <w:bCs w:val="0"/>
                 <w:noProof/>
-                <w:lang w:val="fr-BE"/>
-              </w:rPr>
-              <w:t>Fonctionnalités</w:t>
-            </w:r>
-            <w:r>
-              <w:rPr>
+              </w:rPr>
+              <w:t>Projet</w:t>
+            </w:r>
+            <w:r>
+              <w:rPr>
+                <w:b w:val="0"/>
+                <w:bCs w:val="0"/>
                 <w:noProof/>
                 <w:webHidden/>
               </w:rPr>
@@ -1895,6 +1957,8 @@
             </w:r>
             <w:r>
               <w:rPr>
+                <w:b w:val="0"/>
+                <w:bCs w:val="0"/>
                 <w:noProof/>
                 <w:webHidden/>
               </w:rPr>
@@ -1902,19 +1966,25 @@
             </w:r>
             <w:r>
               <w:rPr>
+                <w:b w:val="0"/>
+                <w:bCs w:val="0"/>
                 <w:noProof/>
                 <w:webHidden/>
               </w:rPr>
-              <w:instrText xml:space="preserve"> PAGEREF _Toc180420837 \h </w:instrText>
-            </w:r>
-            <w:r>
-              <w:rPr>
+              <w:instrText xml:space="preserve"> PAGEREF _Toc180616450 \h </w:instrText>
+            </w:r>
+            <w:r>
+              <w:rPr>
+                <w:b w:val="0"/>
+                <w:bCs w:val="0"/>
                 <w:noProof/>
                 <w:webHidden/>
               </w:rPr>
             </w:r>
             <w:r>
               <w:rPr>
+                <w:b w:val="0"/>
+                <w:bCs w:val="0"/>
                 <w:noProof/>
                 <w:webHidden/>
               </w:rPr>
@@ -1922,13 +1992,17 @@
             </w:r>
             <w:r>
               <w:rPr>
+                <w:b w:val="0"/>
+                <w:bCs w:val="0"/>
                 <w:noProof/>
                 <w:webHidden/>
               </w:rPr>
-              <w:t>3</w:t>
-            </w:r>
-            <w:r>
-              <w:rPr>
+              <w:t>2</w:t>
+            </w:r>
+            <w:r>
+              <w:rPr>
+                <w:b w:val="0"/>
+                <w:bCs w:val="0"/>
                 <w:noProof/>
                 <w:webHidden/>
               </w:rPr>
@@ -1939,38 +2013,158 @@
         <w:p>
           <w:pPr>
             <w:pStyle w:val="TM1"/>
+            <w:tabs>
+              <w:tab w:val="left" w:pos="440"/>
+              <w:tab w:val="right" w:leader="dot" w:pos="9350"/>
+            </w:tabs>
             <w:rPr>
+              <w:rFonts w:cstheme="minorBidi"/>
+              <w:b w:val="0"/>
+              <w:bCs w:val="0"/>
+              <w:caps w:val="0"/>
               <w:noProof/>
               <w:sz w:val="24"/>
               <w:szCs w:val="24"/>
-              <w:lang w:val="fr-BE" w:eastAsia="fr-BE"/>
+              <w:lang w:val="fr-BE" w:eastAsia="fr-FR"/>
             </w:rPr>
           </w:pPr>
-          <w:hyperlink w:anchor="_Toc180420838" w:history="1">
+          <w:hyperlink w:anchor="_Toc180616451" w:history="1">
             <w:r>
               <w:rPr>
                 <w:rStyle w:val="Lienhypertexte"/>
+                <w:b w:val="0"/>
+                <w:bCs w:val="0"/>
                 <w:noProof/>
-                <w:lang w:val="fr-BE"/>
-              </w:rPr>
-              <w:t>3.1.</w:t>
-            </w:r>
-            <w:r>
-              <w:rPr>
+              </w:rPr>
+              <w:t>3.</w:t>
+            </w:r>
+            <w:r>
+              <w:rPr>
+                <w:rFonts w:cstheme="minorBidi"/>
+                <w:b w:val="0"/>
+                <w:bCs w:val="0"/>
+                <w:caps w:val="0"/>
                 <w:noProof/>
                 <w:sz w:val="24"/>
                 <w:szCs w:val="24"/>
-                <w:lang w:val="fr-BE" w:eastAsia="fr-BE"/>
+                <w:lang w:val="fr-BE" w:eastAsia="fr-FR"/>
               </w:rPr>
               <w:tab/>
             </w:r>
+            <w:r>
+              <w:rPr>
+                <w:rStyle w:val="Lienhypertexte"/>
+                <w:b w:val="0"/>
+                <w:bCs w:val="0"/>
+                <w:noProof/>
+              </w:rPr>
+              <w:t>Fonctionnalités</w:t>
+            </w:r>
+            <w:r>
+              <w:rPr>
+                <w:b w:val="0"/>
+                <w:bCs w:val="0"/>
+                <w:noProof/>
+                <w:webHidden/>
+              </w:rPr>
+              <w:tab/>
+            </w:r>
+            <w:r>
+              <w:rPr>
+                <w:b w:val="0"/>
+                <w:bCs w:val="0"/>
+                <w:noProof/>
+                <w:webHidden/>
+              </w:rPr>
+              <w:fldChar w:fldCharType="begin"/>
+            </w:r>
+            <w:r>
+              <w:rPr>
+                <w:b w:val="0"/>
+                <w:bCs w:val="0"/>
+                <w:noProof/>
+                <w:webHidden/>
+              </w:rPr>
+              <w:instrText xml:space="preserve"> PAGEREF _Toc180616451 \h </w:instrText>
+            </w:r>
+            <w:r>
+              <w:rPr>
+                <w:b w:val="0"/>
+                <w:bCs w:val="0"/>
+                <w:noProof/>
+                <w:webHidden/>
+              </w:rPr>
+            </w:r>
+            <w:r>
+              <w:rPr>
+                <w:b w:val="0"/>
+                <w:bCs w:val="0"/>
+                <w:noProof/>
+                <w:webHidden/>
+              </w:rPr>
+              <w:fldChar w:fldCharType="separate"/>
+            </w:r>
+            <w:r>
+              <w:rPr>
+                <w:b w:val="0"/>
+                <w:bCs w:val="0"/>
+                <w:noProof/>
+                <w:webHidden/>
+              </w:rPr>
+              <w:t>3</w:t>
+            </w:r>
+            <w:r>
+              <w:rPr>
+                <w:b w:val="0"/>
+                <w:bCs w:val="0"/>
+                <w:noProof/>
+                <w:webHidden/>
+              </w:rPr>
+              <w:fldChar w:fldCharType="end"/>
+            </w:r>
+          </w:hyperlink>
+        </w:p>
+        <w:p>
+          <w:pPr>
+            <w:pStyle w:val="TM2"/>
+            <w:tabs>
+              <w:tab w:val="left" w:pos="880"/>
+              <w:tab w:val="right" w:leader="dot" w:pos="9350"/>
+            </w:tabs>
+            <w:rPr>
+              <w:rFonts w:cstheme="minorBidi"/>
+              <w:smallCaps w:val="0"/>
+              <w:noProof/>
+              <w:sz w:val="24"/>
+              <w:szCs w:val="24"/>
+              <w:lang w:val="fr-BE" w:eastAsia="fr-FR"/>
+            </w:rPr>
+          </w:pPr>
+          <w:hyperlink w:anchor="_Toc180616452" w:history="1">
             <w:r>
               <w:rPr>
                 <w:rStyle w:val="Lienhypertexte"/>
                 <w:noProof/>
-                <w:lang w:val="fr-BE"/>
-              </w:rPr>
-              <w:t>Base</w:t>
+              </w:rPr>
+              <w:t>3.1.</w:t>
+            </w:r>
+            <w:r>
+              <w:rPr>
+                <w:rFonts w:cstheme="minorBidi"/>
+                <w:smallCaps w:val="0"/>
+                <w:noProof/>
+                <w:sz w:val="24"/>
+                <w:szCs w:val="24"/>
+                <w:lang w:val="fr-BE" w:eastAsia="fr-FR"/>
+              </w:rPr>
+              <w:tab/>
+            </w:r>
+            <w:r>
+              <w:rPr>
+                <w:rStyle w:val="Lienhypertexte"/>
+                <w:noProof/>
+              </w:rPr>
+              <w:t>Bases</w:t>
             </w:r>
             <w:r>
               <w:rPr>
@@ -1991,7 +2185,99 @@
                 <w:noProof/>
                 <w:webHidden/>
               </w:rPr>
-              <w:instrText xml:space="preserve"> PAGEREF _Toc180420838 \h </w:instrText>
+              <w:instrText xml:space="preserve"> PAGEREF _Toc180616452 \h </w:instrText>
+            </w:r>
+            <w:r>
+              <w:rPr>
+                <w:noProof/>
+                <w:webHidden/>
+              </w:rPr>
+            </w:r>
+            <w:r>
+              <w:rPr>
+                <w:noProof/>
+                <w:webHidden/>
+              </w:rPr>
+              <w:fldChar w:fldCharType="separate"/>
+            </w:r>
+            <w:r>
+              <w:rPr>
+                <w:noProof/>
+                <w:webHidden/>
+              </w:rPr>
+              <w:t>3</w:t>
+            </w:r>
+            <w:r>
+              <w:rPr>
+                <w:noProof/>
+                <w:webHidden/>
+              </w:rPr>
+              <w:fldChar w:fldCharType="end"/>
+            </w:r>
+          </w:hyperlink>
+        </w:p>
+        <w:p>
+          <w:pPr>
+            <w:pStyle w:val="TM2"/>
+            <w:tabs>
+              <w:tab w:val="left" w:pos="880"/>
+              <w:tab w:val="right" w:leader="dot" w:pos="9350"/>
+            </w:tabs>
+            <w:rPr>
+              <w:rFonts w:cstheme="minorBidi"/>
+              <w:smallCaps w:val="0"/>
+              <w:noProof/>
+              <w:sz w:val="24"/>
+              <w:szCs w:val="24"/>
+              <w:lang w:val="fr-BE" w:eastAsia="fr-FR"/>
+            </w:rPr>
+          </w:pPr>
+          <w:hyperlink w:anchor="_Toc180616453" w:history="1">
+            <w:r>
+              <w:rPr>
+                <w:rStyle w:val="Lienhypertexte"/>
+                <w:noProof/>
+              </w:rPr>
+              <w:t>3.1.</w:t>
+            </w:r>
+            <w:r>
+              <w:rPr>
+                <w:rFonts w:cstheme="minorBidi"/>
+                <w:smallCaps w:val="0"/>
+                <w:noProof/>
+                <w:sz w:val="24"/>
+                <w:szCs w:val="24"/>
+                <w:lang w:val="fr-BE" w:eastAsia="fr-FR"/>
+              </w:rPr>
+              <w:tab/>
+            </w:r>
+            <w:r>
+              <w:rPr>
+                <w:rStyle w:val="Lienhypertexte"/>
+                <w:noProof/>
+              </w:rPr>
+              <w:t>Avancées</w:t>
+            </w:r>
+            <w:r>
+              <w:rPr>
+                <w:noProof/>
+                <w:webHidden/>
+              </w:rPr>
+              <w:tab/>
+            </w:r>
+            <w:r>
+              <w:rPr>
+                <w:noProof/>
+                <w:webHidden/>
+              </w:rPr>
+              <w:fldChar w:fldCharType="begin"/>
+            </w:r>
+            <w:r>
+              <w:rPr>
+                <w:noProof/>
+                <w:webHidden/>
+              </w:rPr>
+              <w:instrText xml:space="preserve"> PAGEREF _Toc180616453 \h </w:instrText>
             </w:r>
             <w:r>
               <w:rPr>
@@ -2025,41 +2311,57 @@
         <w:p>
           <w:pPr>
             <w:pStyle w:val="TM1"/>
+            <w:tabs>
+              <w:tab w:val="left" w:pos="440"/>
+              <w:tab w:val="right" w:leader="dot" w:pos="9350"/>
+            </w:tabs>
             <w:rPr>
+              <w:rFonts w:cstheme="minorBidi"/>
+              <w:b w:val="0"/>
+              <w:bCs w:val="0"/>
+              <w:caps w:val="0"/>
               <w:noProof/>
               <w:sz w:val="24"/>
               <w:szCs w:val="24"/>
-              <w:lang w:val="fr-BE" w:eastAsia="fr-BE"/>
+              <w:lang w:val="fr-BE" w:eastAsia="fr-FR"/>
             </w:rPr>
           </w:pPr>
-          <w:hyperlink w:anchor="_Toc180420839" w:history="1">
+          <w:hyperlink w:anchor="_Toc180616454" w:history="1">
             <w:r>
               <w:rPr>
                 <w:rStyle w:val="Lienhypertexte"/>
+                <w:b w:val="0"/>
+                <w:bCs w:val="0"/>
                 <w:noProof/>
-                <w:lang w:val="fr-BE"/>
-              </w:rPr>
-              <w:t>3.2.</w:t>
-            </w:r>
-            <w:r>
-              <w:rPr>
+              </w:rPr>
+              <w:t>4.</w:t>
+            </w:r>
+            <w:r>
+              <w:rPr>
+                <w:rFonts w:cstheme="minorBidi"/>
+                <w:b w:val="0"/>
+                <w:bCs w:val="0"/>
+                <w:caps w:val="0"/>
                 <w:noProof/>
                 <w:sz w:val="24"/>
                 <w:szCs w:val="24"/>
-                <w:lang w:val="fr-BE" w:eastAsia="fr-BE"/>
+                <w:lang w:val="fr-BE" w:eastAsia="fr-FR"/>
               </w:rPr>
               <w:tab/>
             </w:r>
             <w:r>
               <w:rPr>
                 <w:rStyle w:val="Lienhypertexte"/>
+                <w:b w:val="0"/>
+                <w:bCs w:val="0"/>
                 <w:noProof/>
-                <w:lang w:val="fr-BE"/>
-              </w:rPr>
-              <w:t>Avancée</w:t>
-            </w:r>
-            <w:r>
-              <w:rPr>
+              </w:rPr>
+              <w:t>Schéma de base de données</w:t>
+            </w:r>
+            <w:r>
+              <w:rPr>
+                <w:b w:val="0"/>
+                <w:bCs w:val="0"/>
                 <w:noProof/>
                 <w:webHidden/>
               </w:rPr>
@@ -2067,6 +2369,8 @@
             </w:r>
             <w:r>
               <w:rPr>
+                <w:b w:val="0"/>
+                <w:bCs w:val="0"/>
                 <w:noProof/>
                 <w:webHidden/>
               </w:rPr>
@@ -2074,19 +2378,25 @@
             </w:r>
             <w:r>
               <w:rPr>
+                <w:b w:val="0"/>
+                <w:bCs w:val="0"/>
                 <w:noProof/>
                 <w:webHidden/>
               </w:rPr>
-              <w:instrText xml:space="preserve"> PAGEREF _Toc180420839 \h </w:instrText>
-            </w:r>
-            <w:r>
-              <w:rPr>
+              <w:instrText xml:space="preserve"> PAGEREF _Toc180616454 \h </w:instrText>
+            </w:r>
+            <w:r>
+              <w:rPr>
+                <w:b w:val="0"/>
+                <w:bCs w:val="0"/>
                 <w:noProof/>
                 <w:webHidden/>
               </w:rPr>
             </w:r>
             <w:r>
               <w:rPr>
+                <w:b w:val="0"/>
+                <w:bCs w:val="0"/>
                 <w:noProof/>
                 <w:webHidden/>
               </w:rPr>
@@ -2094,13 +2404,17 @@
             </w:r>
             <w:r>
               <w:rPr>
+                <w:b w:val="0"/>
+                <w:bCs w:val="0"/>
                 <w:noProof/>
                 <w:webHidden/>
               </w:rPr>
-              <w:t>3</w:t>
-            </w:r>
-            <w:r>
-              <w:rPr>
+              <w:t>4</w:t>
+            </w:r>
+            <w:r>
+              <w:rPr>
+                <w:b w:val="0"/>
+                <w:bCs w:val="0"/>
                 <w:noProof/>
                 <w:webHidden/>
               </w:rPr>
@@ -2111,41 +2425,57 @@
         <w:p>
           <w:pPr>
             <w:pStyle w:val="TM1"/>
+            <w:tabs>
+              <w:tab w:val="left" w:pos="440"/>
+              <w:tab w:val="right" w:leader="dot" w:pos="9350"/>
+            </w:tabs>
             <w:rPr>
+              <w:rFonts w:cstheme="minorBidi"/>
+              <w:b w:val="0"/>
+              <w:bCs w:val="0"/>
+              <w:caps w:val="0"/>
               <w:noProof/>
               <w:sz w:val="24"/>
               <w:szCs w:val="24"/>
-              <w:lang w:val="fr-BE" w:eastAsia="fr-BE"/>
+              <w:lang w:val="fr-BE" w:eastAsia="fr-FR"/>
             </w:rPr>
           </w:pPr>
-          <w:hyperlink w:anchor="_Toc180420840" w:history="1">
+          <w:hyperlink w:anchor="_Toc180616455" w:history="1">
             <w:r>
               <w:rPr>
                 <w:rStyle w:val="Lienhypertexte"/>
+                <w:b w:val="0"/>
+                <w:bCs w:val="0"/>
                 <w:noProof/>
-                <w:lang w:val="fr-BE"/>
-              </w:rPr>
-              <w:t>4.</w:t>
-            </w:r>
-            <w:r>
-              <w:rPr>
+              </w:rPr>
+              <w:t>5.</w:t>
+            </w:r>
+            <w:r>
+              <w:rPr>
+                <w:rFonts w:cstheme="minorBidi"/>
+                <w:b w:val="0"/>
+                <w:bCs w:val="0"/>
+                <w:caps w:val="0"/>
                 <w:noProof/>
                 <w:sz w:val="24"/>
                 <w:szCs w:val="24"/>
-                <w:lang w:val="fr-BE" w:eastAsia="fr-BE"/>
+                <w:lang w:val="fr-BE" w:eastAsia="fr-FR"/>
               </w:rPr>
               <w:tab/>
             </w:r>
             <w:r>
               <w:rPr>
                 <w:rStyle w:val="Lienhypertexte"/>
+                <w:b w:val="0"/>
+                <w:bCs w:val="0"/>
                 <w:noProof/>
-                <w:lang w:val="fr-BE"/>
-              </w:rPr>
-              <w:t>Schéma de base de données</w:t>
-            </w:r>
-            <w:r>
-              <w:rPr>
+              </w:rPr>
+              <w:t>Mockups du back office</w:t>
+            </w:r>
+            <w:r>
+              <w:rPr>
+                <w:b w:val="0"/>
+                <w:bCs w:val="0"/>
                 <w:noProof/>
                 <w:webHidden/>
               </w:rPr>
@@ -2153,6 +2483,8 @@
             </w:r>
             <w:r>
               <w:rPr>
+                <w:b w:val="0"/>
+                <w:bCs w:val="0"/>
                 <w:noProof/>
                 <w:webHidden/>
               </w:rPr>
@@ -2160,19 +2492,25 @@
             </w:r>
             <w:r>
               <w:rPr>
+                <w:b w:val="0"/>
+                <w:bCs w:val="0"/>
                 <w:noProof/>
                 <w:webHidden/>
               </w:rPr>
-              <w:instrText xml:space="preserve"> PAGEREF _Toc180420840 \h </w:instrText>
-            </w:r>
-            <w:r>
-              <w:rPr>
+              <w:instrText xml:space="preserve"> PAGEREF _Toc180616455 \h </w:instrText>
+            </w:r>
+            <w:r>
+              <w:rPr>
+                <w:b w:val="0"/>
+                <w:bCs w:val="0"/>
                 <w:noProof/>
                 <w:webHidden/>
               </w:rPr>
             </w:r>
             <w:r>
               <w:rPr>
+                <w:b w:val="0"/>
+                <w:bCs w:val="0"/>
                 <w:noProof/>
                 <w:webHidden/>
               </w:rPr>
@@ -2180,13 +2518,17 @@
             </w:r>
             <w:r>
               <w:rPr>
+                <w:b w:val="0"/>
+                <w:bCs w:val="0"/>
                 <w:noProof/>
                 <w:webHidden/>
               </w:rPr>
-              <w:t>3</w:t>
-            </w:r>
-            <w:r>
-              <w:rPr>
+              <w:t>5</w:t>
+            </w:r>
+            <w:r>
+              <w:rPr>
+                <w:b w:val="0"/>
+                <w:bCs w:val="0"/>
                 <w:noProof/>
                 <w:webHidden/>
               </w:rPr>
@@ -2197,41 +2539,57 @@
         <w:p>
           <w:pPr>
             <w:pStyle w:val="TM1"/>
+            <w:tabs>
+              <w:tab w:val="left" w:pos="440"/>
+              <w:tab w:val="right" w:leader="dot" w:pos="9350"/>
+            </w:tabs>
             <w:rPr>
+              <w:rFonts w:cstheme="minorBidi"/>
+              <w:b w:val="0"/>
+              <w:bCs w:val="0"/>
+              <w:caps w:val="0"/>
               <w:noProof/>
               <w:sz w:val="24"/>
               <w:szCs w:val="24"/>
-              <w:lang w:val="fr-BE" w:eastAsia="fr-BE"/>
+              <w:lang w:val="fr-BE" w:eastAsia="fr-FR"/>
             </w:rPr>
           </w:pPr>
-          <w:hyperlink w:anchor="_Toc180420841" w:history="1">
+          <w:hyperlink w:anchor="_Toc180616456" w:history="1">
             <w:r>
               <w:rPr>
                 <w:rStyle w:val="Lienhypertexte"/>
+                <w:b w:val="0"/>
+                <w:bCs w:val="0"/>
                 <w:noProof/>
-                <w:lang w:val="fr-BE"/>
-              </w:rPr>
-              <w:t>5.</w:t>
-            </w:r>
-            <w:r>
-              <w:rPr>
+              </w:rPr>
+              <w:t>6.</w:t>
+            </w:r>
+            <w:r>
+              <w:rPr>
+                <w:rFonts w:cstheme="minorBidi"/>
+                <w:b w:val="0"/>
+                <w:bCs w:val="0"/>
+                <w:caps w:val="0"/>
                 <w:noProof/>
                 <w:sz w:val="24"/>
                 <w:szCs w:val="24"/>
-                <w:lang w:val="fr-BE" w:eastAsia="fr-BE"/>
+                <w:lang w:val="fr-BE" w:eastAsia="fr-FR"/>
               </w:rPr>
               <w:tab/>
             </w:r>
             <w:r>
               <w:rPr>
                 <w:rStyle w:val="Lienhypertexte"/>
+                <w:b w:val="0"/>
+                <w:bCs w:val="0"/>
                 <w:noProof/>
-                <w:lang w:val="fr-BE"/>
-              </w:rPr>
-              <w:t>Mockups du back office</w:t>
-            </w:r>
-            <w:r>
-              <w:rPr>
+              </w:rPr>
+              <w:t>Maquettes</w:t>
+            </w:r>
+            <w:r>
+              <w:rPr>
+                <w:b w:val="0"/>
+                <w:bCs w:val="0"/>
                 <w:noProof/>
                 <w:webHidden/>
               </w:rPr>
@@ -2239,6 +2597,8 @@
             </w:r>
             <w:r>
               <w:rPr>
+                <w:b w:val="0"/>
+                <w:bCs w:val="0"/>
                 <w:noProof/>
                 <w:webHidden/>
               </w:rPr>
@@ -2246,19 +2606,25 @@
             </w:r>
             <w:r>
               <w:rPr>
+                <w:b w:val="0"/>
+                <w:bCs w:val="0"/>
                 <w:noProof/>
                 <w:webHidden/>
               </w:rPr>
-              <w:instrText xml:space="preserve"> PAGEREF _Toc180420841 \h </w:instrText>
-            </w:r>
-            <w:r>
-              <w:rPr>
+              <w:instrText xml:space="preserve"> PAGEREF _Toc180616456 \h </w:instrText>
+            </w:r>
+            <w:r>
+              <w:rPr>
+                <w:b w:val="0"/>
+                <w:bCs w:val="0"/>
                 <w:noProof/>
                 <w:webHidden/>
               </w:rPr>
             </w:r>
             <w:r>
               <w:rPr>
+                <w:b w:val="0"/>
+                <w:bCs w:val="0"/>
                 <w:noProof/>
                 <w:webHidden/>
               </w:rPr>
@@ -2266,99 +2632,17 @@
             </w:r>
             <w:r>
               <w:rPr>
+                <w:b w:val="0"/>
+                <w:bCs w:val="0"/>
                 <w:noProof/>
                 <w:webHidden/>
               </w:rPr>
-              <w:t>3</w:t>
-            </w:r>
-            <w:r>
-              <w:rPr>
-                <w:noProof/>
-                <w:webHidden/>
-              </w:rPr>
-              <w:fldChar w:fldCharType="end"/>
-            </w:r>
-          </w:hyperlink>
-        </w:p>
-        <w:p>
-          <w:pPr>
-            <w:pStyle w:val="TM1"/>
-            <w:rPr>
-              <w:noProof/>
-              <w:sz w:val="24"/>
-              <w:szCs w:val="24"/>
-              <w:lang w:val="fr-BE" w:eastAsia="fr-BE"/>
-            </w:rPr>
-          </w:pPr>
-          <w:hyperlink w:anchor="_Toc180420842" w:history="1">
-            <w:r>
-              <w:rPr>
-                <w:rStyle w:val="Lienhypertexte"/>
-                <w:noProof/>
-                <w:lang w:val="fr-BE"/>
-              </w:rPr>
-              <w:t>6.</w:t>
-            </w:r>
-            <w:r>
-              <w:rPr>
-                <w:noProof/>
-                <w:sz w:val="24"/>
-                <w:szCs w:val="24"/>
-                <w:lang w:val="fr-BE" w:eastAsia="fr-BE"/>
-              </w:rPr>
-              <w:tab/>
-            </w:r>
-            <w:r>
-              <w:rPr>
-                <w:rStyle w:val="Lienhypertexte"/>
-                <w:noProof/>
-                <w:lang w:val="fr-BE"/>
-              </w:rPr>
-              <w:t>Maquettes</w:t>
-            </w:r>
-            <w:r>
-              <w:rPr>
-                <w:noProof/>
-                <w:webHidden/>
-              </w:rPr>
-              <w:tab/>
-            </w:r>
-            <w:r>
-              <w:rPr>
-                <w:noProof/>
-                <w:webHidden/>
-              </w:rPr>
-              <w:fldChar w:fldCharType="begin"/>
-            </w:r>
-            <w:r>
-              <w:rPr>
-                <w:noProof/>
-                <w:webHidden/>
-              </w:rPr>
-              <w:instrText xml:space="preserve"> PAGEREF _Toc180420842 \h </w:instrText>
-            </w:r>
-            <w:r>
-              <w:rPr>
-                <w:noProof/>
-                <w:webHidden/>
-              </w:rPr>
-            </w:r>
-            <w:r>
-              <w:rPr>
-                <w:noProof/>
-                <w:webHidden/>
-              </w:rPr>
-              <w:fldChar w:fldCharType="separate"/>
-            </w:r>
-            <w:r>
-              <w:rPr>
-                <w:noProof/>
-                <w:webHidden/>
-              </w:rPr>
-              <w:t>3</w:t>
-            </w:r>
-            <w:r>
-              <w:rPr>
+              <w:t>6</w:t>
+            </w:r>
+            <w:r>
+              <w:rPr>
+                <w:b w:val="0"/>
+                <w:bCs w:val="0"/>
                 <w:noProof/>
                 <w:webHidden/>
               </w:rPr>
@@ -2369,9 +2653,7 @@
         <w:p>
           <w:r>
             <w:rPr>
-              <w:b/>
-              <w:bCs/>
-              <w:lang w:val="fr-FR"/>
+              <w:noProof/>
             </w:rPr>
             <w:fldChar w:fldCharType="end"/>
           </w:r>
@@ -2400,23 +2682,13 @@
     <w:p>
       <w:pPr>
         <w:pStyle w:val="Titre1"/>
-        <w:numPr>
-          <w:ilvl w:val="0"/>
-          <w:numId w:val="1"/>
-        </w:numPr>
-        <w:rPr>
-          <w:lang w:val="fr-BE"/>
-        </w:rPr>
-      </w:pPr>
-      <w:bookmarkStart w:id="0" w:name="_Toc180420835"/>
-      <w:r>
-        <w:rPr>
-          <w:lang w:val="fr-BE"/>
-        </w:rPr>
+      </w:pPr>
+      <w:bookmarkStart w:id="1" w:name="_Toc180616449"/>
+      <w:r>
         <w:lastRenderedPageBreak/>
         <w:t>Introduction</w:t>
       </w:r>
-      <w:bookmarkEnd w:id="0"/>
+      <w:bookmarkEnd w:id="1"/>
     </w:p>
     <w:p>
       <w:pPr>
@@ -2529,7 +2801,6 @@
           <w:lang w:val="fr-BE"/>
         </w:rPr>
       </w:pPr>
-      <w:commentRangeStart w:id="1"/>
       <w:r>
         <w:rPr>
           <w:lang w:val="fr-BE"/>
@@ -2571,13 +2842,6 @@
           <w:lang w:val="fr-BE"/>
         </w:rPr>
         <w:t xml:space="preserve"> 12 des ODD), permettant également à cette mobilité de s’étendre dans diverses villes ne l’ayant pas encore acquise (en lien avec le point 11 des ODD).</w:t>
-      </w:r>
-      <w:commentRangeEnd w:id="1"/>
-      <w:r>
-        <w:rPr>
-          <w:rStyle w:val="Marquedecommentaire"/>
-        </w:rPr>
-        <w:commentReference w:id="1"/>
       </w:r>
     </w:p>
     <w:p>
@@ -2590,19 +2854,9 @@
     <w:p>
       <w:pPr>
         <w:pStyle w:val="Titre1"/>
-        <w:numPr>
-          <w:ilvl w:val="0"/>
-          <w:numId w:val="1"/>
-        </w:numPr>
-        <w:rPr>
-          <w:lang w:val="fr-BE"/>
-        </w:rPr>
-      </w:pPr>
-      <w:bookmarkStart w:id="2" w:name="_Toc180420836"/>
-      <w:r>
-        <w:rPr>
-          <w:lang w:val="fr-BE"/>
-        </w:rPr>
+      </w:pPr>
+      <w:bookmarkStart w:id="2" w:name="_Toc180616450"/>
+      <w:r>
         <w:t>Projet</w:t>
       </w:r>
       <w:bookmarkEnd w:id="2"/>
@@ -2794,19 +3048,9 @@
     <w:p>
       <w:pPr>
         <w:pStyle w:val="Titre1"/>
-        <w:numPr>
-          <w:ilvl w:val="0"/>
-          <w:numId w:val="1"/>
-        </w:numPr>
-        <w:rPr>
-          <w:lang w:val="fr-BE"/>
-        </w:rPr>
-      </w:pPr>
-      <w:bookmarkStart w:id="3" w:name="_Toc180420837"/>
-      <w:r>
-        <w:rPr>
-          <w:lang w:val="fr-BE"/>
-        </w:rPr>
+      </w:pPr>
+      <w:bookmarkStart w:id="3" w:name="_Toc180616451"/>
+      <w:r>
         <w:lastRenderedPageBreak/>
         <w:t>Fonctionnalités</w:t>
       </w:r>
@@ -2814,29 +3058,20 @@
     </w:p>
     <w:p>
       <w:pPr>
-        <w:pStyle w:val="Titre1"/>
+        <w:pStyle w:val="Titre2"/>
         <w:numPr>
           <w:ilvl w:val="1"/>
           <w:numId w:val="1"/>
         </w:numPr>
-        <w:rPr>
-          <w:lang w:val="fr-BE"/>
-        </w:rPr>
-      </w:pPr>
-      <w:bookmarkStart w:id="4" w:name="_Toc180420838"/>
-      <w:r>
-        <w:rPr>
-          <w:lang w:val="fr-BE"/>
-        </w:rPr>
+      </w:pPr>
+      <w:bookmarkStart w:id="4" w:name="_Toc180616452"/>
+      <w:r>
         <w:t>Base</w:t>
       </w:r>
+      <w:r>
+        <w:t>s</w:t>
+      </w:r>
       <w:bookmarkEnd w:id="4"/>
-      <w:r>
-        <w:rPr>
-          <w:lang w:val="fr-BE"/>
-        </w:rPr>
-        <w:t>s</w:t>
-      </w:r>
     </w:p>
     <w:p>
       <w:pPr>
@@ -3026,29 +3261,20 @@
     </w:p>
     <w:p>
       <w:pPr>
-        <w:pStyle w:val="Titre1"/>
+        <w:pStyle w:val="Titre2"/>
         <w:numPr>
           <w:ilvl w:val="1"/>
-          <w:numId w:val="1"/>
+          <w:numId w:val="32"/>
         </w:numPr>
-        <w:rPr>
-          <w:lang w:val="fr-BE"/>
-        </w:rPr>
-      </w:pPr>
-      <w:bookmarkStart w:id="6" w:name="_Toc180420839"/>
-      <w:r>
-        <w:rPr>
-          <w:lang w:val="fr-BE"/>
-        </w:rPr>
+      </w:pPr>
+      <w:bookmarkStart w:id="6" w:name="_Toc180616453"/>
+      <w:r>
         <w:t>Avancée</w:t>
       </w:r>
+      <w:r>
+        <w:t>s</w:t>
+      </w:r>
       <w:bookmarkEnd w:id="6"/>
-      <w:r>
-        <w:rPr>
-          <w:lang w:val="fr-BE"/>
-        </w:rPr>
-        <w:t>s</w:t>
-      </w:r>
     </w:p>
     <w:p>
       <w:pPr>
@@ -3129,34 +3355,26 @@
     <w:p>
       <w:pPr>
         <w:pStyle w:val="Titre1"/>
-        <w:numPr>
-          <w:ilvl w:val="0"/>
-          <w:numId w:val="1"/>
-        </w:numPr>
-        <w:rPr>
-          <w:lang w:val="fr-BE"/>
-        </w:rPr>
-      </w:pPr>
-      <w:bookmarkStart w:id="7" w:name="_Toc180420840"/>
+      </w:pPr>
+      <w:bookmarkStart w:id="7" w:name="_Toc180616454"/>
       <w:r>
         <w:rPr>
           <w:noProof/>
-          <w:lang w:val="fr-BE"/>
         </w:rPr>
         <w:lastRenderedPageBreak/>
         <w:drawing>
-          <wp:anchor distT="0" distB="0" distL="114300" distR="114300" simplePos="0" relativeHeight="251661312" behindDoc="0" locked="0" layoutInCell="1" allowOverlap="1" wp14:anchorId="4F07FE9B" wp14:editId="2B11C45F">
+          <wp:anchor distT="0" distB="0" distL="114300" distR="114300" simplePos="0" relativeHeight="251661312" behindDoc="0" locked="0" layoutInCell="1" allowOverlap="1" wp14:anchorId="0F4C8618" wp14:editId="6A490C8D">
             <wp:simplePos x="0" y="0"/>
             <wp:positionH relativeFrom="margin">
               <wp:align>center</wp:align>
             </wp:positionH>
             <wp:positionV relativeFrom="paragraph">
-              <wp:posOffset>435610</wp:posOffset>
+              <wp:posOffset>316230</wp:posOffset>
             </wp:positionV>
-            <wp:extent cx="4965065" cy="7575550"/>
-            <wp:effectExtent l="0" t="0" r="635" b="6350"/>
+            <wp:extent cx="5842000" cy="7408545"/>
+            <wp:effectExtent l="0" t="0" r="0" b="0"/>
             <wp:wrapTopAndBottom/>
-            <wp:docPr id="215465675" name="Image 5" descr="Une image contenant texte, capture d’écran, diagramme, conception&#10;&#10;Description générée automatiquement"/>
+            <wp:docPr id="1105630784" name="Image 5"/>
             <wp:cNvGraphicFramePr>
               <a:graphicFrameLocks xmlns:a="http://schemas.openxmlformats.org/drawingml/2006/main" noChangeAspect="1"/>
             </wp:cNvGraphicFramePr>
@@ -3164,7 +3382,306 @@
               <a:graphicData uri="http://schemas.openxmlformats.org/drawingml/2006/picture">
                 <pic:pic xmlns:pic="http://schemas.openxmlformats.org/drawingml/2006/picture">
                   <pic:nvPicPr>
-                    <pic:cNvPr id="215465675" name="Image 5" descr="Une image contenant texte, capture d’écran, diagramme, conception&#10;&#10;Description générée automatiquement"/>
+                    <pic:cNvPr id="1105630784" name="Image 5"/>
+                    <pic:cNvPicPr/>
+                  </pic:nvPicPr>
+                  <pic:blipFill>
+                    <a:blip r:embed="rId11" cstate="print">
+                      <a:extLst>
+                        <a:ext uri="{28A0092B-C50C-407E-A947-70E740481C1C}">
+                          <a14:useLocalDpi xmlns:a14="http://schemas.microsoft.com/office/drawing/2010/main" val="0"/>
+                        </a:ext>
+                      </a:extLst>
+                    </a:blip>
+                    <a:stretch>
+                      <a:fillRect/>
+                    </a:stretch>
+                  </pic:blipFill>
+                  <pic:spPr>
+                    <a:xfrm>
+                      <a:off x="0" y="0"/>
+                      <a:ext cx="5842000" cy="7408545"/>
+                    </a:xfrm>
+                    <a:prstGeom prst="rect">
+                      <a:avLst/>
+                    </a:prstGeom>
+                  </pic:spPr>
+                </pic:pic>
+              </a:graphicData>
+            </a:graphic>
+            <wp14:sizeRelH relativeFrom="page">
+              <wp14:pctWidth>0</wp14:pctWidth>
+            </wp14:sizeRelH>
+            <wp14:sizeRelV relativeFrom="page">
+              <wp14:pctHeight>0</wp14:pctHeight>
+            </wp14:sizeRelV>
+          </wp:anchor>
+        </w:drawing>
+      </w:r>
+      <w:r>
+        <w:t>Schéma de base de données</w:t>
+      </w:r>
+      <w:bookmarkEnd w:id="7"/>
+    </w:p>
+    <w:p>
+      <w:pPr>
+        <w:jc w:val="center"/>
+        <w:rPr>
+          <w:rStyle w:val="Accentuationlgre"/>
+          <w:lang w:val="fr-BE"/>
+        </w:rPr>
+      </w:pPr>
+    </w:p>
+    <w:p>
+      <w:pPr>
+        <w:pStyle w:val="Titre1"/>
+      </w:pPr>
+      <w:bookmarkStart w:id="8" w:name="_Toc180616455"/>
+      <w:proofErr w:type="spellStart"/>
+      <w:r>
+        <w:lastRenderedPageBreak/>
+        <w:t>Mockups</w:t>
+      </w:r>
+      <w:proofErr w:type="spellEnd"/>
+      <w:r>
+        <w:t xml:space="preserve"> du back office</w:t>
+      </w:r>
+      <w:bookmarkEnd w:id="8"/>
+    </w:p>
+    <w:p>
+      <w:pPr>
+        <w:rPr>
+          <w:lang w:val="fr-BE"/>
+        </w:rPr>
+      </w:pPr>
+    </w:p>
+    <w:p>
+      <w:pPr>
+        <w:rPr>
+          <w:lang w:val="fr-BE"/>
+        </w:rPr>
+      </w:pPr>
+    </w:p>
+    <w:p>
+      <w:pPr>
+        <w:rPr>
+          <w:lang w:val="fr-BE"/>
+        </w:rPr>
+      </w:pPr>
+    </w:p>
+    <w:p>
+      <w:pPr>
+        <w:jc w:val="left"/>
+        <w:rPr>
+          <w:lang w:val="fr-BE"/>
+        </w:rPr>
+      </w:pPr>
+      <w:r>
+        <w:rPr>
+          <w:lang w:val="fr-BE"/>
+        </w:rPr>
+        <w:br w:type="page"/>
+      </w:r>
+    </w:p>
+    <w:p>
+      <w:pPr>
+        <w:pStyle w:val="Titre1"/>
+      </w:pPr>
+      <w:bookmarkStart w:id="9" w:name="_Toc180616456"/>
+      <w:r>
+        <w:lastRenderedPageBreak/>
+        <w:drawing>
+          <wp:anchor distT="0" distB="0" distL="114300" distR="114300" simplePos="0" relativeHeight="251664384" behindDoc="0" locked="0" layoutInCell="1" allowOverlap="1" wp14:anchorId="21B0A26E" wp14:editId="1563654F">
+            <wp:simplePos x="0" y="0"/>
+            <wp:positionH relativeFrom="column">
+              <wp:posOffset>1993265</wp:posOffset>
+            </wp:positionH>
+            <wp:positionV relativeFrom="paragraph">
+              <wp:posOffset>4518025</wp:posOffset>
+            </wp:positionV>
+            <wp:extent cx="1658620" cy="3705225"/>
+            <wp:effectExtent l="0" t="0" r="5080" b="3175"/>
+            <wp:wrapTopAndBottom/>
+            <wp:docPr id="1897051005" name="Image 1" descr="Une image contenant texte, capture d’écran, Police, nombre&#10;&#10;Description générée automatiquement"/>
+            <wp:cNvGraphicFramePr>
+              <a:graphicFrameLocks xmlns:a="http://schemas.openxmlformats.org/drawingml/2006/main" noChangeAspect="1"/>
+            </wp:cNvGraphicFramePr>
+            <a:graphic xmlns:a="http://schemas.openxmlformats.org/drawingml/2006/main">
+              <a:graphicData uri="http://schemas.openxmlformats.org/drawingml/2006/picture">
+                <pic:pic xmlns:pic="http://schemas.openxmlformats.org/drawingml/2006/picture">
+                  <pic:nvPicPr>
+                    <pic:cNvPr id="1897051005" name="Image 1" descr="Une image contenant texte, capture d’écran, Police, nombre&#10;&#10;Description générée automatiquement"/>
+                    <pic:cNvPicPr/>
+                  </pic:nvPicPr>
+                  <pic:blipFill>
+                    <a:blip r:embed="rId12" cstate="print">
+                      <a:extLst>
+                        <a:ext uri="{28A0092B-C50C-407E-A947-70E740481C1C}">
+                          <a14:useLocalDpi xmlns:a14="http://schemas.microsoft.com/office/drawing/2010/main" val="0"/>
+                        </a:ext>
+                      </a:extLst>
+                    </a:blip>
+                    <a:stretch>
+                      <a:fillRect/>
+                    </a:stretch>
+                  </pic:blipFill>
+                  <pic:spPr>
+                    <a:xfrm>
+                      <a:off x="0" y="0"/>
+                      <a:ext cx="1658620" cy="3705225"/>
+                    </a:xfrm>
+                    <a:prstGeom prst="rect">
+                      <a:avLst/>
+                    </a:prstGeom>
+                  </pic:spPr>
+                </pic:pic>
+              </a:graphicData>
+            </a:graphic>
+            <wp14:sizeRelH relativeFrom="page">
+              <wp14:pctWidth>0</wp14:pctWidth>
+            </wp14:sizeRelH>
+            <wp14:sizeRelV relativeFrom="page">
+              <wp14:pctHeight>0</wp14:pctHeight>
+            </wp14:sizeRelV>
+          </wp:anchor>
+        </w:drawing>
+      </w:r>
+      <w:r>
+        <w:drawing>
+          <wp:anchor distT="0" distB="0" distL="114300" distR="114300" simplePos="0" relativeHeight="251665408" behindDoc="0" locked="0" layoutInCell="1" allowOverlap="1" wp14:anchorId="45313C5F" wp14:editId="373F606F">
+            <wp:simplePos x="0" y="0"/>
+            <wp:positionH relativeFrom="column">
+              <wp:posOffset>4102735</wp:posOffset>
+            </wp:positionH>
+            <wp:positionV relativeFrom="paragraph">
+              <wp:posOffset>697464</wp:posOffset>
+            </wp:positionV>
+            <wp:extent cx="1644650" cy="3678555"/>
+            <wp:effectExtent l="0" t="0" r="6350" b="4445"/>
+            <wp:wrapTopAndBottom/>
+            <wp:docPr id="20112559" name="Image 1" descr="Une image contenant texte, capture d’écran, Police, nombre&#10;&#10;Description générée automatiquement"/>
+            <wp:cNvGraphicFramePr>
+              <a:graphicFrameLocks xmlns:a="http://schemas.openxmlformats.org/drawingml/2006/main" noChangeAspect="1"/>
+            </wp:cNvGraphicFramePr>
+            <a:graphic xmlns:a="http://schemas.openxmlformats.org/drawingml/2006/main">
+              <a:graphicData uri="http://schemas.openxmlformats.org/drawingml/2006/picture">
+                <pic:pic xmlns:pic="http://schemas.openxmlformats.org/drawingml/2006/picture">
+                  <pic:nvPicPr>
+                    <pic:cNvPr id="20112559" name="Image 1" descr="Une image contenant texte, capture d’écran, Police, nombre&#10;&#10;Description générée automatiquement"/>
+                    <pic:cNvPicPr/>
+                  </pic:nvPicPr>
+                  <pic:blipFill>
+                    <a:blip r:embed="rId13" cstate="print">
+                      <a:extLst>
+                        <a:ext uri="{28A0092B-C50C-407E-A947-70E740481C1C}">
+                          <a14:useLocalDpi xmlns:a14="http://schemas.microsoft.com/office/drawing/2010/main" val="0"/>
+                        </a:ext>
+                      </a:extLst>
+                    </a:blip>
+                    <a:stretch>
+                      <a:fillRect/>
+                    </a:stretch>
+                  </pic:blipFill>
+                  <pic:spPr>
+                    <a:xfrm>
+                      <a:off x="0" y="0"/>
+                      <a:ext cx="1644650" cy="3678555"/>
+                    </a:xfrm>
+                    <a:prstGeom prst="rect">
+                      <a:avLst/>
+                    </a:prstGeom>
+                  </pic:spPr>
+                </pic:pic>
+              </a:graphicData>
+            </a:graphic>
+            <wp14:sizeRelH relativeFrom="page">
+              <wp14:pctWidth>0</wp14:pctWidth>
+            </wp14:sizeRelH>
+            <wp14:sizeRelV relativeFrom="page">
+              <wp14:pctHeight>0</wp14:pctHeight>
+            </wp14:sizeRelV>
+          </wp:anchor>
+        </w:drawing>
+      </w:r>
+      <w:r>
+        <w:drawing>
+          <wp:anchor distT="0" distB="0" distL="114300" distR="114300" simplePos="0" relativeHeight="251662336" behindDoc="0" locked="0" layoutInCell="1" allowOverlap="1" wp14:anchorId="5B7D54B5" wp14:editId="68FC6F1B">
+            <wp:simplePos x="0" y="0"/>
+            <wp:positionH relativeFrom="column">
+              <wp:posOffset>1997075</wp:posOffset>
+            </wp:positionH>
+            <wp:positionV relativeFrom="paragraph">
+              <wp:posOffset>703947</wp:posOffset>
+            </wp:positionV>
+            <wp:extent cx="1644015" cy="3645535"/>
+            <wp:effectExtent l="0" t="0" r="0" b="0"/>
+            <wp:wrapTopAndBottom/>
+            <wp:docPr id="56801752" name="Image 1" descr="Une image contenant texte, carte, capture d’écran, diagramme&#10;&#10;Description générée automatiquement"/>
+            <wp:cNvGraphicFramePr>
+              <a:graphicFrameLocks xmlns:a="http://schemas.openxmlformats.org/drawingml/2006/main" noChangeAspect="1"/>
+            </wp:cNvGraphicFramePr>
+            <a:graphic xmlns:a="http://schemas.openxmlformats.org/drawingml/2006/main">
+              <a:graphicData uri="http://schemas.openxmlformats.org/drawingml/2006/picture">
+                <pic:pic xmlns:pic="http://schemas.openxmlformats.org/drawingml/2006/picture">
+                  <pic:nvPicPr>
+                    <pic:cNvPr id="56801752" name="Image 1" descr="Une image contenant texte, carte, capture d’écran, diagramme&#10;&#10;Description générée automatiquement"/>
+                    <pic:cNvPicPr/>
+                  </pic:nvPicPr>
+                  <pic:blipFill>
+                    <a:blip r:embed="rId14" cstate="print">
+                      <a:extLst>
+                        <a:ext uri="{28A0092B-C50C-407E-A947-70E740481C1C}">
+                          <a14:useLocalDpi xmlns:a14="http://schemas.microsoft.com/office/drawing/2010/main" val="0"/>
+                        </a:ext>
+                      </a:extLst>
+                    </a:blip>
+                    <a:stretch>
+                      <a:fillRect/>
+                    </a:stretch>
+                  </pic:blipFill>
+                  <pic:spPr>
+                    <a:xfrm>
+                      <a:off x="0" y="0"/>
+                      <a:ext cx="1644015" cy="3645535"/>
+                    </a:xfrm>
+                    <a:prstGeom prst="rect">
+                      <a:avLst/>
+                    </a:prstGeom>
+                  </pic:spPr>
+                </pic:pic>
+              </a:graphicData>
+            </a:graphic>
+            <wp14:sizeRelH relativeFrom="page">
+              <wp14:pctWidth>0</wp14:pctWidth>
+            </wp14:sizeRelH>
+            <wp14:sizeRelV relativeFrom="page">
+              <wp14:pctHeight>0</wp14:pctHeight>
+            </wp14:sizeRelV>
+          </wp:anchor>
+        </w:drawing>
+      </w:r>
+      <w:r>
+        <w:drawing>
+          <wp:anchor distT="0" distB="0" distL="114300" distR="114300" simplePos="0" relativeHeight="251663360" behindDoc="0" locked="0" layoutInCell="1" allowOverlap="1" wp14:anchorId="04D6FD88" wp14:editId="0FC3E387">
+            <wp:simplePos x="0" y="0"/>
+            <wp:positionH relativeFrom="column">
+              <wp:posOffset>-60325</wp:posOffset>
+            </wp:positionH>
+            <wp:positionV relativeFrom="paragraph">
+              <wp:posOffset>654886</wp:posOffset>
+            </wp:positionV>
+            <wp:extent cx="1654810" cy="3700145"/>
+            <wp:effectExtent l="0" t="0" r="0" b="0"/>
+            <wp:wrapTopAndBottom/>
+            <wp:docPr id="1393723816" name="Image 1" descr="Une image contenant texte, Appareils électroniques, Téléphone mobile, capture d’écran&#10;&#10;Description générée automatiquement"/>
+            <wp:cNvGraphicFramePr>
+              <a:graphicFrameLocks xmlns:a="http://schemas.openxmlformats.org/drawingml/2006/main" noChangeAspect="1"/>
+            </wp:cNvGraphicFramePr>
+            <a:graphic xmlns:a="http://schemas.openxmlformats.org/drawingml/2006/main">
+              <a:graphicData uri="http://schemas.openxmlformats.org/drawingml/2006/picture">
+                <pic:pic xmlns:pic="http://schemas.openxmlformats.org/drawingml/2006/picture">
+                  <pic:nvPicPr>
+                    <pic:cNvPr id="1393723816" name="Image 1" descr="Une image contenant texte, Appareils électroniques, Téléphone mobile, capture d’écran&#10;&#10;Description générée automatiquement"/>
                     <pic:cNvPicPr/>
                   </pic:nvPicPr>
                   <pic:blipFill>
@@ -3182,7 +3699,7 @@
                   <pic:spPr>
                     <a:xfrm>
                       <a:off x="0" y="0"/>
-                      <a:ext cx="4965065" cy="7575550"/>
+                      <a:ext cx="1654810" cy="3700145"/>
                     </a:xfrm>
                     <a:prstGeom prst="rect">
                       <a:avLst/>
@@ -3201,112 +3718,460 @@
         </w:drawing>
       </w:r>
       <w:r>
-        <w:rPr>
-          <w:lang w:val="fr-BE"/>
-        </w:rPr>
-        <w:t>Schéma de base de données</w:t>
-      </w:r>
-      <w:bookmarkEnd w:id="7"/>
+        <w:drawing>
+          <wp:anchor distT="0" distB="0" distL="114300" distR="114300" simplePos="0" relativeHeight="251666432" behindDoc="0" locked="0" layoutInCell="1" allowOverlap="1" wp14:anchorId="5F5963EE" wp14:editId="042B64BA">
+            <wp:simplePos x="0" y="0"/>
+            <wp:positionH relativeFrom="column">
+              <wp:posOffset>-60325</wp:posOffset>
+            </wp:positionH>
+            <wp:positionV relativeFrom="paragraph">
+              <wp:posOffset>4518025</wp:posOffset>
+            </wp:positionV>
+            <wp:extent cx="1654810" cy="3702050"/>
+            <wp:effectExtent l="0" t="0" r="0" b="6350"/>
+            <wp:wrapTopAndBottom/>
+            <wp:docPr id="789386971" name="Image 1" descr="Une image contenant texte, capture d’écran, horloge, conception&#10;&#10;Description générée automatiquement"/>
+            <wp:cNvGraphicFramePr>
+              <a:graphicFrameLocks xmlns:a="http://schemas.openxmlformats.org/drawingml/2006/main" noChangeAspect="1"/>
+            </wp:cNvGraphicFramePr>
+            <a:graphic xmlns:a="http://schemas.openxmlformats.org/drawingml/2006/main">
+              <a:graphicData uri="http://schemas.openxmlformats.org/drawingml/2006/picture">
+                <pic:pic xmlns:pic="http://schemas.openxmlformats.org/drawingml/2006/picture">
+                  <pic:nvPicPr>
+                    <pic:cNvPr id="789386971" name="Image 1" descr="Une image contenant texte, capture d’écran, horloge, conception&#10;&#10;Description générée automatiquement"/>
+                    <pic:cNvPicPr/>
+                  </pic:nvPicPr>
+                  <pic:blipFill>
+                    <a:blip r:embed="rId16" cstate="print">
+                      <a:extLst>
+                        <a:ext uri="{28A0092B-C50C-407E-A947-70E740481C1C}">
+                          <a14:useLocalDpi xmlns:a14="http://schemas.microsoft.com/office/drawing/2010/main" val="0"/>
+                        </a:ext>
+                      </a:extLst>
+                    </a:blip>
+                    <a:stretch>
+                      <a:fillRect/>
+                    </a:stretch>
+                  </pic:blipFill>
+                  <pic:spPr>
+                    <a:xfrm>
+                      <a:off x="0" y="0"/>
+                      <a:ext cx="1654810" cy="3702050"/>
+                    </a:xfrm>
+                    <a:prstGeom prst="rect">
+                      <a:avLst/>
+                    </a:prstGeom>
+                  </pic:spPr>
+                </pic:pic>
+              </a:graphicData>
+            </a:graphic>
+            <wp14:sizeRelH relativeFrom="page">
+              <wp14:pctWidth>0</wp14:pctWidth>
+            </wp14:sizeRelH>
+            <wp14:sizeRelV relativeFrom="page">
+              <wp14:pctHeight>0</wp14:pctHeight>
+            </wp14:sizeRelV>
+          </wp:anchor>
+        </w:drawing>
+      </w:r>
+      <w:r>
+        <w:t>Maquettes</w:t>
+      </w:r>
+      <w:bookmarkEnd w:id="9"/>
+      <w:r>
+        <w:t xml:space="preserve"> </w:t>
+      </w:r>
     </w:p>
     <w:p>
       <w:pPr>
-        <w:jc w:val="center"/>
-        <w:rPr>
-          <w:rStyle w:val="Accentuationlgre"/>
-          <w:lang w:val="fr-BE"/>
-        </w:rPr>
-      </w:pPr>
-      <w:r>
-        <w:rPr>
-          <w:rStyle w:val="Accentuationlgre"/>
-          <w:lang w:val="fr-BE"/>
-        </w:rPr>
-        <w:t>Figure 1 – Schéma de Base de donnée</w:t>
-      </w:r>
-      <w:r>
-        <w:rPr>
-          <w:rStyle w:val="Accentuationlgre"/>
-          <w:lang w:val="fr-BE"/>
-        </w:rPr>
-        <w:t>s</w:t>
+        <w:rPr>
+          <w:lang w:val="fr-BE"/>
+        </w:rPr>
+      </w:pPr>
+      <w:r>
+        <w:rPr>
+          <w:color w:val="808080" w:themeColor="background1" w:themeShade="80"/>
+          <w:lang w:val="fr-BE"/>
+        </w:rPr>
+        <w:t>(l</w:t>
+      </w:r>
+      <w:r>
+        <w:rPr>
+          <w:color w:val="808080" w:themeColor="background1" w:themeShade="80"/>
+          <w:lang w:val="fr-BE"/>
+        </w:rPr>
+        <w:t>e projet est disponible en .</w:t>
+      </w:r>
+      <w:proofErr w:type="spellStart"/>
+      <w:r>
+        <w:rPr>
+          <w:color w:val="808080" w:themeColor="background1" w:themeShade="80"/>
+          <w:lang w:val="fr-BE"/>
+        </w:rPr>
+        <w:t>fig</w:t>
+      </w:r>
+      <w:proofErr w:type="spellEnd"/>
+      <w:r>
+        <w:rPr>
+          <w:color w:val="808080" w:themeColor="background1" w:themeShade="80"/>
+          <w:lang w:val="fr-BE"/>
+        </w:rPr>
+        <w:t xml:space="preserve"> dans les annexes)</w:t>
       </w:r>
     </w:p>
     <w:p>
-      <w:pPr>
-        <w:pStyle w:val="Titre1"/>
-        <w:numPr>
-          <w:ilvl w:val="0"/>
-          <w:numId w:val="1"/>
-        </w:numPr>
-        <w:rPr>
-          <w:lang w:val="fr-BE"/>
-        </w:rPr>
-      </w:pPr>
-      <w:bookmarkStart w:id="8" w:name="_Toc180420841"/>
-      <w:proofErr w:type="spellStart"/>
-      <w:r>
-        <w:rPr>
-          <w:lang w:val="fr-BE"/>
-        </w:rPr>
+      <w:r>
         <w:lastRenderedPageBreak/>
-        <w:t>Mockups</w:t>
-      </w:r>
-      <w:proofErr w:type="spellEnd"/>
-      <w:r>
-        <w:rPr>
-          <w:lang w:val="fr-BE"/>
-        </w:rPr>
-        <w:t xml:space="preserve"> du back office</w:t>
-      </w:r>
-      <w:bookmarkEnd w:id="8"/>
-    </w:p>
-    <w:p>
-      <w:pPr>
-        <w:rPr>
-          <w:lang w:val="fr-BE"/>
-        </w:rPr>
-      </w:pPr>
-    </w:p>
-    <w:p>
-      <w:pPr>
-        <w:rPr>
-          <w:lang w:val="fr-BE"/>
-        </w:rPr>
-      </w:pPr>
-    </w:p>
-    <w:p>
-      <w:pPr>
-        <w:rPr>
-          <w:lang w:val="fr-BE"/>
-        </w:rPr>
-      </w:pPr>
-    </w:p>
-    <w:p>
-      <w:pPr>
-        <w:pStyle w:val="Titre1"/>
-        <w:numPr>
-          <w:ilvl w:val="0"/>
-          <w:numId w:val="1"/>
-        </w:numPr>
-        <w:rPr>
-          <w:lang w:val="fr-BE"/>
-        </w:rPr>
-      </w:pPr>
-      <w:bookmarkStart w:id="9" w:name="_Toc180420842"/>
-      <w:r>
-        <w:rPr>
-          <w:lang w:val="fr-BE"/>
-        </w:rPr>
-        <w:t>Maquettes</w:t>
-      </w:r>
-      <w:bookmarkEnd w:id="9"/>
-    </w:p>
-    <w:p>
-      <w:pPr>
-        <w:rPr>
-          <w:lang w:val="fr-BE"/>
-        </w:rPr>
-      </w:pPr>
+        <w:drawing>
+          <wp:anchor distT="0" distB="0" distL="114300" distR="114300" simplePos="0" relativeHeight="251672576" behindDoc="0" locked="0" layoutInCell="1" allowOverlap="1" wp14:anchorId="0DFA1CBE" wp14:editId="4E90178F">
+            <wp:simplePos x="0" y="0"/>
+            <wp:positionH relativeFrom="column">
+              <wp:posOffset>4499310</wp:posOffset>
+            </wp:positionH>
+            <wp:positionV relativeFrom="paragraph">
+              <wp:posOffset>4467358</wp:posOffset>
+            </wp:positionV>
+            <wp:extent cx="1685290" cy="3759200"/>
+            <wp:effectExtent l="0" t="0" r="3810" b="0"/>
+            <wp:wrapTopAndBottom/>
+            <wp:docPr id="350993230" name="Image 1" descr="Une image contenant texte, capture d’écran, Police, nombre&#10;&#10;Description générée automatiquement"/>
+            <wp:cNvGraphicFramePr>
+              <a:graphicFrameLocks xmlns:a="http://schemas.openxmlformats.org/drawingml/2006/main" noChangeAspect="1"/>
+            </wp:cNvGraphicFramePr>
+            <a:graphic xmlns:a="http://schemas.openxmlformats.org/drawingml/2006/main">
+              <a:graphicData uri="http://schemas.openxmlformats.org/drawingml/2006/picture">
+                <pic:pic xmlns:pic="http://schemas.openxmlformats.org/drawingml/2006/picture">
+                  <pic:nvPicPr>
+                    <pic:cNvPr id="350993230" name="Image 1" descr="Une image contenant texte, capture d’écran, Police, nombre&#10;&#10;Description générée automatiquement"/>
+                    <pic:cNvPicPr/>
+                  </pic:nvPicPr>
+                  <pic:blipFill>
+                    <a:blip r:embed="rId17">
+                      <a:extLst>
+                        <a:ext uri="{28A0092B-C50C-407E-A947-70E740481C1C}">
+                          <a14:useLocalDpi xmlns:a14="http://schemas.microsoft.com/office/drawing/2010/main" val="0"/>
+                        </a:ext>
+                      </a:extLst>
+                    </a:blip>
+                    <a:stretch>
+                      <a:fillRect/>
+                    </a:stretch>
+                  </pic:blipFill>
+                  <pic:spPr>
+                    <a:xfrm>
+                      <a:off x="0" y="0"/>
+                      <a:ext cx="1685290" cy="3759200"/>
+                    </a:xfrm>
+                    <a:prstGeom prst="rect">
+                      <a:avLst/>
+                    </a:prstGeom>
+                  </pic:spPr>
+                </pic:pic>
+              </a:graphicData>
+            </a:graphic>
+            <wp14:sizeRelH relativeFrom="page">
+              <wp14:pctWidth>0</wp14:pctWidth>
+            </wp14:sizeRelH>
+            <wp14:sizeRelV relativeFrom="page">
+              <wp14:pctHeight>0</wp14:pctHeight>
+            </wp14:sizeRelV>
+          </wp:anchor>
+        </w:drawing>
+      </w:r>
+      <w:r>
+        <w:rPr>
+          <w:lang w:val="fr-BE"/>
+        </w:rPr>
+        <w:drawing>
+          <wp:anchor distT="0" distB="0" distL="114300" distR="114300" simplePos="0" relativeHeight="251670528" behindDoc="0" locked="0" layoutInCell="1" allowOverlap="1" wp14:anchorId="428D09B7" wp14:editId="3F0F78DA">
+            <wp:simplePos x="0" y="0"/>
+            <wp:positionH relativeFrom="column">
+              <wp:posOffset>501</wp:posOffset>
+            </wp:positionH>
+            <wp:positionV relativeFrom="paragraph">
+              <wp:posOffset>4513580</wp:posOffset>
+            </wp:positionV>
+            <wp:extent cx="1671320" cy="3710940"/>
+            <wp:effectExtent l="0" t="0" r="5080" b="0"/>
+            <wp:wrapTopAndBottom/>
+            <wp:docPr id="28697705" name="Image 1" descr="Une image contenant texte, capture d’écran&#10;&#10;Description générée automatiquement"/>
+            <wp:cNvGraphicFramePr>
+              <a:graphicFrameLocks xmlns:a="http://schemas.openxmlformats.org/drawingml/2006/main" noChangeAspect="1"/>
+            </wp:cNvGraphicFramePr>
+            <a:graphic xmlns:a="http://schemas.openxmlformats.org/drawingml/2006/main">
+              <a:graphicData uri="http://schemas.openxmlformats.org/drawingml/2006/picture">
+                <pic:pic xmlns:pic="http://schemas.openxmlformats.org/drawingml/2006/picture">
+                  <pic:nvPicPr>
+                    <pic:cNvPr id="28697705" name="Image 1" descr="Une image contenant texte, capture d’écran&#10;&#10;Description générée automatiquement"/>
+                    <pic:cNvPicPr/>
+                  </pic:nvPicPr>
+                  <pic:blipFill>
+                    <a:blip r:embed="rId18">
+                      <a:extLst>
+                        <a:ext uri="{28A0092B-C50C-407E-A947-70E740481C1C}">
+                          <a14:useLocalDpi xmlns:a14="http://schemas.microsoft.com/office/drawing/2010/main" val="0"/>
+                        </a:ext>
+                      </a:extLst>
+                    </a:blip>
+                    <a:stretch>
+                      <a:fillRect/>
+                    </a:stretch>
+                  </pic:blipFill>
+                  <pic:spPr>
+                    <a:xfrm>
+                      <a:off x="0" y="0"/>
+                      <a:ext cx="1671320" cy="3710940"/>
+                    </a:xfrm>
+                    <a:prstGeom prst="rect">
+                      <a:avLst/>
+                    </a:prstGeom>
+                  </pic:spPr>
+                </pic:pic>
+              </a:graphicData>
+            </a:graphic>
+            <wp14:sizeRelH relativeFrom="page">
+              <wp14:pctWidth>0</wp14:pctWidth>
+            </wp14:sizeRelH>
+            <wp14:sizeRelV relativeFrom="page">
+              <wp14:pctHeight>0</wp14:pctHeight>
+            </wp14:sizeRelV>
+          </wp:anchor>
+        </w:drawing>
+      </w:r>
+      <w:r>
+        <w:drawing>
+          <wp:anchor distT="0" distB="0" distL="114300" distR="114300" simplePos="0" relativeHeight="251671552" behindDoc="0" locked="0" layoutInCell="1" allowOverlap="1" wp14:anchorId="48230184" wp14:editId="4C6856C0">
+            <wp:simplePos x="0" y="0"/>
+            <wp:positionH relativeFrom="column">
+              <wp:posOffset>2105025</wp:posOffset>
+            </wp:positionH>
+            <wp:positionV relativeFrom="paragraph">
+              <wp:posOffset>4505926</wp:posOffset>
+            </wp:positionV>
+            <wp:extent cx="1671955" cy="3720465"/>
+            <wp:effectExtent l="0" t="0" r="4445" b="635"/>
+            <wp:wrapTopAndBottom/>
+            <wp:docPr id="1354297816" name="Image 1" descr="Une image contenant texte, capture d’écran, Police, logo&#10;&#10;Description générée automatiquement"/>
+            <wp:cNvGraphicFramePr>
+              <a:graphicFrameLocks xmlns:a="http://schemas.openxmlformats.org/drawingml/2006/main" noChangeAspect="1"/>
+            </wp:cNvGraphicFramePr>
+            <a:graphic xmlns:a="http://schemas.openxmlformats.org/drawingml/2006/main">
+              <a:graphicData uri="http://schemas.openxmlformats.org/drawingml/2006/picture">
+                <pic:pic xmlns:pic="http://schemas.openxmlformats.org/drawingml/2006/picture">
+                  <pic:nvPicPr>
+                    <pic:cNvPr id="1354297816" name="Image 1" descr="Une image contenant texte, capture d’écran, Police, logo&#10;&#10;Description générée automatiquement"/>
+                    <pic:cNvPicPr/>
+                  </pic:nvPicPr>
+                  <pic:blipFill>
+                    <a:blip r:embed="rId19">
+                      <a:extLst>
+                        <a:ext uri="{28A0092B-C50C-407E-A947-70E740481C1C}">
+                          <a14:useLocalDpi xmlns:a14="http://schemas.microsoft.com/office/drawing/2010/main" val="0"/>
+                        </a:ext>
+                      </a:extLst>
+                    </a:blip>
+                    <a:stretch>
+                      <a:fillRect/>
+                    </a:stretch>
+                  </pic:blipFill>
+                  <pic:spPr>
+                    <a:xfrm>
+                      <a:off x="0" y="0"/>
+                      <a:ext cx="1671955" cy="3720465"/>
+                    </a:xfrm>
+                    <a:prstGeom prst="rect">
+                      <a:avLst/>
+                    </a:prstGeom>
+                  </pic:spPr>
+                </pic:pic>
+              </a:graphicData>
+            </a:graphic>
+            <wp14:sizeRelH relativeFrom="page">
+              <wp14:pctWidth>0</wp14:pctWidth>
+            </wp14:sizeRelH>
+            <wp14:sizeRelV relativeFrom="page">
+              <wp14:pctHeight>0</wp14:pctHeight>
+            </wp14:sizeRelV>
+          </wp:anchor>
+        </w:drawing>
+      </w:r>
+      <w:r>
+        <w:drawing>
+          <wp:anchor distT="0" distB="0" distL="114300" distR="114300" simplePos="0" relativeHeight="251669504" behindDoc="0" locked="0" layoutInCell="1" allowOverlap="1" wp14:anchorId="3D4D7E82" wp14:editId="1009D27D">
+            <wp:simplePos x="0" y="0"/>
+            <wp:positionH relativeFrom="column">
+              <wp:posOffset>4497036</wp:posOffset>
+            </wp:positionH>
+            <wp:positionV relativeFrom="paragraph">
+              <wp:posOffset>0</wp:posOffset>
+            </wp:positionV>
+            <wp:extent cx="1844040" cy="4123690"/>
+            <wp:effectExtent l="0" t="0" r="0" b="3810"/>
+            <wp:wrapTopAndBottom/>
+            <wp:docPr id="1315964972" name="Image 1" descr="Une image contenant texte, capture d’écran, Police, nombre&#10;&#10;Description générée automatiquement"/>
+            <wp:cNvGraphicFramePr>
+              <a:graphicFrameLocks xmlns:a="http://schemas.openxmlformats.org/drawingml/2006/main" noChangeAspect="1"/>
+            </wp:cNvGraphicFramePr>
+            <a:graphic xmlns:a="http://schemas.openxmlformats.org/drawingml/2006/main">
+              <a:graphicData uri="http://schemas.openxmlformats.org/drawingml/2006/picture">
+                <pic:pic xmlns:pic="http://schemas.openxmlformats.org/drawingml/2006/picture">
+                  <pic:nvPicPr>
+                    <pic:cNvPr id="1315964972" name="Image 1" descr="Une image contenant texte, capture d’écran, Police, nombre&#10;&#10;Description générée automatiquement"/>
+                    <pic:cNvPicPr/>
+                  </pic:nvPicPr>
+                  <pic:blipFill>
+                    <a:blip r:embed="rId20">
+                      <a:extLst>
+                        <a:ext uri="{28A0092B-C50C-407E-A947-70E740481C1C}">
+                          <a14:useLocalDpi xmlns:a14="http://schemas.microsoft.com/office/drawing/2010/main" val="0"/>
+                        </a:ext>
+                      </a:extLst>
+                    </a:blip>
+                    <a:stretch>
+                      <a:fillRect/>
+                    </a:stretch>
+                  </pic:blipFill>
+                  <pic:spPr>
+                    <a:xfrm>
+                      <a:off x="0" y="0"/>
+                      <a:ext cx="1844040" cy="4123690"/>
+                    </a:xfrm>
+                    <a:prstGeom prst="rect">
+                      <a:avLst/>
+                    </a:prstGeom>
+                  </pic:spPr>
+                </pic:pic>
+              </a:graphicData>
+            </a:graphic>
+            <wp14:sizeRelH relativeFrom="page">
+              <wp14:pctWidth>0</wp14:pctWidth>
+            </wp14:sizeRelH>
+            <wp14:sizeRelV relativeFrom="page">
+              <wp14:pctHeight>0</wp14:pctHeight>
+            </wp14:sizeRelV>
+          </wp:anchor>
+        </w:drawing>
+      </w:r>
+      <w:r>
+        <w:rPr>
+          <w:lang w:val="fr-BE"/>
+        </w:rPr>
+        <w:drawing>
+          <wp:anchor distT="0" distB="0" distL="114300" distR="114300" simplePos="0" relativeHeight="251667456" behindDoc="0" locked="0" layoutInCell="1" allowOverlap="1" wp14:anchorId="168FED07" wp14:editId="481F3EE0">
+            <wp:simplePos x="0" y="0"/>
+            <wp:positionH relativeFrom="column">
+              <wp:posOffset>-180975</wp:posOffset>
+            </wp:positionH>
+            <wp:positionV relativeFrom="paragraph">
+              <wp:posOffset>0</wp:posOffset>
+            </wp:positionV>
+            <wp:extent cx="1852295" cy="4123690"/>
+            <wp:effectExtent l="0" t="0" r="1905" b="3810"/>
+            <wp:wrapTopAndBottom/>
+            <wp:docPr id="174705781" name="Image 1" descr="Une image contenant texte, capture d’écran, Police&#10;&#10;Description générée automatiquement"/>
+            <wp:cNvGraphicFramePr>
+              <a:graphicFrameLocks xmlns:a="http://schemas.openxmlformats.org/drawingml/2006/main" noChangeAspect="1"/>
+            </wp:cNvGraphicFramePr>
+            <a:graphic xmlns:a="http://schemas.openxmlformats.org/drawingml/2006/main">
+              <a:graphicData uri="http://schemas.openxmlformats.org/drawingml/2006/picture">
+                <pic:pic xmlns:pic="http://schemas.openxmlformats.org/drawingml/2006/picture">
+                  <pic:nvPicPr>
+                    <pic:cNvPr id="174705781" name="Image 1" descr="Une image contenant texte, capture d’écran, Police&#10;&#10;Description générée automatiquement"/>
+                    <pic:cNvPicPr/>
+                  </pic:nvPicPr>
+                  <pic:blipFill>
+                    <a:blip r:embed="rId21">
+                      <a:extLst>
+                        <a:ext uri="{28A0092B-C50C-407E-A947-70E740481C1C}">
+                          <a14:useLocalDpi xmlns:a14="http://schemas.microsoft.com/office/drawing/2010/main" val="0"/>
+                        </a:ext>
+                      </a:extLst>
+                    </a:blip>
+                    <a:stretch>
+                      <a:fillRect/>
+                    </a:stretch>
+                  </pic:blipFill>
+                  <pic:spPr>
+                    <a:xfrm>
+                      <a:off x="0" y="0"/>
+                      <a:ext cx="1852295" cy="4123690"/>
+                    </a:xfrm>
+                    <a:prstGeom prst="rect">
+                      <a:avLst/>
+                    </a:prstGeom>
+                  </pic:spPr>
+                </pic:pic>
+              </a:graphicData>
+            </a:graphic>
+            <wp14:sizeRelH relativeFrom="page">
+              <wp14:pctWidth>0</wp14:pctWidth>
+            </wp14:sizeRelH>
+            <wp14:sizeRelV relativeFrom="page">
+              <wp14:pctHeight>0</wp14:pctHeight>
+            </wp14:sizeRelV>
+          </wp:anchor>
+        </w:drawing>
+      </w:r>
+      <w:r>
+        <w:rPr>
+          <w:lang w:val="fr-BE"/>
+        </w:rPr>
+        <w:drawing>
+          <wp:anchor distT="0" distB="0" distL="114300" distR="114300" simplePos="0" relativeHeight="251668480" behindDoc="0" locked="0" layoutInCell="1" allowOverlap="1" wp14:anchorId="7DEE02D6" wp14:editId="7E2F0F90">
+            <wp:simplePos x="0" y="0"/>
+            <wp:positionH relativeFrom="column">
+              <wp:posOffset>2105025</wp:posOffset>
+            </wp:positionH>
+            <wp:positionV relativeFrom="paragraph">
+              <wp:posOffset>0</wp:posOffset>
+            </wp:positionV>
+            <wp:extent cx="1840230" cy="4118610"/>
+            <wp:effectExtent l="0" t="0" r="1270" b="0"/>
+            <wp:wrapTopAndBottom/>
+            <wp:docPr id="916846490" name="Image 1" descr="Une image contenant texte, capture d’écran, Police, conception&#10;&#10;Description générée automatiquement"/>
+            <wp:cNvGraphicFramePr>
+              <a:graphicFrameLocks xmlns:a="http://schemas.openxmlformats.org/drawingml/2006/main" noChangeAspect="1"/>
+            </wp:cNvGraphicFramePr>
+            <a:graphic xmlns:a="http://schemas.openxmlformats.org/drawingml/2006/main">
+              <a:graphicData uri="http://schemas.openxmlformats.org/drawingml/2006/picture">
+                <pic:pic xmlns:pic="http://schemas.openxmlformats.org/drawingml/2006/picture">
+                  <pic:nvPicPr>
+                    <pic:cNvPr id="916846490" name="Image 1" descr="Une image contenant texte, capture d’écran, Police, conception&#10;&#10;Description générée automatiquement"/>
+                    <pic:cNvPicPr/>
+                  </pic:nvPicPr>
+                  <pic:blipFill>
+                    <a:blip r:embed="rId22">
+                      <a:extLst>
+                        <a:ext uri="{28A0092B-C50C-407E-A947-70E740481C1C}">
+                          <a14:useLocalDpi xmlns:a14="http://schemas.microsoft.com/office/drawing/2010/main" val="0"/>
+                        </a:ext>
+                      </a:extLst>
+                    </a:blip>
+                    <a:stretch>
+                      <a:fillRect/>
+                    </a:stretch>
+                  </pic:blipFill>
+                  <pic:spPr>
+                    <a:xfrm>
+                      <a:off x="0" y="0"/>
+                      <a:ext cx="1840230" cy="4118610"/>
+                    </a:xfrm>
+                    <a:prstGeom prst="rect">
+                      <a:avLst/>
+                    </a:prstGeom>
+                  </pic:spPr>
+                </pic:pic>
+              </a:graphicData>
+            </a:graphic>
+            <wp14:sizeRelH relativeFrom="page">
+              <wp14:pctWidth>0</wp14:pctWidth>
+            </wp14:sizeRelH>
+            <wp14:sizeRelV relativeFrom="page">
+              <wp14:pctHeight>0</wp14:pctHeight>
+            </wp14:sizeRelV>
+          </wp:anchor>
+        </w:drawing>
+      </w:r>
     </w:p>
     <w:sectPr>
       <w:pgSz w:w="12240" w:h="15840"/>
@@ -3316,50 +4181,6 @@
     </w:sectPr>
   </w:body>
 </w:document>
-</file>
-
-<file path=word/comments.xml><?xml version="1.0" encoding="utf-8"?>
-<w:comments xmlns:wpc="http://schemas.microsoft.com/office/word/2010/wordprocessingCanvas" xmlns:cx="http://schemas.microsoft.com/office/drawing/2014/chartex" xmlns:cx1="http://schemas.microsoft.com/office/drawing/2015/9/8/chartex" xmlns:cx2="http://schemas.microsoft.com/office/drawing/2015/10/21/chartex" xmlns:cx3="http://schemas.microsoft.com/office/drawing/2016/5/9/chartex" xmlns:cx4="http://schemas.microsoft.com/office/drawing/2016/5/10/chartex" xmlns:cx5="http://schemas.microsoft.com/office/drawing/2016/5/11/chartex" xmlns:cx6="http://schemas.microsoft.com/office/drawing/2016/5/12/chartex" xmlns:cx7="http://schemas.microsoft.com/office/drawing/2016/5/13/chartex" xmlns:cx8="http://schemas.microsoft.com/office/drawing/2016/5/14/chartex" xmlns:mc="http://schemas.openxmlformats.org/markup-compatibility/2006" xmlns:aink="http://schemas.microsoft.com/office/drawing/2016/ink" xmlns:am3d="http://schemas.microsoft.com/office/drawing/2017/model3d" xmlns:o="urn:schemas-microsoft-com:office:office" xmlns:oel="http://schemas.microsoft.com/office/2019/extlst" xmlns:r="http://schemas.openxmlformats.org/officeDocument/2006/relationships" xmlns:m="http://schemas.openxmlformats.org/officeDocument/2006/math" xmlns:v="urn:schemas-microsoft-com:vml" xmlns:wp14="http://schemas.microsoft.com/office/word/2010/wordprocessingDrawing" xmlns:wp="http://schemas.openxmlformats.org/drawingml/2006/wordprocessingDrawing" xmlns:w10="urn:schemas-microsoft-com:office:word" xmlns:w="http://schemas.openxmlformats.org/wordprocessingml/2006/main" xmlns:w14="http://schemas.microsoft.com/office/word/2010/wordml" xmlns:w15="http://schemas.microsoft.com/office/word/2012/wordml" xmlns:w16cex="http://schemas.microsoft.com/office/word/2018/wordml/cex" xmlns:w16cid="http://schemas.microsoft.com/office/word/2016/wordml/cid" xmlns:w16="http://schemas.microsoft.com/office/word/2018/wordml" xmlns:w16du="http://schemas.microsoft.com/office/word/2023/wordml/word16du" xmlns:w16sdtdh="http://schemas.microsoft.com/office/word/2020/wordml/sdtdatahash" xmlns:w16se="http://schemas.microsoft.com/office/word/2015/wordml/symex" xmlns:wpg="http://schemas.microsoft.com/office/word/2010/wordprocessingGroup" xmlns:wpi="http://schemas.microsoft.com/office/word/2010/wordprocessingInk" xmlns:wne="http://schemas.microsoft.com/office/word/2006/wordml" xmlns:wps="http://schemas.microsoft.com/office/word/2010/wordprocessingShape" mc:Ignorable="w14 w15 w16se w16cid w16 w16cex w16sdtdh w16du wp14">
-  <w:comment w:id="1" w:author="Samray Hugo" w:date="2024-10-21T17:44:00Z" w:initials="HS">
-    <w:p>
-      <w:pPr>
-        <w:jc w:val="left"/>
-      </w:pPr>
-      <w:r>
-        <w:rPr>
-          <w:rStyle w:val="Marquedecommentaire"/>
-        </w:rPr>
-        <w:annotationRef/>
-      </w:r>
-      <w:r>
-        <w:rPr>
-          <w:color w:val="000000"/>
-          <w:sz w:val="20"/>
-          <w:szCs w:val="20"/>
-        </w:rPr>
-        <w:t>Phrases un peu lourdes je trouve nan ? fin à la place du prof si je devais lire plusieurs dossiers comme ça j’aurais le cerveau en compote mdr</w:t>
-      </w:r>
-    </w:p>
-  </w:comment>
-</w:comments>
-</file>
-
-<file path=word/commentsExtended.xml><?xml version="1.0" encoding="utf-8"?>
-<w15:commentsEx xmlns:wpc="http://schemas.microsoft.com/office/word/2010/wordprocessingCanvas" xmlns:cx="http://schemas.microsoft.com/office/drawing/2014/chartex" xmlns:cx1="http://schemas.microsoft.com/office/drawing/2015/9/8/chartex" xmlns:cx2="http://schemas.microsoft.com/office/drawing/2015/10/21/chartex" xmlns:cx3="http://schemas.microsoft.com/office/drawing/2016/5/9/chartex" xmlns:cx4="http://schemas.microsoft.com/office/drawing/2016/5/10/chartex" xmlns:cx5="http://schemas.microsoft.com/office/drawing/2016/5/11/chartex" xmlns:cx6="http://schemas.microsoft.com/office/drawing/2016/5/12/chartex" xmlns:cx7="http://schemas.microsoft.com/office/drawing/2016/5/13/chartex" xmlns:cx8="http://schemas.microsoft.com/office/drawing/2016/5/14/chartex" xmlns:mc="http://schemas.openxmlformats.org/markup-compatibility/2006" xmlns:aink="http://schemas.microsoft.com/office/drawing/2016/ink" xmlns:am3d="http://schemas.microsoft.com/office/drawing/2017/model3d" xmlns:o="urn:schemas-microsoft-com:office:office" xmlns:oel="http://schemas.microsoft.com/office/2019/extlst" xmlns:r="http://schemas.openxmlformats.org/officeDocument/2006/relationships" xmlns:m="http://schemas.openxmlformats.org/officeDocument/2006/math" xmlns:v="urn:schemas-microsoft-com:vml" xmlns:wp14="http://schemas.microsoft.com/office/word/2010/wordprocessingDrawing" xmlns:wp="http://schemas.openxmlformats.org/drawingml/2006/wordprocessingDrawing" xmlns:w10="urn:schemas-microsoft-com:office:word" xmlns:w="http://schemas.openxmlformats.org/wordprocessingml/2006/main" xmlns:w14="http://schemas.microsoft.com/office/word/2010/wordml" xmlns:w15="http://schemas.microsoft.com/office/word/2012/wordml" xmlns:w16cex="http://schemas.microsoft.com/office/word/2018/wordml/cex" xmlns:w16cid="http://schemas.microsoft.com/office/word/2016/wordml/cid" xmlns:w16="http://schemas.microsoft.com/office/word/2018/wordml" xmlns:w16du="http://schemas.microsoft.com/office/word/2023/wordml/word16du" xmlns:w16sdtdh="http://schemas.microsoft.com/office/word/2020/wordml/sdtdatahash" xmlns:w16se="http://schemas.microsoft.com/office/word/2015/wordml/symex" xmlns:wpg="http://schemas.microsoft.com/office/word/2010/wordprocessingGroup" xmlns:wpi="http://schemas.microsoft.com/office/word/2010/wordprocessingInk" xmlns:wne="http://schemas.microsoft.com/office/word/2006/wordml" xmlns:wps="http://schemas.microsoft.com/office/word/2010/wordprocessingShape" mc:Ignorable="w14 w15 w16se w16cid w16 w16cex w16sdtdh w16du wp14">
-  <w15:commentEx w15:paraId="5D66B09B" w15:done="0"/>
-</w15:commentsEx>
-</file>
-
-<file path=word/commentsExtensible.xml><?xml version="1.0" encoding="utf-8"?>
-<w16cex:commentsExtensible xmlns:wpc="http://schemas.microsoft.com/office/word/2010/wordprocessingCanvas" xmlns:cx="http://schemas.microsoft.com/office/drawing/2014/chartex" xmlns:cx1="http://schemas.microsoft.com/office/drawing/2015/9/8/chartex" xmlns:cx2="http://schemas.microsoft.com/office/drawing/2015/10/21/chartex" xmlns:cx3="http://schemas.microsoft.com/office/drawing/2016/5/9/chartex" xmlns:cx4="http://schemas.microsoft.com/office/drawing/2016/5/10/chartex" xmlns:cx5="http://schemas.microsoft.com/office/drawing/2016/5/11/chartex" xmlns:cx6="http://schemas.microsoft.com/office/drawing/2016/5/12/chartex" xmlns:cx7="http://schemas.microsoft.com/office/drawing/2016/5/13/chartex" xmlns:cx8="http://schemas.microsoft.com/office/drawing/2016/5/14/chartex" xmlns:cr="http://schemas.microsoft.com/office/comments/2020/reactions" xmlns:mc="http://schemas.openxmlformats.org/markup-compatibility/2006" xmlns:aink="http://schemas.microsoft.com/office/drawing/2016/ink" xmlns:am3d="http://schemas.microsoft.com/office/drawing/2017/model3d" xmlns:o="urn:schemas-microsoft-com:office:office" xmlns:oel="http://schemas.microsoft.com/office/2019/extlst" xmlns:r="http://schemas.openxmlformats.org/officeDocument/2006/relationships" xmlns:m="http://schemas.openxmlformats.org/officeDocument/2006/math" xmlns:v="urn:schemas-microsoft-com:vml" xmlns:wp14="http://schemas.microsoft.com/office/word/2010/wordprocessingDrawing" xmlns:wp="http://schemas.openxmlformats.org/drawingml/2006/wordprocessingDrawing" xmlns:w10="urn:schemas-microsoft-com:office:word" xmlns:w="http://schemas.openxmlformats.org/wordprocessingml/2006/main" xmlns:w14="http://schemas.microsoft.com/office/word/2010/wordml" xmlns:w15="http://schemas.microsoft.com/office/word/2012/wordml" xmlns:w16cex="http://schemas.microsoft.com/office/word/2018/wordml/cex" xmlns:w16cid="http://schemas.microsoft.com/office/word/2016/wordml/cid" xmlns:w16="http://schemas.microsoft.com/office/word/2018/wordml" xmlns:w16du="http://schemas.microsoft.com/office/word/2023/wordml/word16du" xmlns:w16sdtdh="http://schemas.microsoft.com/office/word/2020/wordml/sdtdatahash" xmlns:w16se="http://schemas.microsoft.com/office/word/2015/wordml/symex" xmlns:wpg="http://schemas.microsoft.com/office/word/2010/wordprocessingGroup" xmlns:wpi="http://schemas.microsoft.com/office/word/2010/wordprocessingInk" xmlns:wne="http://schemas.microsoft.com/office/word/2006/wordml" xmlns:wps="http://schemas.microsoft.com/office/word/2010/wordprocessingShape" mc:Ignorable="w14 w15 w16se w16cid w16 w16cex w16sdtdh cr w16du wp14">
-  <w16cex:commentExtensible w16cex:durableId="041D4AAB" w16cex:dateUtc="2024-10-21T15:44:00Z"/>
-</w16cex:commentsExtensible>
-</file>
-
-<file path=word/commentsIds.xml><?xml version="1.0" encoding="utf-8"?>
-<w16cid:commentsIds xmlns:wpc="http://schemas.microsoft.com/office/word/2010/wordprocessingCanvas" xmlns:cx="http://schemas.microsoft.com/office/drawing/2014/chartex" xmlns:cx1="http://schemas.microsoft.com/office/drawing/2015/9/8/chartex" xmlns:cx2="http://schemas.microsoft.com/office/drawing/2015/10/21/chartex" xmlns:cx3="http://schemas.microsoft.com/office/drawing/2016/5/9/chartex" xmlns:cx4="http://schemas.microsoft.com/office/drawing/2016/5/10/chartex" xmlns:cx5="http://schemas.microsoft.com/office/drawing/2016/5/11/chartex" xmlns:cx6="http://schemas.microsoft.com/office/drawing/2016/5/12/chartex" xmlns:cx7="http://schemas.microsoft.com/office/drawing/2016/5/13/chartex" xmlns:cx8="http://schemas.microsoft.com/office/drawing/2016/5/14/chartex" xmlns:mc="http://schemas.openxmlformats.org/markup-compatibility/2006" xmlns:aink="http://schemas.microsoft.com/office/drawing/2016/ink" xmlns:am3d="http://schemas.microsoft.com/office/drawing/2017/model3d" xmlns:o="urn:schemas-microsoft-com:office:office" xmlns:oel="http://schemas.microsoft.com/office/2019/extlst" xmlns:r="http://schemas.openxmlformats.org/officeDocument/2006/relationships" xmlns:m="http://schemas.openxmlformats.org/officeDocument/2006/math" xmlns:v="urn:schemas-microsoft-com:vml" xmlns:wp14="http://schemas.microsoft.com/office/word/2010/wordprocessingDrawing" xmlns:wp="http://schemas.openxmlformats.org/drawingml/2006/wordprocessingDrawing" xmlns:w10="urn:schemas-microsoft-com:office:word" xmlns:w="http://schemas.openxmlformats.org/wordprocessingml/2006/main" xmlns:w14="http://schemas.microsoft.com/office/word/2010/wordml" xmlns:w15="http://schemas.microsoft.com/office/word/2012/wordml" xmlns:w16cex="http://schemas.microsoft.com/office/word/2018/wordml/cex" xmlns:w16cid="http://schemas.microsoft.com/office/word/2016/wordml/cid" xmlns:w16="http://schemas.microsoft.com/office/word/2018/wordml" xmlns:w16du="http://schemas.microsoft.com/office/word/2023/wordml/word16du" xmlns:w16sdtdh="http://schemas.microsoft.com/office/word/2020/wordml/sdtdatahash" xmlns:w16se="http://schemas.microsoft.com/office/word/2015/wordml/symex" xmlns:wpg="http://schemas.microsoft.com/office/word/2010/wordprocessingGroup" xmlns:wpi="http://schemas.microsoft.com/office/word/2010/wordprocessingInk" xmlns:wne="http://schemas.microsoft.com/office/word/2006/wordml" xmlns:wps="http://schemas.microsoft.com/office/word/2010/wordprocessingShape" mc:Ignorable="w14 w15 w16se w16cid w16 w16cex w16sdtdh w16du wp14">
-  <w16cid:commentId w16cid:paraId="5D66B09B" w16cid:durableId="041D4AAB"/>
-</w16cid:commentsIds>
 </file>
 
 <file path=word/endnotes.xml><?xml version="1.0" encoding="utf-8"?>
@@ -6012,10 +6833,11 @@
   <w:abstractNum w:abstractNumId="19" w15:restartNumberingAfterBreak="0">
     <w:nsid w:val="444975B0"/>
     <w:multiLevelType w:val="multilevel"/>
-    <w:tmpl w:val="2000001F"/>
+    <w:tmpl w:val="3984084E"/>
     <w:lvl w:ilvl="0">
       <w:start w:val="1"/>
       <w:numFmt w:val="decimal"/>
+      <w:pStyle w:val="Titre1"/>
       <w:lvlText w:val="%1."/>
       <w:lvlJc w:val="left"/>
       <w:pPr>
@@ -6034,10 +6856,11 @@
     <w:lvl w:ilvl="2">
       <w:start w:val="1"/>
       <w:numFmt w:val="decimal"/>
-      <w:lvlText w:val="%1.%2.%3."/>
-      <w:lvlJc w:val="left"/>
-      <w:pPr>
-        <w:ind w:left="1224" w:hanging="504"/>
+      <w:pStyle w:val="Titre2"/>
+      <w:lvlText w:val="%3."/>
+      <w:lvlJc w:val="left"/>
+      <w:pPr>
+        <w:ind w:left="1080" w:hanging="360"/>
       </w:pPr>
     </w:lvl>
     <w:lvl w:ilvl="3">
@@ -6322,6 +7145,232 @@
     </w:lvl>
   </w:abstractNum>
   <w:abstractNum w:abstractNumId="22" w15:restartNumberingAfterBreak="0">
+    <w:nsid w:val="4BE315C6"/>
+    <w:multiLevelType w:val="multilevel"/>
+    <w:tmpl w:val="1862D1C8"/>
+    <w:lvl w:ilvl="0">
+      <w:start w:val="3"/>
+      <w:numFmt w:val="decimal"/>
+      <w:lvlText w:val="%1"/>
+      <w:lvlJc w:val="left"/>
+      <w:pPr>
+        <w:ind w:left="360" w:hanging="360"/>
+      </w:pPr>
+      <w:rPr>
+        <w:rFonts w:hint="default"/>
+      </w:rPr>
+    </w:lvl>
+    <w:lvl w:ilvl="1">
+      <w:start w:val="2"/>
+      <w:numFmt w:val="decimal"/>
+      <w:lvlText w:val="%1.%2"/>
+      <w:lvlJc w:val="left"/>
+      <w:pPr>
+        <w:ind w:left="1080" w:hanging="360"/>
+      </w:pPr>
+      <w:rPr>
+        <w:rFonts w:hint="default"/>
+      </w:rPr>
+    </w:lvl>
+    <w:lvl w:ilvl="2">
+      <w:start w:val="1"/>
+      <w:numFmt w:val="decimal"/>
+      <w:lvlText w:val="%1.%2.%3"/>
+      <w:lvlJc w:val="left"/>
+      <w:pPr>
+        <w:ind w:left="2160" w:hanging="720"/>
+      </w:pPr>
+      <w:rPr>
+        <w:rFonts w:hint="default"/>
+      </w:rPr>
+    </w:lvl>
+    <w:lvl w:ilvl="3">
+      <w:start w:val="1"/>
+      <w:numFmt w:val="decimal"/>
+      <w:lvlText w:val="%1.%2.%3.%4"/>
+      <w:lvlJc w:val="left"/>
+      <w:pPr>
+        <w:ind w:left="2880" w:hanging="720"/>
+      </w:pPr>
+      <w:rPr>
+        <w:rFonts w:hint="default"/>
+      </w:rPr>
+    </w:lvl>
+    <w:lvl w:ilvl="4">
+      <w:start w:val="1"/>
+      <w:numFmt w:val="decimal"/>
+      <w:lvlText w:val="%1.%2.%3.%4.%5"/>
+      <w:lvlJc w:val="left"/>
+      <w:pPr>
+        <w:ind w:left="3960" w:hanging="1080"/>
+      </w:pPr>
+      <w:rPr>
+        <w:rFonts w:hint="default"/>
+      </w:rPr>
+    </w:lvl>
+    <w:lvl w:ilvl="5">
+      <w:start w:val="1"/>
+      <w:numFmt w:val="decimal"/>
+      <w:lvlText w:val="%1.%2.%3.%4.%5.%6"/>
+      <w:lvlJc w:val="left"/>
+      <w:pPr>
+        <w:ind w:left="5040" w:hanging="1440"/>
+      </w:pPr>
+      <w:rPr>
+        <w:rFonts w:hint="default"/>
+      </w:rPr>
+    </w:lvl>
+    <w:lvl w:ilvl="6">
+      <w:start w:val="1"/>
+      <w:numFmt w:val="decimal"/>
+      <w:lvlText w:val="%1.%2.%3.%4.%5.%6.%7"/>
+      <w:lvlJc w:val="left"/>
+      <w:pPr>
+        <w:ind w:left="5760" w:hanging="1440"/>
+      </w:pPr>
+      <w:rPr>
+        <w:rFonts w:hint="default"/>
+      </w:rPr>
+    </w:lvl>
+    <w:lvl w:ilvl="7">
+      <w:start w:val="1"/>
+      <w:numFmt w:val="decimal"/>
+      <w:lvlText w:val="%1.%2.%3.%4.%5.%6.%7.%8"/>
+      <w:lvlJc w:val="left"/>
+      <w:pPr>
+        <w:ind w:left="6840" w:hanging="1800"/>
+      </w:pPr>
+      <w:rPr>
+        <w:rFonts w:hint="default"/>
+      </w:rPr>
+    </w:lvl>
+    <w:lvl w:ilvl="8">
+      <w:start w:val="1"/>
+      <w:numFmt w:val="decimal"/>
+      <w:lvlText w:val="%1.%2.%3.%4.%5.%6.%7.%8.%9"/>
+      <w:lvlJc w:val="left"/>
+      <w:pPr>
+        <w:ind w:left="7560" w:hanging="1800"/>
+      </w:pPr>
+      <w:rPr>
+        <w:rFonts w:hint="default"/>
+      </w:rPr>
+    </w:lvl>
+  </w:abstractNum>
+  <w:abstractNum w:abstractNumId="23" w15:restartNumberingAfterBreak="0">
+    <w:nsid w:val="51782456"/>
+    <w:multiLevelType w:val="multilevel"/>
+    <w:tmpl w:val="44F286A0"/>
+    <w:lvl w:ilvl="0">
+      <w:start w:val="3"/>
+      <w:numFmt w:val="decimal"/>
+      <w:lvlText w:val="%1"/>
+      <w:lvlJc w:val="left"/>
+      <w:pPr>
+        <w:ind w:left="360" w:hanging="360"/>
+      </w:pPr>
+      <w:rPr>
+        <w:rFonts w:hint="default"/>
+      </w:rPr>
+    </w:lvl>
+    <w:lvl w:ilvl="1">
+      <w:start w:val="2"/>
+      <w:numFmt w:val="decimal"/>
+      <w:lvlText w:val="%1.%2"/>
+      <w:lvlJc w:val="left"/>
+      <w:pPr>
+        <w:ind w:left="1080" w:hanging="360"/>
+      </w:pPr>
+      <w:rPr>
+        <w:rFonts w:hint="default"/>
+      </w:rPr>
+    </w:lvl>
+    <w:lvl w:ilvl="2">
+      <w:start w:val="1"/>
+      <w:numFmt w:val="decimal"/>
+      <w:lvlText w:val="%1.%2.%3"/>
+      <w:lvlJc w:val="left"/>
+      <w:pPr>
+        <w:ind w:left="2160" w:hanging="720"/>
+      </w:pPr>
+      <w:rPr>
+        <w:rFonts w:hint="default"/>
+      </w:rPr>
+    </w:lvl>
+    <w:lvl w:ilvl="3">
+      <w:start w:val="1"/>
+      <w:numFmt w:val="decimal"/>
+      <w:lvlText w:val="%1.%2.%3.%4"/>
+      <w:lvlJc w:val="left"/>
+      <w:pPr>
+        <w:ind w:left="2880" w:hanging="720"/>
+      </w:pPr>
+      <w:rPr>
+        <w:rFonts w:hint="default"/>
+      </w:rPr>
+    </w:lvl>
+    <w:lvl w:ilvl="4">
+      <w:start w:val="1"/>
+      <w:numFmt w:val="decimal"/>
+      <w:lvlText w:val="%1.%2.%3.%4.%5"/>
+      <w:lvlJc w:val="left"/>
+      <w:pPr>
+        <w:ind w:left="3960" w:hanging="1080"/>
+      </w:pPr>
+      <w:rPr>
+        <w:rFonts w:hint="default"/>
+      </w:rPr>
+    </w:lvl>
+    <w:lvl w:ilvl="5">
+      <w:start w:val="1"/>
+      <w:numFmt w:val="decimal"/>
+      <w:lvlText w:val="%1.%2.%3.%4.%5.%6"/>
+      <w:lvlJc w:val="left"/>
+      <w:pPr>
+        <w:ind w:left="5040" w:hanging="1440"/>
+      </w:pPr>
+      <w:rPr>
+        <w:rFonts w:hint="default"/>
+      </w:rPr>
+    </w:lvl>
+    <w:lvl w:ilvl="6">
+      <w:start w:val="1"/>
+      <w:numFmt w:val="decimal"/>
+      <w:lvlText w:val="%1.%2.%3.%4.%5.%6.%7"/>
+      <w:lvlJc w:val="left"/>
+      <w:pPr>
+        <w:ind w:left="5760" w:hanging="1440"/>
+      </w:pPr>
+      <w:rPr>
+        <w:rFonts w:hint="default"/>
+      </w:rPr>
+    </w:lvl>
+    <w:lvl w:ilvl="7">
+      <w:start w:val="1"/>
+      <w:numFmt w:val="decimal"/>
+      <w:lvlText w:val="%1.%2.%3.%4.%5.%6.%7.%8"/>
+      <w:lvlJc w:val="left"/>
+      <w:pPr>
+        <w:ind w:left="6840" w:hanging="1800"/>
+      </w:pPr>
+      <w:rPr>
+        <w:rFonts w:hint="default"/>
+      </w:rPr>
+    </w:lvl>
+    <w:lvl w:ilvl="8">
+      <w:start w:val="1"/>
+      <w:numFmt w:val="decimal"/>
+      <w:lvlText w:val="%1.%2.%3.%4.%5.%6.%7.%8.%9"/>
+      <w:lvlJc w:val="left"/>
+      <w:pPr>
+        <w:ind w:left="7560" w:hanging="1800"/>
+      </w:pPr>
+      <w:rPr>
+        <w:rFonts w:hint="default"/>
+      </w:rPr>
+    </w:lvl>
+  </w:abstractNum>
+  <w:abstractNum w:abstractNumId="24" w15:restartNumberingAfterBreak="0">
     <w:nsid w:val="5F7D7EA9"/>
     <w:multiLevelType w:val="multilevel"/>
     <w:tmpl w:val="C70E0112"/>
@@ -6470,7 +7519,7 @@
       </w:rPr>
     </w:lvl>
   </w:abstractNum>
-  <w:abstractNum w:abstractNumId="23" w15:restartNumberingAfterBreak="0">
+  <w:abstractNum w:abstractNumId="25" w15:restartNumberingAfterBreak="0">
     <w:nsid w:val="635034F9"/>
     <w:multiLevelType w:val="multilevel"/>
     <w:tmpl w:val="EFEAA87C"/>
@@ -6617,7 +7666,7 @@
       </w:rPr>
     </w:lvl>
   </w:abstractNum>
-  <w:abstractNum w:abstractNumId="24" w15:restartNumberingAfterBreak="0">
+  <w:abstractNum w:abstractNumId="26" w15:restartNumberingAfterBreak="0">
     <w:nsid w:val="657911AF"/>
     <w:multiLevelType w:val="multilevel"/>
     <w:tmpl w:val="343E7774"/>
@@ -6766,7 +7815,7 @@
       </w:rPr>
     </w:lvl>
   </w:abstractNum>
-  <w:abstractNum w:abstractNumId="25" w15:restartNumberingAfterBreak="0">
+  <w:abstractNum w:abstractNumId="27" w15:restartNumberingAfterBreak="0">
     <w:nsid w:val="6A0168F1"/>
     <w:multiLevelType w:val="multilevel"/>
     <w:tmpl w:val="7CA0684A"/>
@@ -6879,7 +7928,7 @@
       </w:pPr>
     </w:lvl>
   </w:abstractNum>
-  <w:abstractNum w:abstractNumId="26" w15:restartNumberingAfterBreak="0">
+  <w:abstractNum w:abstractNumId="28" w15:restartNumberingAfterBreak="0">
     <w:nsid w:val="6C2D3800"/>
     <w:multiLevelType w:val="multilevel"/>
     <w:tmpl w:val="435A61EE"/>
@@ -7028,7 +8077,7 @@
       </w:rPr>
     </w:lvl>
   </w:abstractNum>
-  <w:abstractNum w:abstractNumId="27" w15:restartNumberingAfterBreak="0">
+  <w:abstractNum w:abstractNumId="29" w15:restartNumberingAfterBreak="0">
     <w:nsid w:val="6DC270C8"/>
     <w:multiLevelType w:val="multilevel"/>
     <w:tmpl w:val="E58A643A"/>
@@ -7141,7 +8190,7 @@
       </w:pPr>
     </w:lvl>
   </w:abstractNum>
-  <w:abstractNum w:abstractNumId="28" w15:restartNumberingAfterBreak="0">
+  <w:abstractNum w:abstractNumId="30" w15:restartNumberingAfterBreak="0">
     <w:nsid w:val="75730164"/>
     <w:multiLevelType w:val="hybridMultilevel"/>
     <w:tmpl w:val="5290D038"/>
@@ -7243,10 +8292,10 @@
     <w:abstractNumId w:val="9"/>
   </w:num>
   <w:num w:numId="5" w16cid:durableId="721517001">
-    <w:abstractNumId w:val="25"/>
+    <w:abstractNumId w:val="27"/>
   </w:num>
   <w:num w:numId="6" w16cid:durableId="1229268758">
-    <w:abstractNumId w:val="22"/>
+    <w:abstractNumId w:val="24"/>
   </w:num>
   <w:num w:numId="7" w16cid:durableId="847214140">
     <w:abstractNumId w:val="18"/>
@@ -7255,7 +8304,7 @@
     <w:abstractNumId w:val="13"/>
   </w:num>
   <w:num w:numId="9" w16cid:durableId="988098587">
-    <w:abstractNumId w:val="26"/>
+    <w:abstractNumId w:val="28"/>
   </w:num>
   <w:num w:numId="10" w16cid:durableId="1415199925">
     <w:abstractNumId w:val="12"/>
@@ -7264,7 +8313,7 @@
     <w:abstractNumId w:val="11"/>
   </w:num>
   <w:num w:numId="12" w16cid:durableId="846795401">
-    <w:abstractNumId w:val="27"/>
+    <w:abstractNumId w:val="29"/>
   </w:num>
   <w:num w:numId="13" w16cid:durableId="475726944">
     <w:abstractNumId w:val="17"/>
@@ -7277,7 +8326,7 @@
     </w:lvlOverride>
   </w:num>
   <w:num w:numId="14" w16cid:durableId="491796890">
-    <w:abstractNumId w:val="24"/>
+    <w:abstractNumId w:val="26"/>
   </w:num>
   <w:num w:numId="15" w16cid:durableId="1574778501">
     <w:abstractNumId w:val="3"/>
@@ -7308,13 +8357,13 @@
     <w:abstractNumId w:val="20"/>
   </w:num>
   <w:num w:numId="22" w16cid:durableId="138037007">
-    <w:abstractNumId w:val="23"/>
+    <w:abstractNumId w:val="25"/>
   </w:num>
   <w:num w:numId="23" w16cid:durableId="2011172000">
     <w:abstractNumId w:val="10"/>
   </w:num>
   <w:num w:numId="24" w16cid:durableId="524026452">
-    <w:abstractNumId w:val="28"/>
+    <w:abstractNumId w:val="30"/>
   </w:num>
   <w:num w:numId="25" w16cid:durableId="1299801078">
     <w:abstractNumId w:val="6"/>
@@ -7331,16 +8380,44 @@
   <w:num w:numId="29" w16cid:durableId="1207983673">
     <w:abstractNumId w:val="16"/>
   </w:num>
+  <w:num w:numId="30" w16cid:durableId="1014503580">
+    <w:abstractNumId w:val="22"/>
+  </w:num>
+  <w:num w:numId="31" w16cid:durableId="229509319">
+    <w:abstractNumId w:val="23"/>
+  </w:num>
+  <w:num w:numId="32" w16cid:durableId="55708067">
+    <w:abstractNumId w:val="19"/>
+    <w:lvlOverride w:ilvl="0">
+      <w:startOverride w:val="1"/>
+    </w:lvlOverride>
+    <w:lvlOverride w:ilvl="1">
+      <w:startOverride w:val="1"/>
+    </w:lvlOverride>
+    <w:lvlOverride w:ilvl="2">
+      <w:startOverride w:val="1"/>
+    </w:lvlOverride>
+    <w:lvlOverride w:ilvl="3">
+      <w:startOverride w:val="1"/>
+    </w:lvlOverride>
+    <w:lvlOverride w:ilvl="4">
+      <w:startOverride w:val="1"/>
+    </w:lvlOverride>
+    <w:lvlOverride w:ilvl="5">
+      <w:startOverride w:val="1"/>
+    </w:lvlOverride>
+    <w:lvlOverride w:ilvl="6">
+      <w:startOverride w:val="1"/>
+    </w:lvlOverride>
+    <w:lvlOverride w:ilvl="7">
+      <w:startOverride w:val="1"/>
+    </w:lvlOverride>
+    <w:lvlOverride w:ilvl="8">
+      <w:startOverride w:val="1"/>
+    </w:lvlOverride>
+  </w:num>
   <w:numIdMacAtCleanup w:val="25"/>
 </w:numbering>
-</file>
-
-<file path=word/people.xml><?xml version="1.0" encoding="utf-8"?>
-<w15:people xmlns:wpc="http://schemas.microsoft.com/office/word/2010/wordprocessingCanvas" xmlns:cx="http://schemas.microsoft.com/office/drawing/2014/chartex" xmlns:cx1="http://schemas.microsoft.com/office/drawing/2015/9/8/chartex" xmlns:cx2="http://schemas.microsoft.com/office/drawing/2015/10/21/chartex" xmlns:cx3="http://schemas.microsoft.com/office/drawing/2016/5/9/chartex" xmlns:cx4="http://schemas.microsoft.com/office/drawing/2016/5/10/chartex" xmlns:cx5="http://schemas.microsoft.com/office/drawing/2016/5/11/chartex" xmlns:cx6="http://schemas.microsoft.com/office/drawing/2016/5/12/chartex" xmlns:cx7="http://schemas.microsoft.com/office/drawing/2016/5/13/chartex" xmlns:cx8="http://schemas.microsoft.com/office/drawing/2016/5/14/chartex" xmlns:mc="http://schemas.openxmlformats.org/markup-compatibility/2006" xmlns:aink="http://schemas.microsoft.com/office/drawing/2016/ink" xmlns:am3d="http://schemas.microsoft.com/office/drawing/2017/model3d" xmlns:o="urn:schemas-microsoft-com:office:office" xmlns:oel="http://schemas.microsoft.com/office/2019/extlst" xmlns:r="http://schemas.openxmlformats.org/officeDocument/2006/relationships" xmlns:m="http://schemas.openxmlformats.org/officeDocument/2006/math" xmlns:v="urn:schemas-microsoft-com:vml" xmlns:wp14="http://schemas.microsoft.com/office/word/2010/wordprocessingDrawing" xmlns:wp="http://schemas.openxmlformats.org/drawingml/2006/wordprocessingDrawing" xmlns:w10="urn:schemas-microsoft-com:office:word" xmlns:w="http://schemas.openxmlformats.org/wordprocessingml/2006/main" xmlns:w14="http://schemas.microsoft.com/office/word/2010/wordml" xmlns:w15="http://schemas.microsoft.com/office/word/2012/wordml" xmlns:w16cex="http://schemas.microsoft.com/office/word/2018/wordml/cex" xmlns:w16cid="http://schemas.microsoft.com/office/word/2016/wordml/cid" xmlns:w16="http://schemas.microsoft.com/office/word/2018/wordml" xmlns:w16du="http://schemas.microsoft.com/office/word/2023/wordml/word16du" xmlns:w16sdtdh="http://schemas.microsoft.com/office/word/2020/wordml/sdtdatahash" xmlns:w16se="http://schemas.microsoft.com/office/word/2015/wordml/symex" xmlns:wpg="http://schemas.microsoft.com/office/word/2010/wordprocessingGroup" xmlns:wpi="http://schemas.microsoft.com/office/word/2010/wordprocessingInk" xmlns:wne="http://schemas.microsoft.com/office/word/2006/wordml" xmlns:wps="http://schemas.microsoft.com/office/word/2010/wordprocessingShape" mc:Ignorable="w14 w15 w16se w16cid w16 w16cex w16sdtdh w16du wp14">
-  <w15:person w15:author="Samray Hugo">
-    <w15:presenceInfo w15:providerId="AD" w15:userId="S::etu51688@henallux.be::b47e93c9-c983-4adf-ae7e-c8ecd8d5a915"/>
-  </w15:person>
-</w15:people>
 </file>
 
 <file path=word/styles.xml><?xml version="1.0" encoding="utf-8"?>
@@ -7755,10 +8832,13 @@
     <w:link w:val="Titre1Car"/>
     <w:uiPriority w:val="9"/>
     <w:qFormat/>
-    <w:rsid w:val="0076626D"/>
+    <w:rsid w:val="00D51E5A"/>
     <w:pPr>
       <w:keepNext/>
       <w:keepLines/>
+      <w:numPr>
+        <w:numId w:val="1"/>
+      </w:numPr>
       <w:spacing w:before="240" w:after="0"/>
       <w:outlineLvl w:val="0"/>
     </w:pPr>
@@ -7767,6 +8847,7 @@
       <w:color w:val="2F5496" w:themeColor="accent1" w:themeShade="BF"/>
       <w:sz w:val="32"/>
       <w:szCs w:val="32"/>
+      <w:lang w:val="fr-BE"/>
     </w:rPr>
   </w:style>
   <w:style w:type="paragraph" w:styleId="Titre2">
@@ -7777,12 +8858,15 @@
     <w:uiPriority w:val="9"/>
     <w:unhideWhenUsed/>
     <w:qFormat/>
-    <w:rsid w:val="00DF0653"/>
+    <w:rsid w:val="00D51E5A"/>
     <w:pPr>
       <w:keepNext/>
       <w:keepLines/>
+      <w:numPr>
+        <w:ilvl w:val="2"/>
+        <w:numId w:val="1"/>
+      </w:numPr>
       <w:spacing w:before="40" w:after="120"/>
-      <w:ind w:left="720"/>
       <w:outlineLvl w:val="1"/>
     </w:pPr>
     <w:rPr>
@@ -7790,6 +8874,7 @@
       <w:color w:val="2F5496" w:themeColor="accent1" w:themeShade="BF"/>
       <w:sz w:val="26"/>
       <w:szCs w:val="26"/>
+      <w:lang w:val="fr-BE"/>
     </w:rPr>
   </w:style>
   <w:style w:type="paragraph" w:styleId="Titre3">
@@ -7838,7 +8923,6 @@
   <w:style w:type="character" w:default="1" w:styleId="Policepardfaut">
     <w:name w:val="Default Paragraph Font"/>
     <w:uiPriority w:val="1"/>
-    <w:semiHidden/>
     <w:unhideWhenUsed/>
   </w:style>
   <w:style w:type="table" w:default="1" w:styleId="TableauNormal">
@@ -7894,12 +8978,13 @@
     <w:basedOn w:val="Policepardfaut"/>
     <w:link w:val="Titre1"/>
     <w:uiPriority w:val="9"/>
-    <w:rsid w:val="0076626D"/>
+    <w:rsid w:val="00D51E5A"/>
     <w:rPr>
       <w:rFonts w:asciiTheme="majorHAnsi" w:eastAsiaTheme="majorEastAsia" w:hAnsiTheme="majorHAnsi" w:cstheme="majorBidi"/>
       <w:color w:val="2F5496" w:themeColor="accent1" w:themeShade="BF"/>
       <w:sz w:val="32"/>
       <w:szCs w:val="32"/>
+      <w:lang w:val="fr-BE"/>
     </w:rPr>
   </w:style>
   <w:style w:type="paragraph" w:styleId="Paragraphedeliste">
@@ -7918,12 +9003,13 @@
     <w:basedOn w:val="Policepardfaut"/>
     <w:link w:val="Titre2"/>
     <w:uiPriority w:val="9"/>
-    <w:rsid w:val="00DF0653"/>
+    <w:rsid w:val="00D51E5A"/>
     <w:rPr>
       <w:rFonts w:asciiTheme="majorHAnsi" w:eastAsiaTheme="majorEastAsia" w:hAnsiTheme="majorHAnsi" w:cstheme="majorBidi"/>
       <w:color w:val="2F5496" w:themeColor="accent1" w:themeShade="BF"/>
       <w:sz w:val="26"/>
       <w:szCs w:val="26"/>
+      <w:lang w:val="fr-BE"/>
     </w:rPr>
   </w:style>
   <w:style w:type="character" w:customStyle="1" w:styleId="Titre3Car">
@@ -7965,12 +9051,17 @@
     <w:unhideWhenUsed/>
     <w:rsid w:val="00E86E16"/>
     <w:pPr>
-      <w:tabs>
-        <w:tab w:val="left" w:pos="440"/>
-        <w:tab w:val="right" w:leader="dot" w:pos="9350"/>
-      </w:tabs>
-      <w:spacing w:after="100"/>
+      <w:spacing w:before="120" w:after="120"/>
+      <w:jc w:val="left"/>
     </w:pPr>
+    <w:rPr>
+      <w:rFonts w:cstheme="minorHAnsi"/>
+      <w:b/>
+      <w:bCs/>
+      <w:caps/>
+      <w:sz w:val="20"/>
+      <w:szCs w:val="20"/>
+    </w:rPr>
   </w:style>
   <w:style w:type="paragraph" w:styleId="TM2">
     <w:name w:val="toc 2"/>
@@ -7981,9 +9072,16 @@
     <w:unhideWhenUsed/>
     <w:rsid w:val="00E86E16"/>
     <w:pPr>
-      <w:spacing w:after="100"/>
+      <w:spacing w:after="0"/>
       <w:ind w:left="220"/>
+      <w:jc w:val="left"/>
     </w:pPr>
+    <w:rPr>
+      <w:rFonts w:cstheme="minorHAnsi"/>
+      <w:smallCaps/>
+      <w:sz w:val="20"/>
+      <w:szCs w:val="20"/>
+    </w:rPr>
   </w:style>
   <w:style w:type="paragraph" w:styleId="TM3">
     <w:name w:val="toc 3"/>
@@ -7994,9 +9092,17 @@
     <w:unhideWhenUsed/>
     <w:rsid w:val="00E86E16"/>
     <w:pPr>
-      <w:spacing w:after="100"/>
+      <w:spacing w:after="0"/>
       <w:ind w:left="440"/>
+      <w:jc w:val="left"/>
     </w:pPr>
+    <w:rPr>
+      <w:rFonts w:cstheme="minorHAnsi"/>
+      <w:i/>
+      <w:iCs/>
+      <w:sz w:val="20"/>
+      <w:szCs w:val="20"/>
+    </w:rPr>
   </w:style>
   <w:style w:type="character" w:styleId="Lienhypertexte">
     <w:name w:val="Hyperlink"/>
@@ -8258,6 +9364,126 @@
       <w:bCs/>
       <w:sz w:val="20"/>
       <w:szCs w:val="20"/>
+    </w:rPr>
+  </w:style>
+  <w:style w:type="paragraph" w:styleId="TM4">
+    <w:name w:val="toc 4"/>
+    <w:basedOn w:val="Normal"/>
+    <w:next w:val="Normal"/>
+    <w:autoRedefine/>
+    <w:uiPriority w:val="39"/>
+    <w:semiHidden/>
+    <w:unhideWhenUsed/>
+    <w:rsid w:val="00D51E5A"/>
+    <w:pPr>
+      <w:spacing w:after="0"/>
+      <w:ind w:left="660"/>
+      <w:jc w:val="left"/>
+    </w:pPr>
+    <w:rPr>
+      <w:rFonts w:cstheme="minorHAnsi"/>
+      <w:sz w:val="18"/>
+      <w:szCs w:val="18"/>
+    </w:rPr>
+  </w:style>
+  <w:style w:type="paragraph" w:styleId="TM5">
+    <w:name w:val="toc 5"/>
+    <w:basedOn w:val="Normal"/>
+    <w:next w:val="Normal"/>
+    <w:autoRedefine/>
+    <w:uiPriority w:val="39"/>
+    <w:semiHidden/>
+    <w:unhideWhenUsed/>
+    <w:rsid w:val="00D51E5A"/>
+    <w:pPr>
+      <w:spacing w:after="0"/>
+      <w:ind w:left="880"/>
+      <w:jc w:val="left"/>
+    </w:pPr>
+    <w:rPr>
+      <w:rFonts w:cstheme="minorHAnsi"/>
+      <w:sz w:val="18"/>
+      <w:szCs w:val="18"/>
+    </w:rPr>
+  </w:style>
+  <w:style w:type="paragraph" w:styleId="TM6">
+    <w:name w:val="toc 6"/>
+    <w:basedOn w:val="Normal"/>
+    <w:next w:val="Normal"/>
+    <w:autoRedefine/>
+    <w:uiPriority w:val="39"/>
+    <w:semiHidden/>
+    <w:unhideWhenUsed/>
+    <w:rsid w:val="00D51E5A"/>
+    <w:pPr>
+      <w:spacing w:after="0"/>
+      <w:ind w:left="1100"/>
+      <w:jc w:val="left"/>
+    </w:pPr>
+    <w:rPr>
+      <w:rFonts w:cstheme="minorHAnsi"/>
+      <w:sz w:val="18"/>
+      <w:szCs w:val="18"/>
+    </w:rPr>
+  </w:style>
+  <w:style w:type="paragraph" w:styleId="TM7">
+    <w:name w:val="toc 7"/>
+    <w:basedOn w:val="Normal"/>
+    <w:next w:val="Normal"/>
+    <w:autoRedefine/>
+    <w:uiPriority w:val="39"/>
+    <w:semiHidden/>
+    <w:unhideWhenUsed/>
+    <w:rsid w:val="00D51E5A"/>
+    <w:pPr>
+      <w:spacing w:after="0"/>
+      <w:ind w:left="1320"/>
+      <w:jc w:val="left"/>
+    </w:pPr>
+    <w:rPr>
+      <w:rFonts w:cstheme="minorHAnsi"/>
+      <w:sz w:val="18"/>
+      <w:szCs w:val="18"/>
+    </w:rPr>
+  </w:style>
+  <w:style w:type="paragraph" w:styleId="TM8">
+    <w:name w:val="toc 8"/>
+    <w:basedOn w:val="Normal"/>
+    <w:next w:val="Normal"/>
+    <w:autoRedefine/>
+    <w:uiPriority w:val="39"/>
+    <w:semiHidden/>
+    <w:unhideWhenUsed/>
+    <w:rsid w:val="00D51E5A"/>
+    <w:pPr>
+      <w:spacing w:after="0"/>
+      <w:ind w:left="1540"/>
+      <w:jc w:val="left"/>
+    </w:pPr>
+    <w:rPr>
+      <w:rFonts w:cstheme="minorHAnsi"/>
+      <w:sz w:val="18"/>
+      <w:szCs w:val="18"/>
+    </w:rPr>
+  </w:style>
+  <w:style w:type="paragraph" w:styleId="TM9">
+    <w:name w:val="toc 9"/>
+    <w:basedOn w:val="Normal"/>
+    <w:next w:val="Normal"/>
+    <w:autoRedefine/>
+    <w:uiPriority w:val="39"/>
+    <w:semiHidden/>
+    <w:unhideWhenUsed/>
+    <w:rsid w:val="00D51E5A"/>
+    <w:pPr>
+      <w:spacing w:after="0"/>
+      <w:ind w:left="1760"/>
+      <w:jc w:val="left"/>
+    </w:pPr>
+    <w:rPr>
+      <w:rFonts w:cstheme="minorHAnsi"/>
+      <w:sz w:val="18"/>
+      <w:szCs w:val="18"/>
     </w:rPr>
   </w:style>
 </w:styles>

</xml_diff>